<commit_message>
docs: add Word document PROJECT_BRIEF.docx based on 8-question brief template
</commit_message>
<xml_diff>
--- a/PROJECT_BRIEF.docx
+++ b/PROJECT_BRIEF.docx
@@ -8,26 +8,30 @@
       </w:pPr>
       <w:r>
         <w:rPr>
-          <w:rFonts w:ascii="Arial" w:hAnsi="Arial"/>
+          <w:rFonts w:ascii="Segoe UI" w:hAnsi="Segoe UI"/>
           <w:b/>
-          <w:color w:val="1E3A8A"/>
-          <w:sz w:val="44"/>
+          <w:i w:val="0"/>
+          <w:color w:val="0F172A"/>
+          <w:sz w:val="40"/>
         </w:rPr>
         <w:t>TÀI LIỆU BRIEF DỰ ÁN (PROJECT BRIEF)</w:t>
       </w:r>
     </w:p>
     <w:p>
       <w:pPr>
-        <w:spacing w:after="280"/>
+        <w:spacing w:before="0" w:after="240"/>
       </w:pPr>
       <w:r>
         <w:rPr>
-          <w:rFonts w:ascii="Arial" w:hAnsi="Arial"/>
+          <w:rFonts w:ascii="Segoe UI" w:hAnsi="Segoe UI"/>
           <w:b/>
-          <w:color w:val="2563EB"/>
-          <w:sz w:val="26"/>
+          <w:i w:val="0"/>
+          <w:color w:val="0D9488"/>
+          <w:sz w:val="22"/>
         </w:rPr>
         <w:t>HỆ THỐNG QUẢN LÝ DỊCH VỤ CHO THUÊ XE MÁY &amp; Ô TÔ TỰ LÁI (DRIVERENT)</w:t>
+        <w:br/>
+        <w:t>Chuẩn phương pháp: Hiểu đúng bài toán trước khi làm (8 câu hỏi cốt lõi)</w:t>
       </w:r>
     </w:p>
     <w:tbl>
@@ -38,18 +42,18 @@
         <w:tblLook w:firstColumn="1" w:firstRow="1" w:lastColumn="0" w:lastRow="0" w:noHBand="0" w:noVBand="1" w:val="04A0"/>
       </w:tblPr>
       <w:tblGrid>
-        <w:gridCol w:w="4680"/>
-        <w:gridCol w:w="4680"/>
+        <w:gridCol w:w="4824"/>
+        <w:gridCol w:w="4824"/>
       </w:tblGrid>
       <w:tr>
         <w:tc>
           <w:tcPr>
-            <w:tcW w:type="dxa" w:w="3168"/>
-            <w:shd w:fill="F1F5F9"/>
+            <w:tcW w:type="dxa" w:w="2880"/>
+            <w:shd w:fill="F8FAFC"/>
             <w:tcMar>
-              <w:top w:w="60" w:type="dxa"/>
-              <w:bottom w:w="60" w:type="dxa"/>
-              <w:left w:w="100" w:type="dxa"/>
+              <w:top w:w="70" w:type="dxa"/>
+              <w:bottom w:w="70" w:type="dxa"/>
+              <w:left w:w="120" w:type="dxa"/>
               <w:right w:w="100" w:type="dxa"/>
             </w:tcMar>
           </w:tcPr>
@@ -59,9 +63,10 @@
             </w:pPr>
             <w:r>
               <w:rPr>
-                <w:rFonts w:ascii="Arial" w:hAnsi="Arial"/>
+                <w:rFonts w:ascii="Segoe UI" w:hAnsi="Segoe UI"/>
                 <w:b/>
-                <w:color w:val="334155"/>
+                <w:i w:val="0"/>
+                <w:color w:val="475569"/>
                 <w:sz w:val="19"/>
               </w:rPr>
               <w:t>Tên dự án:</w:t>
@@ -70,12 +75,12 @@
         </w:tc>
         <w:tc>
           <w:tcPr>
-            <w:tcW w:type="dxa" w:w="6192"/>
+            <w:tcW w:type="dxa" w:w="6768"/>
             <w:shd w:fill="FFFFFF"/>
             <w:tcMar>
-              <w:top w:w="60" w:type="dxa"/>
-              <w:bottom w:w="60" w:type="dxa"/>
-              <w:left w:w="100" w:type="dxa"/>
+              <w:top w:w="70" w:type="dxa"/>
+              <w:bottom w:w="70" w:type="dxa"/>
+              <w:left w:w="120" w:type="dxa"/>
               <w:right w:w="100" w:type="dxa"/>
             </w:tcMar>
           </w:tcPr>
@@ -85,11 +90,13 @@
             </w:pPr>
             <w:r>
               <w:rPr>
-                <w:rFonts w:ascii="Arial" w:hAnsi="Arial"/>
+                <w:rFonts w:ascii="Segoe UI" w:hAnsi="Segoe UI"/>
+                <w:b w:val="0"/>
+                <w:i w:val="0"/>
                 <w:color w:val="0F172A"/>
                 <w:sz w:val="19"/>
               </w:rPr>
-              <w:t>DriveRent - Quản lý Dịch vụ Cho thuê Xe máy &amp; Ô tô Tự lái</w:t>
+              <w:t>DriveRent - Smart Car &amp; Motorbike Rental Management System</w:t>
             </w:r>
           </w:p>
         </w:tc>
@@ -97,12 +104,12 @@
       <w:tr>
         <w:tc>
           <w:tcPr>
-            <w:tcW w:type="dxa" w:w="3168"/>
-            <w:shd w:fill="F1F5F9"/>
+            <w:tcW w:type="dxa" w:w="2880"/>
+            <w:shd w:fill="F8FAFC"/>
             <w:tcMar>
-              <w:top w:w="60" w:type="dxa"/>
-              <w:bottom w:w="60" w:type="dxa"/>
-              <w:left w:w="100" w:type="dxa"/>
+              <w:top w:w="70" w:type="dxa"/>
+              <w:bottom w:w="70" w:type="dxa"/>
+              <w:left w:w="120" w:type="dxa"/>
               <w:right w:w="100" w:type="dxa"/>
             </w:tcMar>
           </w:tcPr>
@@ -112,9 +119,10 @@
             </w:pPr>
             <w:r>
               <w:rPr>
-                <w:rFonts w:ascii="Arial" w:hAnsi="Arial"/>
+                <w:rFonts w:ascii="Segoe UI" w:hAnsi="Segoe UI"/>
                 <w:b/>
-                <w:color w:val="334155"/>
+                <w:i w:val="0"/>
+                <w:color w:val="475569"/>
                 <w:sz w:val="19"/>
               </w:rPr>
               <w:t>Mã dự án &amp; Phiên bản:</w:t>
@@ -123,12 +131,12 @@
         </w:tc>
         <w:tc>
           <w:tcPr>
-            <w:tcW w:type="dxa" w:w="6192"/>
+            <w:tcW w:type="dxa" w:w="6768"/>
             <w:shd w:fill="FFFFFF"/>
             <w:tcMar>
-              <w:top w:w="60" w:type="dxa"/>
-              <w:bottom w:w="60" w:type="dxa"/>
-              <w:left w:w="100" w:type="dxa"/>
+              <w:top w:w="70" w:type="dxa"/>
+              <w:bottom w:w="70" w:type="dxa"/>
+              <w:left w:w="120" w:type="dxa"/>
               <w:right w:w="100" w:type="dxa"/>
             </w:tcMar>
           </w:tcPr>
@@ -138,11 +146,13 @@
             </w:pPr>
             <w:r>
               <w:rPr>
-                <w:rFonts w:ascii="Arial" w:hAnsi="Arial"/>
+                <w:rFonts w:ascii="Segoe UI" w:hAnsi="Segoe UI"/>
+                <w:b w:val="0"/>
+                <w:i w:val="0"/>
                 <w:color w:val="0F172A"/>
                 <w:sz w:val="19"/>
               </w:rPr>
-              <w:t>DRV-RENT-2026 | Phiên bản 1.0.0</w:t>
+              <w:t>DRV-RENT-2026 | v1.0.0 (Production Ready Prototype)</w:t>
             </w:r>
           </w:p>
         </w:tc>
@@ -150,12 +160,12 @@
       <w:tr>
         <w:tc>
           <w:tcPr>
-            <w:tcW w:type="dxa" w:w="3168"/>
-            <w:shd w:fill="F1F5F9"/>
+            <w:tcW w:type="dxa" w:w="2880"/>
+            <w:shd w:fill="F8FAFC"/>
             <w:tcMar>
-              <w:top w:w="60" w:type="dxa"/>
-              <w:bottom w:w="60" w:type="dxa"/>
-              <w:left w:w="100" w:type="dxa"/>
+              <w:top w:w="70" w:type="dxa"/>
+              <w:bottom w:w="70" w:type="dxa"/>
+              <w:left w:w="120" w:type="dxa"/>
               <w:right w:w="100" w:type="dxa"/>
             </w:tcMar>
           </w:tcPr>
@@ -165,23 +175,24 @@
             </w:pPr>
             <w:r>
               <w:rPr>
-                <w:rFonts w:ascii="Arial" w:hAnsi="Arial"/>
+                <w:rFonts w:ascii="Segoe UI" w:hAnsi="Segoe UI"/>
                 <w:b/>
-                <w:color w:val="334155"/>
+                <w:i w:val="0"/>
+                <w:color w:val="475569"/>
                 <w:sz w:val="19"/>
               </w:rPr>
-              <w:t>Kho lưu trữ mã nguồn (GitHub):</w:t>
+              <w:t>Kho lưu trữ mã nguồn:</w:t>
             </w:r>
           </w:p>
         </w:tc>
         <w:tc>
           <w:tcPr>
-            <w:tcW w:type="dxa" w:w="6192"/>
+            <w:tcW w:type="dxa" w:w="6768"/>
             <w:shd w:fill="FFFFFF"/>
             <w:tcMar>
-              <w:top w:w="60" w:type="dxa"/>
-              <w:bottom w:w="60" w:type="dxa"/>
-              <w:left w:w="100" w:type="dxa"/>
+              <w:top w:w="70" w:type="dxa"/>
+              <w:bottom w:w="70" w:type="dxa"/>
+              <w:left w:w="120" w:type="dxa"/>
               <w:right w:w="100" w:type="dxa"/>
             </w:tcMar>
           </w:tcPr>
@@ -191,12 +202,13 @@
             </w:pPr>
             <w:r>
               <w:rPr>
-                <w:rFonts w:ascii="Arial" w:hAnsi="Arial"/>
-                <w:color w:val="1D4ED8"/>
+                <w:rFonts w:ascii="Segoe UI" w:hAnsi="Segoe UI"/>
+                <w:b w:val="0"/>
+                <w:i w:val="0"/>
+                <w:color w:val="0F172A"/>
                 <w:sz w:val="19"/>
-                <w:u w:val="single"/>
               </w:rPr>
-              <w:t>https://github.com/DinhTuanHai-TBD/QuanLyDatXe_DriveRent</w:t>
+              <w:t>https://github.com/DinhTuanHai-TBD/QuanLyDatXe_DriveRent.git</w:t>
             </w:r>
           </w:p>
         </w:tc>
@@ -204,12 +216,12 @@
       <w:tr>
         <w:tc>
           <w:tcPr>
-            <w:tcW w:type="dxa" w:w="3168"/>
-            <w:shd w:fill="F1F5F9"/>
+            <w:tcW w:type="dxa" w:w="2880"/>
+            <w:shd w:fill="F8FAFC"/>
             <w:tcMar>
-              <w:top w:w="60" w:type="dxa"/>
-              <w:bottom w:w="60" w:type="dxa"/>
-              <w:left w:w="100" w:type="dxa"/>
+              <w:top w:w="70" w:type="dxa"/>
+              <w:bottom w:w="70" w:type="dxa"/>
+              <w:left w:w="120" w:type="dxa"/>
               <w:right w:w="100" w:type="dxa"/>
             </w:tcMar>
           </w:tcPr>
@@ -219,23 +231,24 @@
             </w:pPr>
             <w:r>
               <w:rPr>
-                <w:rFonts w:ascii="Arial" w:hAnsi="Arial"/>
+                <w:rFonts w:ascii="Segoe UI" w:hAnsi="Segoe UI"/>
                 <w:b/>
-                <w:color w:val="334155"/>
+                <w:i w:val="0"/>
+                <w:color w:val="475569"/>
                 <w:sz w:val="19"/>
               </w:rPr>
-              <w:t>Nền tảng công nghệ:</w:t>
+              <w:t>Ngày lập &amp; Cập nhật:</w:t>
             </w:r>
           </w:p>
         </w:tc>
         <w:tc>
           <w:tcPr>
-            <w:tcW w:type="dxa" w:w="6192"/>
+            <w:tcW w:type="dxa" w:w="6768"/>
             <w:shd w:fill="FFFFFF"/>
             <w:tcMar>
-              <w:top w:w="60" w:type="dxa"/>
-              <w:bottom w:w="60" w:type="dxa"/>
-              <w:left w:w="100" w:type="dxa"/>
+              <w:top w:w="70" w:type="dxa"/>
+              <w:bottom w:w="70" w:type="dxa"/>
+              <w:left w:w="120" w:type="dxa"/>
               <w:right w:w="100" w:type="dxa"/>
             </w:tcMar>
           </w:tcPr>
@@ -245,64 +258,13 @@
             </w:pPr>
             <w:r>
               <w:rPr>
-                <w:rFonts w:ascii="Arial" w:hAnsi="Arial"/>
+                <w:rFonts w:ascii="Segoe UI" w:hAnsi="Segoe UI"/>
+                <w:b w:val="0"/>
+                <w:i w:val="0"/>
                 <w:color w:val="0F172A"/>
                 <w:sz w:val="19"/>
               </w:rPr>
-              <w:t>React 19, TypeScript, Vite 8, Tailwind CSS v4, Motion</w:t>
-            </w:r>
-          </w:p>
-        </w:tc>
-      </w:tr>
-      <w:tr>
-        <w:tc>
-          <w:tcPr>
-            <w:tcW w:type="dxa" w:w="3168"/>
-            <w:shd w:fill="F1F5F9"/>
-            <w:tcMar>
-              <w:top w:w="60" w:type="dxa"/>
-              <w:bottom w:w="60" w:type="dxa"/>
-              <w:left w:w="100" w:type="dxa"/>
-              <w:right w:w="100" w:type="dxa"/>
-            </w:tcMar>
-          </w:tcPr>
-          <w:p>
-            <w:pPr>
-              <w:spacing w:after="0"/>
-            </w:pPr>
-            <w:r>
-              <w:rPr>
-                <w:rFonts w:ascii="Arial" w:hAnsi="Arial"/>
-                <w:b/>
-                <w:color w:val="334155"/>
-                <w:sz w:val="19"/>
-              </w:rPr>
-              <w:t>Ngày lập tài liệu:</w:t>
-            </w:r>
-          </w:p>
-        </w:tc>
-        <w:tc>
-          <w:tcPr>
-            <w:tcW w:type="dxa" w:w="6192"/>
-            <w:shd w:fill="FFFFFF"/>
-            <w:tcMar>
-              <w:top w:w="60" w:type="dxa"/>
-              <w:bottom w:w="60" w:type="dxa"/>
-              <w:left w:w="100" w:type="dxa"/>
-              <w:right w:w="100" w:type="dxa"/>
-            </w:tcMar>
-          </w:tcPr>
-          <w:p>
-            <w:pPr>
-              <w:spacing w:after="0"/>
-            </w:pPr>
-            <w:r>
-              <w:rPr>
-                <w:rFonts w:ascii="Arial" w:hAnsi="Arial"/>
-                <w:color w:val="0F172A"/>
-                <w:sz w:val="19"/>
-              </w:rPr>
-              <w:t>11 tháng 10, 2026</w:t>
+              <w:t>13/10/2026 (Đồng bộ chuẩn 8 câu hỏi cốt lõi)</w:t>
             </w:r>
           </w:p>
         </w:tc>
@@ -310,114 +272,8 @@
     </w:tbl>
     <w:p>
       <w:pPr>
-        <w:spacing w:after="240"/>
+        <w:spacing w:after="160"/>
       </w:pPr>
-    </w:p>
-    <w:p>
-      <w:pPr>
-        <w:spacing w:before="320" w:after="120"/>
-      </w:pPr>
-      <w:r>
-        <w:rPr>
-          <w:rFonts w:ascii="Arial" w:hAnsi="Arial"/>
-          <w:b/>
-          <w:color w:val="1E3A8A"/>
-          <w:sz w:val="28"/>
-        </w:rPr>
-        <w:t>1. BÀI TOÁN THỰC TẾ &amp; BỐI CẢNH KINH DOANH</w:t>
-      </w:r>
-    </w:p>
-    <w:p>
-      <w:r>
-        <w:t>Tại các địa bàn du lịch sôi động như Đà Nẵng, Nha Trang, Phú Quốc, Đà Lạt, Quy Nhơn,... nhu cầu thuê phương tiện giao thông tự lái của du khách (cả khách trong nước và quốc tế) là cực kỳ lớn. Hầu hết các cửa hàng, nhà xe tư nhân có quy mô từ 15 đến 80 phương tiện hỗn hợp (xe số, xe ga 125-150cc, ô tô sedan 4 chỗ, MPV/SUV 7 chỗ). Tuy nhiên, phương thức quản lý tại các cơ sở này hiện nay chủ yếu vẫn dựa vào sổ sách viết tay, bảng tính Excel phân tán hoặc các nhóm chat Zalo nội bộ.</w:t>
-      </w:r>
-    </w:p>
-    <w:p>
-      <w:pPr>
-        <w:spacing w:before="80"/>
-      </w:pPr>
-      <w:r>
-        <w:rPr>
-          <w:b/>
-        </w:rPr>
-        <w:t>Các điểm nghẽn và rủi ro lớn nhất trong hoạt động thực tế:</w:t>
-      </w:r>
-    </w:p>
-    <w:p>
-      <w:pPr>
-        <w:pStyle w:val="ListBullet"/>
-        <w:spacing w:after="80"/>
-      </w:pPr>
-      <w:r>
-        <w:rPr>
-          <w:b/>
-          <w:color w:val="0F172A"/>
-        </w:rPr>
-        <w:t xml:space="preserve">Mất kiểm soát trạng thái đội xe theo thời gian thực: </w:t>
-      </w:r>
-      <w:r>
-        <w:rPr>
-          <w:color w:val="334155"/>
-        </w:rPr>
-        <w:t>Nhân viên điều phối không thể nắm bắt tức thời xe nào đang sẵn sàng ở bãi, xe nào đang cho khách thuê, xe nào sắp đến giờ trả, xe nào đã quá hạn và xe nào đang hỏng hóc hoặc cần bảo dưỡng. Điều này dẫn đến nguy cơ trùng lịch (overbooking) hoặc từ chối khách trong khi thực tế vẫn có xe trống.</w:t>
-      </w:r>
-    </w:p>
-    <w:p>
-      <w:pPr>
-        <w:pStyle w:val="ListBullet"/>
-        <w:spacing w:after="80"/>
-      </w:pPr>
-      <w:r>
-        <w:rPr>
-          <w:b/>
-          <w:color w:val="0F172A"/>
-        </w:rPr>
-        <w:t xml:space="preserve">Thất lạc hồ sơ &amp; Tranh chấp trầy xước lúc giao nhận: </w:t>
-      </w:r>
-      <w:r>
-        <w:rPr>
-          <w:color w:val="334155"/>
-        </w:rPr>
-        <w:t>Hồ sơ giấy tờ tùy thân của khách (CCCD/GPLX) lưu trữ phân tán, dễ thất lạc. Việc thiếu biên bản bàn giao kèm ảnh chụp hiện trạng xe lúc giao khách khiến nhà xe gặp tranh cãi gay gắt khi nhận lại xe có vết trầy xước, móp méo hoặc phụ tùng bị tráo đổi.</w:t>
-      </w:r>
-    </w:p>
-    <w:p>
-      <w:pPr>
-        <w:pStyle w:val="ListBullet"/>
-        <w:spacing w:after="80"/>
-      </w:pPr>
-      <w:r>
-        <w:rPr>
-          <w:b/>
-          <w:color w:val="0F172A"/>
-        </w:rPr>
-        <w:t xml:space="preserve">Tính tiền thủ công, dễ nhầm lẫn và xung đột tiền cọc: </w:t>
-      </w:r>
-      <w:r>
-        <w:rPr>
-          <w:color w:val="334155"/>
-        </w:rPr>
-        <w:t>Du khách thường phát sinh nhu cầu trả trễ giờ, trả lệch địa điểm hoặc thiếu xăng. Việc cộng trừ phụ phí thủ công và không tách bạch tiền đặt cọc (Deposit) với tiền dịch vụ dẫn đến sai sót kế toán và bất đồng khi hoàn cọc.</w:t>
-      </w:r>
-    </w:p>
-    <w:p>
-      <w:pPr>
-        <w:pStyle w:val="ListBullet"/>
-        <w:spacing w:after="80"/>
-      </w:pPr>
-      <w:r>
-        <w:rPr>
-          <w:b/>
-          <w:color w:val="0F172A"/>
-        </w:rPr>
-        <w:t xml:space="preserve">Bỏ quên lịch thay dầu nhớt và bảo trì định kỳ: </w:t>
-      </w:r>
-      <w:r>
-        <w:rPr>
-          <w:color w:val="334155"/>
-        </w:rPr>
-        <w:t>Xe phục vụ du lịch vận hành liên tục trên nhiều địa hình dốc, cát bụi. Việc quên thay nhớt máy định kỳ theo số km hoặc quên kiểm tra hệ thống phanh, lốp xe làm giảm tuổi thọ xe nghiêm trọng và tiềm ẩn rủi ro tai nạn giao thông.</w:t>
-      </w:r>
     </w:p>
     <w:tbl>
       <w:tblPr>
@@ -427,46 +283,47 @@
         <w:tblLook w:firstColumn="1" w:firstRow="1" w:lastColumn="0" w:lastRow="0" w:noHBand="0" w:noVBand="1" w:val="04A0"/>
       </w:tblPr>
       <w:tblGrid>
-        <w:gridCol w:w="9360"/>
+        <w:gridCol w:w="9648"/>
       </w:tblGrid>
       <w:tr>
         <w:tc>
           <w:tcPr>
             <w:tcW w:type="dxa" w:w="9360"/>
-            <w:shd w:fill="F8FAFC"/>
+            <w:shd w:fill="F0FDFA"/>
+            <w:tcBorders>
+              <w:top w:val="none"/>
+              <w:left w:val="single" w:sz="30" w:space="0" w:color="0D9488"/>
+              <w:bottom w:val="none"/>
+              <w:right w:val="none"/>
+            </w:tcBorders>
             <w:tcMar>
               <w:top w:w="140" w:type="dxa"/>
               <w:bottom w:w="140" w:type="dxa"/>
               <w:left w:w="200" w:type="dxa"/>
-              <w:right w:w="200" w:type="dxa"/>
+              <w:right w:w="160" w:type="dxa"/>
             </w:tcMar>
-            <w:tcBorders>
-              <w:left w:val="single" w:sz="24" w:space="0" w:color="1E40AF"/>
-              <w:top w:val="none"/>
-              <w:bottom w:val="none"/>
-              <w:right w:val="none"/>
-            </w:tcBorders>
           </w:tcPr>
           <w:p>
             <w:pPr>
-              <w:spacing w:before="40" w:after="60" w:line="276" w:lineRule="auto"/>
+              <w:spacing w:before="40" w:after="40" w:line="276" w:lineRule="auto"/>
             </w:pPr>
             <w:r>
               <w:rPr>
-                <w:rFonts w:ascii="Arial" w:hAnsi="Arial"/>
+                <w:rFonts w:ascii="Segoe UI" w:hAnsi="Segoe UI"/>
                 <w:b/>
-                <w:color w:val="1E40AF"/>
-                <w:sz w:val="20"/>
+                <w:color w:val="0F766E"/>
+                <w:sz w:val="21"/>
               </w:rPr>
-              <w:t xml:space="preserve">📌 MỤC TIÊU CỐT LÕI CỦA GIẢI PHÁP: </w:t>
+              <w:t>ĐỊNH NGHĨA &amp; NGUYÊN TẮC THIẾT KẾ BRIEF</w:t>
+              <w:br/>
             </w:r>
             <w:r>
               <w:rPr>
-                <w:rFonts w:ascii="Arial" w:hAnsi="Arial"/>
+                <w:rFonts w:ascii="Segoe UI" w:hAnsi="Segoe UI"/>
                 <w:color w:val="334155"/>
                 <w:sz w:val="20"/>
               </w:rPr>
-              <w:t>DriveRent được thiết kế nhằm giải quyết triệt để 4 vấn đề trên thông qua nền tảng vận hành tập trung: kết hợp sơ đồ xe trực quan, quy trình bàn giao số hóa bằng hình ảnh, công cụ tính tiền tự động minh bạch và cơ chế cảnh báo bảo dưỡng kép theo số km ODO &amp; mốc thời gian.</w:t>
+              <w:t>Brief là bảng mô tả tóm tắt thông tin của một dự án công nghệ, đồng thời là căn cứ cốt lõi để tư vấn, định vị bài toán và trao đổi với khách hàng. Một brief chuẩn trả lời trọn vẹn tám câu hỏi phân bổ thành 2 nhóm: Nhóm định vị khách hàng &amp; mục tiêu (Câu 1-4) và Nhóm giải pháp kỹ thuật, phạm vi &amp; kết quả (Câu 5-8).</w:t>
             </w:r>
           </w:p>
         </w:tc>
@@ -479,1919 +336,1722 @@
     </w:p>
     <w:p>
       <w:pPr>
+        <w:keepNext/>
         <w:spacing w:before="320" w:after="120"/>
+        <w:pBdr>
+          <w:bottom w:val="single" w:sz="12" w:space="4" w:color="0D9488"/>
+        </w:pBdr>
       </w:pPr>
       <w:r>
         <w:rPr>
-          <w:rFonts w:ascii="Arial" w:hAnsi="Arial"/>
+          <w:rFonts w:ascii="Segoe UI" w:hAnsi="Segoe UI"/>
           <w:b/>
-          <w:color w:val="1E3A8A"/>
+          <w:i w:val="0"/>
+          <w:color w:val="0F172A"/>
           <w:sz w:val="28"/>
         </w:rPr>
-        <w:t>2. ĐỐI TƯỢNG SỬ DỤNG HỆ THỐNG (USER PERSONAS)</w:t>
-      </w:r>
-    </w:p>
-    <w:tbl>
-      <w:tblPr>
-        <w:tblW w:type="auto" w:w="0"/>
-        <w:jc w:val="center"/>
-        <w:tblLayout w:type="fixed"/>
-        <w:tblLook w:firstColumn="1" w:firstRow="1" w:lastColumn="0" w:lastRow="0" w:noHBand="0" w:noVBand="1" w:val="04A0"/>
-      </w:tblPr>
-      <w:tblGrid>
-        <w:gridCol w:w="3120"/>
-        <w:gridCol w:w="3120"/>
-        <w:gridCol w:w="3120"/>
-      </w:tblGrid>
-      <w:tr>
-        <w:tc>
-          <w:tcPr>
-            <w:tcW w:type="dxa" w:w="2592"/>
-            <w:shd w:fill="1E40AF"/>
-            <w:tcMar>
-              <w:top w:w="80" w:type="dxa"/>
-              <w:bottom w:w="80" w:type="dxa"/>
-              <w:left w:w="100" w:type="dxa"/>
-              <w:right w:w="100" w:type="dxa"/>
-            </w:tcMar>
-          </w:tcPr>
-          <w:p>
-            <w:pPr>
-              <w:spacing w:after="0"/>
-            </w:pPr>
-            <w:r>
-              <w:rPr>
-                <w:rFonts w:ascii="Arial" w:hAnsi="Arial"/>
-                <w:b/>
-                <w:color w:val="FFFFFF"/>
-                <w:sz w:val="19"/>
-              </w:rPr>
-              <w:t>Vai trò</w:t>
-            </w:r>
-          </w:p>
-        </w:tc>
-        <w:tc>
-          <w:tcPr>
-            <w:tcW w:type="dxa" w:w="2592"/>
-            <w:shd w:fill="1E40AF"/>
-            <w:tcMar>
-              <w:top w:w="80" w:type="dxa"/>
-              <w:bottom w:w="80" w:type="dxa"/>
-              <w:left w:w="100" w:type="dxa"/>
-              <w:right w:w="100" w:type="dxa"/>
-            </w:tcMar>
-          </w:tcPr>
-          <w:p>
-            <w:pPr>
-              <w:spacing w:after="0"/>
-            </w:pPr>
-            <w:r>
-              <w:rPr>
-                <w:rFonts w:ascii="Arial" w:hAnsi="Arial"/>
-                <w:b/>
-                <w:color w:val="FFFFFF"/>
-                <w:sz w:val="19"/>
-              </w:rPr>
-              <w:t>Người dùng mẫu</w:t>
-            </w:r>
-          </w:p>
-        </w:tc>
-        <w:tc>
-          <w:tcPr>
-            <w:tcW w:type="dxa" w:w="4176"/>
-            <w:shd w:fill="1E40AF"/>
-            <w:tcMar>
-              <w:top w:w="80" w:type="dxa"/>
-              <w:bottom w:w="80" w:type="dxa"/>
-              <w:left w:w="100" w:type="dxa"/>
-              <w:right w:w="100" w:type="dxa"/>
-            </w:tcMar>
-          </w:tcPr>
-          <w:p>
-            <w:pPr>
-              <w:spacing w:after="0"/>
-            </w:pPr>
-            <w:r>
-              <w:rPr>
-                <w:rFonts w:ascii="Arial" w:hAnsi="Arial"/>
-                <w:b/>
-                <w:color w:val="FFFFFF"/>
-                <w:sz w:val="19"/>
-              </w:rPr>
-              <w:t>Nhiệm vụ &amp; Hành vi cốt lõi</w:t>
-            </w:r>
-          </w:p>
-        </w:tc>
-      </w:tr>
-      <w:tr>
-        <w:tc>
-          <w:tcPr>
-            <w:tcW w:type="dxa" w:w="2592"/>
-            <w:shd w:fill="F8FAFC"/>
-            <w:tcMar>
-              <w:top w:w="60" w:type="dxa"/>
-              <w:bottom w:w="60" w:type="dxa"/>
-              <w:left w:w="100" w:type="dxa"/>
-              <w:right w:w="100" w:type="dxa"/>
-            </w:tcMar>
-          </w:tcPr>
-          <w:p>
-            <w:pPr>
-              <w:spacing w:after="0"/>
-            </w:pPr>
-            <w:r>
-              <w:rPr>
-                <w:rFonts w:ascii="Arial" w:hAnsi="Arial"/>
-                <w:b/>
-                <w:color w:val="1E3A8A"/>
-                <w:sz w:val="18"/>
-              </w:rPr>
-              <w:t>Chủ cửa hàng (Admin)</w:t>
-            </w:r>
-          </w:p>
-        </w:tc>
-        <w:tc>
-          <w:tcPr>
-            <w:tcW w:type="dxa" w:w="2592"/>
-            <w:shd w:fill="F8FAFC"/>
-            <w:tcMar>
-              <w:top w:w="60" w:type="dxa"/>
-              <w:bottom w:w="60" w:type="dxa"/>
-              <w:left w:w="100" w:type="dxa"/>
-              <w:right w:w="100" w:type="dxa"/>
-            </w:tcMar>
-          </w:tcPr>
-          <w:p>
-            <w:pPr>
-              <w:spacing w:after="0"/>
-            </w:pPr>
-            <w:r>
-              <w:rPr>
-                <w:rFonts w:ascii="Arial" w:hAnsi="Arial"/>
-                <w:sz w:val="18"/>
-              </w:rPr>
-              <w:t>Nguyễn Văn Minh (Quản lý chung)</w:t>
-            </w:r>
-          </w:p>
-        </w:tc>
-        <w:tc>
-          <w:tcPr>
-            <w:tcW w:type="dxa" w:w="4176"/>
-            <w:shd w:fill="F8FAFC"/>
-            <w:tcMar>
-              <w:top w:w="60" w:type="dxa"/>
-              <w:bottom w:w="60" w:type="dxa"/>
-              <w:left w:w="100" w:type="dxa"/>
-              <w:right w:w="100" w:type="dxa"/>
-            </w:tcMar>
-          </w:tcPr>
-          <w:p>
-            <w:pPr>
-              <w:spacing w:after="0"/>
-            </w:pPr>
-            <w:r>
-              <w:rPr>
-                <w:rFonts w:ascii="Arial" w:hAnsi="Arial"/>
-                <w:sz w:val="18"/>
-              </w:rPr>
-              <w:t>Theo dõi toàn bộ đội xe, KPI doanh thu, tiền cọc đang nắm giữ, công nợ và phê duyệt quyết toán.</w:t>
-            </w:r>
-          </w:p>
-        </w:tc>
-      </w:tr>
-      <w:tr>
-        <w:tc>
-          <w:tcPr>
-            <w:tcW w:type="dxa" w:w="2592"/>
-            <w:shd w:fill="FFFFFF"/>
-            <w:tcMar>
-              <w:top w:w="60" w:type="dxa"/>
-              <w:bottom w:w="60" w:type="dxa"/>
-              <w:left w:w="100" w:type="dxa"/>
-              <w:right w:w="100" w:type="dxa"/>
-            </w:tcMar>
-          </w:tcPr>
-          <w:p>
-            <w:pPr>
-              <w:spacing w:after="0"/>
-            </w:pPr>
-            <w:r>
-              <w:rPr>
-                <w:rFonts w:ascii="Arial" w:hAnsi="Arial"/>
-                <w:b/>
-                <w:color w:val="1E3A8A"/>
-                <w:sz w:val="18"/>
-              </w:rPr>
-              <w:t>Nhân viên điều phối (Staff)</w:t>
-            </w:r>
-          </w:p>
-        </w:tc>
-        <w:tc>
-          <w:tcPr>
-            <w:tcW w:type="dxa" w:w="2592"/>
-            <w:shd w:fill="FFFFFF"/>
-            <w:tcMar>
-              <w:top w:w="60" w:type="dxa"/>
-              <w:bottom w:w="60" w:type="dxa"/>
-              <w:left w:w="100" w:type="dxa"/>
-              <w:right w:w="100" w:type="dxa"/>
-            </w:tcMar>
-          </w:tcPr>
-          <w:p>
-            <w:pPr>
-              <w:spacing w:after="0"/>
-            </w:pPr>
-            <w:r>
-              <w:rPr>
-                <w:rFonts w:ascii="Arial" w:hAnsi="Arial"/>
-                <w:sz w:val="18"/>
-              </w:rPr>
-              <w:t>Trần Thị Thu Thảo (Lễ tân/Sales)</w:t>
-            </w:r>
-          </w:p>
-        </w:tc>
-        <w:tc>
-          <w:tcPr>
-            <w:tcW w:type="dxa" w:w="4176"/>
-            <w:shd w:fill="FFFFFF"/>
-            <w:tcMar>
-              <w:top w:w="60" w:type="dxa"/>
-              <w:bottom w:w="60" w:type="dxa"/>
-              <w:left w:w="100" w:type="dxa"/>
-              <w:right w:w="100" w:type="dxa"/>
-            </w:tcMar>
-          </w:tcPr>
-          <w:p>
-            <w:pPr>
-              <w:spacing w:after="0"/>
-            </w:pPr>
-            <w:r>
-              <w:rPr>
-                <w:rFonts w:ascii="Arial" w:hAnsi="Arial"/>
-                <w:sz w:val="18"/>
-              </w:rPr>
-              <w:t>Kiểm tra xe trống, lập hợp đồng thuê xe, upload ảnh CCCD/GPLX, thực hiện biên bản bàn giao và thu hồi.</w:t>
-            </w:r>
-          </w:p>
-        </w:tc>
-      </w:tr>
-      <w:tr>
-        <w:tc>
-          <w:tcPr>
-            <w:tcW w:type="dxa" w:w="2592"/>
-            <w:shd w:fill="F8FAFC"/>
-            <w:tcMar>
-              <w:top w:w="60" w:type="dxa"/>
-              <w:bottom w:w="60" w:type="dxa"/>
-              <w:left w:w="100" w:type="dxa"/>
-              <w:right w:w="100" w:type="dxa"/>
-            </w:tcMar>
-          </w:tcPr>
-          <w:p>
-            <w:pPr>
-              <w:spacing w:after="0"/>
-            </w:pPr>
-            <w:r>
-              <w:rPr>
-                <w:rFonts w:ascii="Arial" w:hAnsi="Arial"/>
-                <w:b/>
-                <w:color w:val="1E3A8A"/>
-                <w:sz w:val="18"/>
-              </w:rPr>
-              <w:t>Kỹ thuật viên (Technician)</w:t>
-            </w:r>
-          </w:p>
-        </w:tc>
-        <w:tc>
-          <w:tcPr>
-            <w:tcW w:type="dxa" w:w="2592"/>
-            <w:shd w:fill="F8FAFC"/>
-            <w:tcMar>
-              <w:top w:w="60" w:type="dxa"/>
-              <w:bottom w:w="60" w:type="dxa"/>
-              <w:left w:w="100" w:type="dxa"/>
-              <w:right w:w="100" w:type="dxa"/>
-            </w:tcMar>
-          </w:tcPr>
-          <w:p>
-            <w:pPr>
-              <w:spacing w:after="0"/>
-            </w:pPr>
-            <w:r>
-              <w:rPr>
-                <w:rFonts w:ascii="Arial" w:hAnsi="Arial"/>
-                <w:sz w:val="18"/>
-              </w:rPr>
-              <w:t>Lê Hoàng Dũng (Thợ xe)</w:t>
-            </w:r>
-          </w:p>
-        </w:tc>
-        <w:tc>
-          <w:tcPr>
-            <w:tcW w:type="dxa" w:w="4176"/>
-            <w:shd w:fill="F8FAFC"/>
-            <w:tcMar>
-              <w:top w:w="60" w:type="dxa"/>
-              <w:bottom w:w="60" w:type="dxa"/>
-              <w:left w:w="100" w:type="dxa"/>
-              <w:right w:w="100" w:type="dxa"/>
-            </w:tcMar>
-          </w:tcPr>
-          <w:p>
-            <w:pPr>
-              <w:spacing w:after="0"/>
-            </w:pPr>
-            <w:r>
-              <w:rPr>
-                <w:rFonts w:ascii="Arial" w:hAnsi="Arial"/>
-                <w:sz w:val="18"/>
-              </w:rPr>
-              <w:t>Theo dõi cảnh báo xe đến hạn thay nhớt, bảo dưỡng định kỳ, cập nhật kết quả kiểm định và chi phí phụ tùng.</w:t>
-            </w:r>
-          </w:p>
-        </w:tc>
-      </w:tr>
-      <w:tr>
-        <w:tc>
-          <w:tcPr>
-            <w:tcW w:type="dxa" w:w="2592"/>
-            <w:shd w:fill="FFFFFF"/>
-            <w:tcMar>
-              <w:top w:w="60" w:type="dxa"/>
-              <w:bottom w:w="60" w:type="dxa"/>
-              <w:left w:w="100" w:type="dxa"/>
-              <w:right w:w="100" w:type="dxa"/>
-            </w:tcMar>
-          </w:tcPr>
-          <w:p>
-            <w:pPr>
-              <w:spacing w:after="0"/>
-            </w:pPr>
-            <w:r>
-              <w:rPr>
-                <w:rFonts w:ascii="Arial" w:hAnsi="Arial"/>
-                <w:b/>
-                <w:color w:val="1E3A8A"/>
-                <w:sz w:val="18"/>
-              </w:rPr>
-              <w:t>Khách thuê xe (Customer)</w:t>
-            </w:r>
-          </w:p>
-        </w:tc>
-        <w:tc>
-          <w:tcPr>
-            <w:tcW w:type="dxa" w:w="2592"/>
-            <w:shd w:fill="FFFFFF"/>
-            <w:tcMar>
-              <w:top w:w="60" w:type="dxa"/>
-              <w:bottom w:w="60" w:type="dxa"/>
-              <w:left w:w="100" w:type="dxa"/>
-              <w:right w:w="100" w:type="dxa"/>
-            </w:tcMar>
-          </w:tcPr>
-          <w:p>
-            <w:pPr>
-              <w:spacing w:after="0"/>
-            </w:pPr>
-            <w:r>
-              <w:rPr>
-                <w:rFonts w:ascii="Arial" w:hAnsi="Arial"/>
-                <w:sz w:val="18"/>
-              </w:rPr>
-              <w:t>Du khách tự do / Gia đình</w:t>
-            </w:r>
-          </w:p>
-        </w:tc>
-        <w:tc>
-          <w:tcPr>
-            <w:tcW w:type="dxa" w:w="4176"/>
-            <w:shd w:fill="FFFFFF"/>
-            <w:tcMar>
-              <w:top w:w="60" w:type="dxa"/>
-              <w:bottom w:w="60" w:type="dxa"/>
-              <w:left w:w="100" w:type="dxa"/>
-              <w:right w:w="100" w:type="dxa"/>
-            </w:tcMar>
-          </w:tcPr>
-          <w:p>
-            <w:pPr>
-              <w:spacing w:after="0"/>
-            </w:pPr>
-            <w:r>
-              <w:rPr>
-                <w:rFonts w:ascii="Arial" w:hAnsi="Arial"/>
-                <w:sz w:val="18"/>
-              </w:rPr>
-              <w:t>Xem danh sách xe trực tuyến, kiểm tra giá thuê giờ/ngày, đặt cọc giữ chỗ 10 phút qua mã QR ngân hàng.</w:t>
-            </w:r>
-          </w:p>
-        </w:tc>
-      </w:tr>
-    </w:tbl>
-    <w:p>
-      <w:pPr>
-        <w:spacing w:after="240"/>
-      </w:pPr>
-    </w:p>
-    <w:p>
-      <w:pPr>
-        <w:spacing w:before="320" w:after="120"/>
-      </w:pPr>
-      <w:r>
-        <w:rPr>
-          <w:rFonts w:ascii="Arial" w:hAnsi="Arial"/>
-          <w:b/>
-          <w:color w:val="1E3A8A"/>
-          <w:sz w:val="28"/>
-        </w:rPr>
-        <w:t>3. ĐẶC TẢ CHI TIẾT 4 TÍNH NĂNG CỐT LÕI</w:t>
+        <w:t>1. Dự án này là gì?</w:t>
       </w:r>
     </w:p>
     <w:p>
       <w:pPr>
-        <w:spacing w:before="200" w:after="80"/>
+        <w:spacing w:after="120" w:line="276" w:lineRule="auto"/>
       </w:pPr>
       <w:r>
         <w:rPr>
-          <w:rFonts w:ascii="Arial" w:hAnsi="Arial"/>
-          <w:b/>
-          <w:color w:val="2563EB"/>
-          <w:sz w:val="24"/>
+          <w:rFonts w:ascii="Segoe UI" w:hAnsi="Segoe UI"/>
+          <w:b w:val="0"/>
+          <w:i w:val="0"/>
+          <w:color w:val="334155"/>
+          <w:sz w:val="21"/>
         </w:rPr>
-        <w:t>3.1. Sơ đồ trạng thái xe trực quan (Visual Fleet Status Board)</w:t>
-      </w:r>
-    </w:p>
-    <w:p>
-      <w:r>
-        <w:t>Mô-đun quản lý đội xe (Fleet View) cho phép nhân viên nắm bắt tình trạng của toàn bộ xe chỉ trong 1 giây thông qua hệ thống thẻ màu và thông tin trực quan. Tệp mã nguồn tương ứng: src/views/FleetView.tsx.</w:t>
+        <w:t>DriveRent là Website &amp; Hệ thống phần mềm quản lý dịch vụ cho thuê xe máy và ô tô tự lái toàn diện (All-in-one Rental Platform). Dự án tích hợp đồng bộ hai phân hệ chuyên biệt trên cùng một nền tảng:</w:t>
       </w:r>
     </w:p>
     <w:p>
       <w:pPr>
         <w:pStyle w:val="ListBullet"/>
-        <w:spacing w:after="60"/>
+        <w:spacing w:before="40" w:after="60" w:line="276" w:lineRule="auto"/>
       </w:pPr>
       <w:r>
         <w:rPr>
+          <w:rFonts w:ascii="Segoe UI" w:hAnsi="Segoe UI"/>
           <w:b/>
+          <w:i w:val="0"/>
+          <w:color w:val="0F172A"/>
+          <w:sz w:val="21"/>
         </w:rPr>
-        <w:t xml:space="preserve">Mã hóa 3 trạng thái chuẩn mực: </w:t>
+        <w:t xml:space="preserve">Phân hệ Khách hàng (Customer Booking Portal): </w:t>
       </w:r>
       <w:r>
-        <w:t>🟢 SẴN SÀNG (Available): Xe ở bãi, đã kiểm tra đạt chuẩn, sẵn sàng đón khách ngay; 🔵 ĐANG CHO THUÊ (Rented): Xe đang lăn bánh, hiển thị tên khách, giờ hẹn trả và cờ cảnh báo trễ hạn; 🟠 ĐANG BẢO DƯỠNG (Maintenance): Xe đang thay nhớt hoặc sửa chữa, tự động khóa khỏi luồng cho thuê.</w:t>
+        <w:rPr>
+          <w:rFonts w:ascii="Segoe UI" w:hAnsi="Segoe UI"/>
+          <w:b w:val="0"/>
+          <w:i w:val="0"/>
+          <w:color w:val="334155"/>
+          <w:sz w:val="21"/>
+        </w:rPr>
+        <w:t>Website trực tuyến hiện đại dành cho du khách tìm kiếm, tham khảo thông số, kiểm tra giá thuê theo giờ/ngày và đặt cọc giữ chỗ trực tuyến. Ứng dụng ngôn ngữ thiết kế Liquid Glass (kính mờ trong suốt cao cấp), hiệu ứng xe tự động chạy vào bãi gara LED 3D sống động, thanh điều hướng taskbar chuyển đổi trạng thái mượt mà theo vị trí cuộn trang.</w:t>
       </w:r>
     </w:p>
     <w:p>
       <w:pPr>
         <w:pStyle w:val="ListBullet"/>
-        <w:spacing w:after="60"/>
+        <w:spacing w:before="40" w:after="60" w:line="276" w:lineRule="auto"/>
       </w:pPr>
       <w:r>
         <w:rPr>
+          <w:rFonts w:ascii="Segoe UI" w:hAnsi="Segoe UI"/>
           <w:b/>
+          <w:i w:val="0"/>
+          <w:color w:val="0F172A"/>
+          <w:sz w:val="21"/>
         </w:rPr>
-        <w:t xml:space="preserve">Dữ liệu trực quan trên từng thẻ xe: </w:t>
+        <w:t xml:space="preserve">Phân hệ Quản trị &amp; Điều hành Nội bộ (Admin Operations System): </w:t>
       </w:r>
       <w:r>
-        <w:t>Hình ảnh thực tế của xe, Biển số đăng ký, Loại xe (Sedan/MPV/Xe ga), Mức vạch xăng hiển thị trực quan (1/8 đến 8/8), Số km ODO hiện tại và Đơn giá thuê niêm yết rõ ràng theo giờ và theo ngày.</w:t>
+        <w:rPr>
+          <w:rFonts w:ascii="Segoe UI" w:hAnsi="Segoe UI"/>
+          <w:b w:val="0"/>
+          <w:i w:val="0"/>
+          <w:color w:val="334155"/>
+          <w:sz w:val="21"/>
+        </w:rPr>
+        <w:t>Bảng điều khiển dành riêng cho chủ nhà xe, nhân viên lễ tân và thợ kỹ thuật. Giám sát đội xe trực quan theo thời gian thực (Sẵn sàng / Đang thuê / Bảo dưỡng), số hóa quy trình lập hợp đồng trong 2 phút, quản lý biên bản bàn giao - thu hồi xe kèm ảnh chụp hiện trạng, tự động quyết toán phân định tiền cọc và quản lý lịch bảo trì, nhắc thay nhớt định kỳ.</w:t>
+      </w:r>
+    </w:p>
+    <w:p>
+      <w:pPr>
+        <w:keepNext/>
+        <w:spacing w:before="320" w:after="120"/>
+        <w:pBdr>
+          <w:bottom w:val="single" w:sz="12" w:space="4" w:color="0D9488"/>
+        </w:pBdr>
+      </w:pPr>
+      <w:r>
+        <w:rPr>
+          <w:rFonts w:ascii="Segoe UI" w:hAnsi="Segoe UI"/>
+          <w:b/>
+          <w:i w:val="0"/>
+          <w:color w:val="0F172A"/>
+          <w:sz w:val="28"/>
+        </w:rPr>
+        <w:t>2. Khách hàng là ai?</w:t>
+      </w:r>
+    </w:p>
+    <w:p>
+      <w:pPr>
+        <w:spacing w:after="120" w:line="276" w:lineRule="auto"/>
+      </w:pPr>
+      <w:r>
+        <w:rPr>
+          <w:rFonts w:ascii="Segoe UI" w:hAnsi="Segoe UI"/>
+          <w:b w:val="0"/>
+          <w:i w:val="0"/>
+          <w:color w:val="334155"/>
+          <w:sz w:val="21"/>
+        </w:rPr>
+        <w:t>Khách hàng trực tiếp của dự án (Chủ sở hữu hệ thống / Bên đặt hàng dịch vụ) bao gồm:</w:t>
       </w:r>
     </w:p>
     <w:p>
       <w:pPr>
         <w:pStyle w:val="ListBullet"/>
-        <w:spacing w:after="60"/>
+        <w:spacing w:before="40" w:after="60" w:line="276" w:lineRule="auto"/>
       </w:pPr>
       <w:r>
         <w:rPr>
+          <w:rFonts w:ascii="Segoe UI" w:hAnsi="Segoe UI"/>
           <w:b/>
+          <w:i w:val="0"/>
+          <w:color w:val="0F172A"/>
+          <w:sz w:val="21"/>
         </w:rPr>
-        <w:t xml:space="preserve">Bộ lọc thông minh đa tầng: </w:t>
+        <w:t xml:space="preserve">Cơ sở &amp; Chuỗi cửa hàng kinh doanh cho thuê phương tiện tự lái: </w:t>
       </w:r>
       <w:r>
-        <w:t>Lọc phân loại (Tất cả / Ô tô / Xe máy), Lọc trạng thái (Sẵn sàng / Đang thuê / Bảo dưỡng) và Bộ lọc kiểm tra khả dụng (chọn ngày giờ nhận - trả để hệ thống tự động loại trừ các xe đã có lịch thuê trong khoảng thời gian đó).</w:t>
+        <w:rPr>
+          <w:rFonts w:ascii="Segoe UI" w:hAnsi="Segoe UI"/>
+          <w:b w:val="0"/>
+          <w:i w:val="0"/>
+          <w:color w:val="334155"/>
+          <w:sz w:val="21"/>
+        </w:rPr>
+        <w:t>Các nhà xe có quy mô vừa và nhỏ (sở hữu từ 15 đến 80+ đầu xe hỗn hợp cả xe máy tay ga, xe số và ô tô 4–7 chỗ), tập trung tại các thành phố du lịch trọng điểm của Việt Nam (Đà Nẵng, Nha Trang, Phú Quốc, Đà Lạt, Quy Nhơn, Vũng Tàu, Hà Nội, TP.HCM,...).</w:t>
       </w:r>
     </w:p>
     <w:p>
       <w:pPr>
         <w:pStyle w:val="ListBullet"/>
-        <w:spacing w:after="60"/>
+        <w:spacing w:before="40" w:after="60" w:line="276" w:lineRule="auto"/>
       </w:pPr>
       <w:r>
         <w:rPr>
+          <w:rFonts w:ascii="Segoe UI" w:hAnsi="Segoe UI"/>
           <w:b/>
+          <w:i w:val="0"/>
+          <w:color w:val="0F172A"/>
+          <w:sz w:val="21"/>
         </w:rPr>
-        <w:t xml:space="preserve">Chế độ hiển thị linh hoạt: </w:t>
+        <w:t xml:space="preserve">Đội ngũ nhân sự vận hành tại nhà xe: </w:t>
       </w:r>
       <w:r>
-        <w:t>Chế độ xem lưới trực quan (Grid View) thích hợp cho lễ tân điều phối; Chế độ xem bảng (Table View) tối ưu cho việc rà soát và kiểm kê hàng loạt.</w:t>
+        <w:rPr>
+          <w:rFonts w:ascii="Segoe UI" w:hAnsi="Segoe UI"/>
+          <w:b w:val="0"/>
+          <w:i w:val="0"/>
+          <w:color w:val="334155"/>
+          <w:sz w:val="21"/>
+        </w:rPr>
+        <w:t>Các phòng ban phối hợp nhịp nhàng trong quy trình:</w:t>
       </w:r>
     </w:p>
     <w:p>
       <w:pPr>
-        <w:spacing w:before="200" w:after="80"/>
+        <w:pStyle w:val="ListBullet2"/>
+        <w:spacing w:before="20" w:after="40" w:line="276" w:lineRule="auto"/>
       </w:pPr>
       <w:r>
         <w:rPr>
-          <w:rFonts w:ascii="Arial" w:hAnsi="Arial"/>
+          <w:rFonts w:ascii="Segoe UI" w:hAnsi="Segoe UI"/>
           <w:b/>
-          <w:color w:val="2563EB"/>
-          <w:sz w:val="24"/>
+          <w:i w:val="0"/>
+          <w:color w:val="1E293B"/>
+          <w:sz w:val="20"/>
         </w:rPr>
-        <w:t>3.2. Quản lý hợp đồng thuê xe &amp; Lưu trữ hồ sơ giao/nhận số</w:t>
+        <w:t xml:space="preserve">Chủ cửa hàng / Quản lý: </w:t>
+      </w:r>
+      <w:r>
+        <w:rPr>
+          <w:rFonts w:ascii="Segoe UI" w:hAnsi="Segoe UI"/>
+          <w:b w:val="0"/>
+          <w:i w:val="0"/>
+          <w:color w:val="475569"/>
+          <w:sz w:val="20"/>
+        </w:rPr>
+        <w:t>Cần giám sát tổng thể doanh thu, công nợ, dòng tiền cọc đang nắm giữ và hiệu suất khai thác đội xe mọi lúc mọi nơi.</w:t>
       </w:r>
     </w:p>
     <w:p>
+      <w:pPr>
+        <w:pStyle w:val="ListBullet2"/>
+        <w:spacing w:before="20" w:after="40" w:line="276" w:lineRule="auto"/>
+      </w:pPr>
       <w:r>
-        <w:t>Hệ thống số hóa toàn diện quy trình lập hợp đồng và biên bản bàn giao/thu hồi phương tiện. Tệp mã nguồn tương ứng: src/views/CreateContractWizard.tsx, src/views/HandoverReturnModal.tsx, src/views/PrintContractModal.tsx.</w:t>
+        <w:rPr>
+          <w:rFonts w:ascii="Segoe UI" w:hAnsi="Segoe UI"/>
+          <w:b/>
+          <w:i w:val="0"/>
+          <w:color w:val="1E293B"/>
+          <w:sz w:val="20"/>
+        </w:rPr>
+        <w:t xml:space="preserve">Nhân viên Lễ tân / Tiếp đón (Front Desk / Sales): </w:t>
+      </w:r>
+      <w:r>
+        <w:rPr>
+          <w:rFonts w:ascii="Segoe UI" w:hAnsi="Segoe UI"/>
+          <w:b w:val="0"/>
+          <w:i w:val="0"/>
+          <w:color w:val="475569"/>
+          <w:sz w:val="20"/>
+        </w:rPr>
+        <w:t>Cần thao tác tra cứu xe trống tức thời, lập hợp đồng thuê xe, bàn giao xe và thanh lý hợp đồng chính xác chỉ trong vài phút.</w:t>
+      </w:r>
+    </w:p>
+    <w:p>
+      <w:pPr>
+        <w:pStyle w:val="ListBullet2"/>
+        <w:spacing w:before="20" w:after="40" w:line="276" w:lineRule="auto"/>
+      </w:pPr>
+      <w:r>
+        <w:rPr>
+          <w:rFonts w:ascii="Segoe UI" w:hAnsi="Segoe UI"/>
+          <w:b/>
+          <w:i w:val="0"/>
+          <w:color w:val="1E293B"/>
+          <w:sz w:val="20"/>
+        </w:rPr>
+        <w:t xml:space="preserve">Kỹ thuật viên / Thợ bảo dưỡng (Technician): </w:t>
+      </w:r>
+      <w:r>
+        <w:rPr>
+          <w:rFonts w:ascii="Segoe UI" w:hAnsi="Segoe UI"/>
+          <w:b w:val="0"/>
+          <w:i w:val="0"/>
+          <w:color w:val="475569"/>
+          <w:sz w:val="20"/>
+        </w:rPr>
+        <w:t>Cần theo dõi số Km lăn bánh (ODO) của từng xe để thay nhớt, kiểm tra má phanh, lốp xe đúng định kỳ.</w:t>
+      </w:r>
+    </w:p>
+    <w:p>
+      <w:pPr>
+        <w:keepNext/>
+        <w:spacing w:before="320" w:after="120"/>
+        <w:pBdr>
+          <w:bottom w:val="single" w:sz="12" w:space="4" w:color="0D9488"/>
+        </w:pBdr>
+      </w:pPr>
+      <w:r>
+        <w:rPr>
+          <w:rFonts w:ascii="Segoe UI" w:hAnsi="Segoe UI"/>
+          <w:b/>
+          <w:i w:val="0"/>
+          <w:color w:val="0F172A"/>
+          <w:sz w:val="28"/>
+        </w:rPr>
+        <w:t>3. Đối tượng khách hàng của họ là ai?</w:t>
+      </w:r>
+    </w:p>
+    <w:p>
+      <w:pPr>
+        <w:spacing w:after="120" w:line="276" w:lineRule="auto"/>
+      </w:pPr>
+      <w:r>
+        <w:rPr>
+          <w:rFonts w:ascii="Segoe UI" w:hAnsi="Segoe UI"/>
+          <w:b w:val="0"/>
+          <w:i w:val="0"/>
+          <w:color w:val="334155"/>
+          <w:sz w:val="21"/>
+        </w:rPr>
+        <w:t>Đối tượng khách hàng mục tiêu của nhà xe (Người dùng cuối / End-users truy cập website để tìm và thuê xe) bao gồm 4 nhóm chính:</w:t>
       </w:r>
     </w:p>
     <w:p>
       <w:pPr>
         <w:pStyle w:val="ListBullet"/>
-        <w:spacing w:after="60"/>
+        <w:spacing w:before="40" w:after="60" w:line="276" w:lineRule="auto"/>
       </w:pPr>
       <w:r>
         <w:rPr>
+          <w:rFonts w:ascii="Segoe UI" w:hAnsi="Segoe UI"/>
           <w:b/>
+          <w:i w:val="0"/>
+          <w:color w:val="0F172A"/>
+          <w:sz w:val="21"/>
         </w:rPr>
-        <w:t xml:space="preserve">Quy trình Wizard 4 bước khởi tạo hợp đồng: </w:t>
+        <w:t xml:space="preserve">Khách du lịch tự túc (Cá nhân, cặp đôi, nhóm bạn trẻ): </w:t>
       </w:r>
       <w:r>
-        <w:t>Bước 1: Chọn xe &amp; thời gian (tính theo giờ hoặc ngày, tự động kiểm tra trùng lịch); Bước 2: Thông tin khách thuê (tên, SĐT, địa chỉ lưu trú); Bước 3: Lưu trữ hồ sơ tùy thân (upload ảnh CCCD/Hộ chiếu và GPLX phù hợp); Bước 4: Thiết lập tiền cọc cách ly (5 triệu với ô tô, 1 triệu với xe máy), phụ phí và giảm giá.</w:t>
+        <w:rPr>
+          <w:rFonts w:ascii="Segoe UI" w:hAnsi="Segoe UI"/>
+          <w:b w:val="0"/>
+          <w:i w:val="0"/>
+          <w:color w:val="334155"/>
+          <w:sz w:val="21"/>
+        </w:rPr>
+        <w:t>Đến các điểm du lịch nghỉ dưỡng từ 2–5 ngày, muốn thuê xe máy (Vision, AirBlade) hoặc ô tô 4 chỗ (Vios) để chủ động lịch trình khám phá. Ưa chuộng hình ảnh thật, bảng giá minh bạch và đặt cọc giữ xe nhanh qua mã QR.</w:t>
       </w:r>
     </w:p>
     <w:p>
       <w:pPr>
         <w:pStyle w:val="ListBullet"/>
-        <w:spacing w:after="60"/>
+        <w:spacing w:before="40" w:after="60" w:line="276" w:lineRule="auto"/>
       </w:pPr>
       <w:r>
         <w:rPr>
+          <w:rFonts w:ascii="Segoe UI" w:hAnsi="Segoe UI"/>
           <w:b/>
+          <w:i w:val="0"/>
+          <w:color w:val="0F172A"/>
+          <w:sz w:val="21"/>
         </w:rPr>
-        <w:t xml:space="preserve">Biên bản giao xe số hóa (Handover Record): </w:t>
+        <w:t xml:space="preserve">Khách du lịch gia đình: </w:t>
       </w:r>
       <w:r>
-        <w:t>Ghi nhận chính xác mốc giờ giao thực tế, số km ODO ban đầu, mức xăng thực tế; Checklist bàn giao phụ kiện (Cavet sao y, bảo hiểm TNDS, mũ bảo hiểm, áo mưa, kích lốp ô tô); Chụp và lưu ảnh 4 góc xe lúc xuất bãi.</w:t>
+        <w:rPr>
+          <w:rFonts w:ascii="Segoe UI" w:hAnsi="Segoe UI"/>
+          <w:b w:val="0"/>
+          <w:i w:val="0"/>
+          <w:color w:val="334155"/>
+          <w:sz w:val="21"/>
+        </w:rPr>
+        <w:t>Đoàn từ 4–7 người, ưu tiên thuê ô tô 7 chỗ (Mitsubishi Xpander, Toyota Veloz) đời mới, sạch sẽ, khoang hành lý rộng, điều hòa mát và độ an toàn kỹ thuật cao.</w:t>
       </w:r>
     </w:p>
     <w:p>
       <w:pPr>
         <w:pStyle w:val="ListBullet"/>
-        <w:spacing w:after="60"/>
+        <w:spacing w:before="40" w:after="60" w:line="276" w:lineRule="auto"/>
       </w:pPr>
       <w:r>
         <w:rPr>
+          <w:rFonts w:ascii="Segoe UI" w:hAnsi="Segoe UI"/>
           <w:b/>
+          <w:i w:val="0"/>
+          <w:color w:val="0F172A"/>
+          <w:sz w:val="21"/>
         </w:rPr>
-        <w:t xml:space="preserve">Biên bản kiểm tra hoàn trả xe (Return Inspection): </w:t>
+        <w:t xml:space="preserve">Chuyên gia &amp; Khách công tác ngắn ngày: </w:t>
       </w:r>
       <w:r>
-        <w:t>Checklist 6 hạng mục kiểm định nhanh: Thân vỏ dàn áo, Lốp xe, Đèn còi xi-nhan, Gương chiếu hậu, Nhiên liệu, Phụ kiện; Chụp ảnh vết trầy xước/hư hỏng mới phát sinh và nhập phí bồi thường (Damage Fee); Đánh giá chuyển xe về 'Sẵn sàng' hay 'Đưa vào bảo dưỡng'.</w:t>
+        <w:rPr>
+          <w:rFonts w:ascii="Segoe UI" w:hAnsi="Segoe UI"/>
+          <w:b w:val="0"/>
+          <w:i w:val="0"/>
+          <w:color w:val="334155"/>
+          <w:sz w:val="21"/>
+        </w:rPr>
+        <w:t>Cần thuê ô tô tự lái theo giờ hoặc theo ngày để đi gặp đối tác, di chuyển từ sân bay về khách sạn với hóa đơn, hợp đồng chuẩn A4.</w:t>
       </w:r>
     </w:p>
     <w:p>
       <w:pPr>
         <w:pStyle w:val="ListBullet"/>
-        <w:spacing w:after="60"/>
+        <w:spacing w:before="40" w:after="60" w:line="276" w:lineRule="auto"/>
       </w:pPr>
       <w:r>
         <w:rPr>
+          <w:rFonts w:ascii="Segoe UI" w:hAnsi="Segoe UI"/>
           <w:b/>
+          <w:i w:val="0"/>
+          <w:color w:val="0F172A"/>
+          <w:sz w:val="21"/>
         </w:rPr>
-        <w:t xml:space="preserve">In hợp đồng chuẩn pháp lý A4: </w:t>
+        <w:t xml:space="preserve">Người dân địa phương: </w:t>
       </w:r>
       <w:r>
-        <w:t>Tích hợp sẵn mẫu in hợp đồng thuê xe đầy đủ Quốc hiệu, Tiêu ngữ, điều khoản bảo vệ tài sản và chữ ký xác nhận của hai bên.</w:t>
+        <w:rPr>
+          <w:rFonts w:ascii="Segoe UI" w:hAnsi="Segoe UI"/>
+          <w:b w:val="0"/>
+          <w:i w:val="0"/>
+          <w:color w:val="334155"/>
+          <w:sz w:val="21"/>
+        </w:rPr>
+        <w:t>Thuê xe tự lái phục vụ nhu cầu đi lại dịp lễ Tết, cưới hỏi, về quê hoặc khi phương tiện cá nhân đang trong xưởng bảo dưỡng.</w:t>
       </w:r>
     </w:p>
     <w:p>
       <w:pPr>
-        <w:spacing w:before="200" w:after="80"/>
+        <w:keepNext/>
+        <w:spacing w:before="320" w:after="120"/>
+        <w:pBdr>
+          <w:bottom w:val="single" w:sz="12" w:space="4" w:color="0D9488"/>
+        </w:pBdr>
       </w:pPr>
       <w:r>
         <w:rPr>
-          <w:rFonts w:ascii="Arial" w:hAnsi="Arial"/>
+          <w:rFonts w:ascii="Segoe UI" w:hAnsi="Segoe UI"/>
           <w:b/>
-          <w:color w:val="2563EB"/>
-          <w:sz w:val="24"/>
+          <w:i w:val="0"/>
+          <w:color w:val="0F172A"/>
+          <w:sz w:val="28"/>
         </w:rPr>
-        <w:t>3.3. Tính tiền tự động &amp; Quyết toán phân định tiền cọc</w:t>
+        <w:t>4. Mục tiêu của dự án là gì?</w:t>
       </w:r>
     </w:p>
     <w:p>
+      <w:pPr>
+        <w:spacing w:after="120" w:line="276" w:lineRule="auto"/>
+      </w:pPr>
       <w:r>
-        <w:t>Loại bỏ hoàn toàn sai sót khi tính tiền thủ công bằng công thức toán học chuẩn xác, công bằng và minh bạch. Tệp mã nguồn tương ứng: src/views/SettlementModal.tsx, src/utils/formatters.ts.</w:t>
+        <w:rPr>
+          <w:rFonts w:ascii="Segoe UI" w:hAnsi="Segoe UI"/>
+          <w:b w:val="0"/>
+          <w:i w:val="0"/>
+          <w:color w:val="334155"/>
+          <w:sz w:val="21"/>
+        </w:rPr>
+        <w:t>Dự án DriveRent được triển khai nhằm đạt được 5 mục tiêu chiến lược sau:</w:t>
       </w:r>
     </w:p>
     <w:p>
       <w:pPr>
         <w:pStyle w:val="ListBullet"/>
-        <w:spacing w:after="60"/>
+        <w:spacing w:before="40" w:after="60" w:line="276" w:lineRule="auto"/>
       </w:pPr>
       <w:r>
         <w:rPr>
+          <w:rFonts w:ascii="Segoe UI" w:hAnsi="Segoe UI"/>
           <w:b/>
+          <w:i w:val="0"/>
+          <w:color w:val="0F172A"/>
+          <w:sz w:val="21"/>
         </w:rPr>
-        <w:t xml:space="preserve">Thuật toán tính giờ/ngày thực tế: </w:t>
+        <w:t xml:space="preserve">1. Số hóa 100% quy trình vận hành: </w:t>
       </w:r>
       <w:r>
-        <w:t>Thuê theo giờ: Làm tròn lên theo giờ nguyên (ceil to full hour, tối thiểu 1 giờ); Thuê theo ngày: Tính theo chu kỳ 24 giờ bắt đầu từ thời điểm bàn giao thực tế (Handover actual time). Không tự ý chuyển đổi làm sai lệch đơn giá đã ký kết ban đầu.</w:t>
+        <w:rPr>
+          <w:rFonts w:ascii="Segoe UI" w:hAnsi="Segoe UI"/>
+          <w:b w:val="0"/>
+          <w:i w:val="0"/>
+          <w:color w:val="334155"/>
+          <w:sz w:val="21"/>
+        </w:rPr>
+        <w:t>Thay thế hoàn toàn sổ ghi tay, file Excel rời rạc hoặc tin nhắn Zalo dễ trôi bằng hệ thống dữ liệu số tập trung.</w:t>
       </w:r>
     </w:p>
     <w:p>
       <w:pPr>
         <w:pStyle w:val="ListBullet"/>
-        <w:spacing w:after="60"/>
+        <w:spacing w:before="40" w:after="60" w:line="276" w:lineRule="auto"/>
       </w:pPr>
       <w:r>
         <w:rPr>
+          <w:rFonts w:ascii="Segoe UI" w:hAnsi="Segoe UI"/>
           <w:b/>
+          <w:i w:val="0"/>
+          <w:color w:val="0F172A"/>
+          <w:sz w:val="21"/>
         </w:rPr>
-        <w:t xml:space="preserve">Công thức thanh lý cước dịch vụ: </w:t>
+        <w:t xml:space="preserve">2. Rút ngắn thời gian xử lý thủ tục: </w:t>
       </w:r>
       <w:r>
-        <w:t>Tổng cước = (Đơn vị tính thực tế x Đơn giá) + Phụ phí thỏa thuận + Phí bồi thường hư hỏng - Giảm giá.</w:t>
+        <w:rPr>
+          <w:rFonts w:ascii="Segoe UI" w:hAnsi="Segoe UI"/>
+          <w:b w:val="0"/>
+          <w:i w:val="0"/>
+          <w:color w:val="334155"/>
+          <w:sz w:val="21"/>
+        </w:rPr>
+        <w:t>Giảm thời gian làm hợp đồng và bàn giao xe từ 15–20 phút xuống còn dưới 2–3 phút/khách nhờ Wizard 4 bước và biên bản kiểm tra số hóa.</w:t>
       </w:r>
     </w:p>
     <w:p>
       <w:pPr>
         <w:pStyle w:val="ListBullet"/>
-        <w:spacing w:after="60"/>
+        <w:spacing w:before="40" w:after="60" w:line="276" w:lineRule="auto"/>
       </w:pPr>
       <w:r>
         <w:rPr>
+          <w:rFonts w:ascii="Segoe UI" w:hAnsi="Segoe UI"/>
           <w:b/>
+          <w:i w:val="0"/>
+          <w:color w:val="0F172A"/>
+          <w:sz w:val="21"/>
         </w:rPr>
-        <w:t xml:space="preserve">Cơ chế cách ly tiền cọc (Security Deposit Isolation): </w:t>
+        <w:t xml:space="preserve">3. Minh bạch tài chính &amp; Phân định tiền cọc: </w:t>
       </w:r>
       <w:r>
-        <w:t>Tiền cọc của khách được lưu trữ trong ngăn tài chính riêng biệt, không tính gộp vào doanh thu ban đầu. Khi quyết toán, nhân viên có thể lựa chọn: (1) Khấu trừ cọc vào tiền dịch vụ còn thiếu (tự động tính ra số tiền cần thu thêm hoặc cọc thừa hoàn trả); hoặc (2) Khách thanh toán riêng tiền dịch vụ và nhận lại nguyên vẹn 100% tiền cọc.</w:t>
+        <w:rPr>
+          <w:rFonts w:ascii="Segoe UI" w:hAnsi="Segoe UI"/>
+          <w:b w:val="0"/>
+          <w:i w:val="0"/>
+          <w:color w:val="334155"/>
+          <w:sz w:val="21"/>
+        </w:rPr>
+        <w:t>Cách ly hoàn toàn tiền đặt cọc (Security Deposit) khỏi doanh thu dịch vụ, tự động tính cước thuê thực tế và khấu trừ cọc minh bạch, chấm dứt tranh cãi lúc hoàn cọc.</w:t>
       </w:r>
     </w:p>
     <w:p>
       <w:pPr>
         <w:pStyle w:val="ListBullet"/>
-        <w:spacing w:after="60"/>
+        <w:spacing w:before="40" w:after="60" w:line="276" w:lineRule="auto"/>
       </w:pPr>
       <w:r>
         <w:rPr>
+          <w:rFonts w:ascii="Segoe UI" w:hAnsi="Segoe UI"/>
           <w:b/>
+          <w:i w:val="0"/>
+          <w:color w:val="0F172A"/>
+          <w:sz w:val="21"/>
         </w:rPr>
-        <w:t xml:space="preserve">Hỗ trợ đa phương thức thanh toán: </w:t>
+        <w:t xml:space="preserve">4. Bảo vệ tài sản &amp; Kéo dài tuổi thọ phương tiện: </w:t>
       </w:r>
       <w:r>
-        <w:t>Hỗ trợ tiền mặt, chuyển khoản quét mã VietQR và ví điện tử, tạo phiếu quyết toán thanh lý rõ ràng.</w:t>
-      </w:r>
-    </w:p>
-    <w:p>
-      <w:pPr>
-        <w:spacing w:before="200" w:after="80"/>
-      </w:pPr>
-      <w:r>
         <w:rPr>
-          <w:rFonts w:ascii="Arial" w:hAnsi="Arial"/>
-          <w:b/>
-          <w:color w:val="2563EB"/>
-          <w:sz w:val="24"/>
+          <w:rFonts w:ascii="Segoe UI" w:hAnsi="Segoe UI"/>
+          <w:b w:val="0"/>
+          <w:i w:val="0"/>
+          <w:color w:val="334155"/>
+          <w:sz w:val="21"/>
         </w:rPr>
-        <w:t>3.4. Quản lý lịch bảo trì &amp; Nhắc thay nhớt định kỳ từng xe</w:t>
-      </w:r>
-    </w:p>
-    <w:p>
-      <w:r>
-        <w:t>Đảm bảo an toàn kỹ thuật cho du khách và kéo dài tối đa tuổi thọ phương tiện thông qua hệ thống giám sát bảo dưỡng. Tệp mã nguồn tương ứng: src/views/MaintenanceView.tsx.</w:t>
+        <w:t>Số hóa lưu trữ ảnh CCCD/GPLX và ảnh hiện trạng xe lúc giao/nhận; tự động nhắc thay nhớt theo số Km ODO thực tế giúp kéo dài tuổi thọ động cơ và đảm bảo an toàn cho khách.</w:t>
       </w:r>
     </w:p>
     <w:p>
       <w:pPr>
         <w:pStyle w:val="ListBullet"/>
-        <w:spacing w:after="60"/>
+        <w:spacing w:before="40" w:after="60" w:line="276" w:lineRule="auto"/>
       </w:pPr>
       <w:r>
         <w:rPr>
+          <w:rFonts w:ascii="Segoe UI" w:hAnsi="Segoe UI"/>
           <w:b/>
+          <w:i w:val="0"/>
+          <w:color w:val="0F172A"/>
+          <w:sz w:val="21"/>
         </w:rPr>
-        <w:t xml:space="preserve">Phân loại các hạng mục kỹ thuật: </w:t>
+        <w:t xml:space="preserve">5. Đột phá trải nghiệm &amp; Định vị thương hiệu: </w:t>
       </w:r>
       <w:r>
-        <w:t>Thay dầu nhớt động cơ &amp; lọc nhớt định kỳ; Bảo dưỡng định kỳ cấp 5.000km, 10.000km, 20.000km; Thay lốp, má phanh, nhông xích; Sửa chữa sự cố đột xuất phát sinh sau khi thu hồi xe từ khách.</w:t>
+        <w:rPr>
+          <w:rFonts w:ascii="Segoe UI" w:hAnsi="Segoe UI"/>
+          <w:b w:val="0"/>
+          <w:i w:val="0"/>
+          <w:color w:val="334155"/>
+          <w:sz w:val="21"/>
+        </w:rPr>
+        <w:t>Cung cấp giao diện đặt xe phong cách Liquid Glass sang trọng, hiệu ứng 3D sống động, nâng cao tỷ lệ chuyển đổi khách đặt xe online.</w:t>
+      </w:r>
+    </w:p>
+    <w:p>
+      <w:pPr>
+        <w:keepNext/>
+        <w:spacing w:before="320" w:after="120"/>
+        <w:pBdr>
+          <w:bottom w:val="single" w:sz="12" w:space="4" w:color="0D9488"/>
+        </w:pBdr>
+      </w:pPr>
+      <w:r>
+        <w:rPr>
+          <w:rFonts w:ascii="Segoe UI" w:hAnsi="Segoe UI"/>
+          <w:b/>
+          <w:i w:val="0"/>
+          <w:color w:val="0F172A"/>
+          <w:sz w:val="28"/>
+        </w:rPr>
+        <w:t>5. Website cần giải quyết vấn đề gì?</w:t>
+      </w:r>
+    </w:p>
+    <w:p>
+      <w:pPr>
+        <w:spacing w:after="120" w:line="276" w:lineRule="auto"/>
+      </w:pPr>
+      <w:r>
+        <w:rPr>
+          <w:rFonts w:ascii="Segoe UI" w:hAnsi="Segoe UI"/>
+          <w:b w:val="0"/>
+          <w:i w:val="0"/>
+          <w:color w:val="334155"/>
+          <w:sz w:val="21"/>
+        </w:rPr>
+        <w:t>Website DriveRent được thiết kế để giải quyết triệt để 4 bài toán ("nỗi đau" thực tế lớn nhất) của các chủ nhà xe:</w:t>
+      </w:r>
+    </w:p>
+    <w:p>
+      <w:pPr>
+        <w:keepNext/>
+        <w:spacing w:before="200" w:after="80"/>
+      </w:pPr>
+      <w:r>
+        <w:rPr>
+          <w:rFonts w:ascii="Segoe UI" w:hAnsi="Segoe UI"/>
+          <w:b/>
+          <w:i w:val="0"/>
+          <w:color w:val="0D9488"/>
+          <w:sz w:val="23"/>
+        </w:rPr>
+        <w:t>5.1. Vấn đề 1: Mất kiểm soát trạng thái phương tiện theo thời gian thực</w:t>
       </w:r>
     </w:p>
     <w:p>
       <w:pPr>
         <w:pStyle w:val="ListBullet"/>
-        <w:spacing w:after="60"/>
+        <w:spacing w:before="40" w:after="60" w:line="276" w:lineRule="auto"/>
       </w:pPr>
       <w:r>
         <w:rPr>
+          <w:rFonts w:ascii="Segoe UI" w:hAnsi="Segoe UI"/>
           <w:b/>
+          <w:i w:val="0"/>
+          <w:color w:val="0F172A"/>
+          <w:sz w:val="21"/>
         </w:rPr>
-        <w:t xml:space="preserve">Cơ chế cảnh báo kép (Dual-trigger Alerts): </w:t>
+        <w:t xml:space="preserve">Thực trạng &amp; Hậu quả: </w:t>
       </w:r>
       <w:r>
-        <w:t>Cảnh báo theo số Km ODO: Tự động báo vàng khi sắp tới hạn và báo đỏ khi vượt quá ngưỡng (xe máy mỗi 3.000 km, ô tô mỗi 5.000 km); Cảnh báo theo mốc thời gian: Nhắc nhở khi vượt quá 90 ngày kể từ lần bảo dưỡng trước.</w:t>
+        <w:rPr>
+          <w:rFonts w:ascii="Segoe UI" w:hAnsi="Segoe UI"/>
+          <w:b w:val="0"/>
+          <w:i w:val="0"/>
+          <w:color w:val="334155"/>
+          <w:sz w:val="21"/>
+        </w:rPr>
+        <w:t>Quản lý bằng sổ hoặc trí nhớ khiến nhân viên không biết chính xác xe nào đang rảnh tại bãi, xe nào đang cho thuê, xe nào sắp trả hoặc đang bảo dưỡng. Dẫn đến trùng lịch cho thuê (Overbooking) hoặc từ chối khách dù bãi vẫn còn xe trống.</w:t>
       </w:r>
     </w:p>
     <w:p>
       <w:pPr>
         <w:pStyle w:val="ListBullet"/>
-        <w:spacing w:after="60"/>
+        <w:spacing w:before="40" w:after="60" w:line="276" w:lineRule="auto"/>
       </w:pPr>
       <w:r>
         <w:rPr>
+          <w:rFonts w:ascii="Segoe UI" w:hAnsi="Segoe UI"/>
           <w:b/>
+          <w:i w:val="0"/>
+          <w:color w:val="0F172A"/>
+          <w:sz w:val="21"/>
         </w:rPr>
-        <w:t xml:space="preserve">Quy trình khép kín vòng đời bảo dưỡng: </w:t>
+        <w:t xml:space="preserve">Giải pháp DriveRent: </w:t>
       </w:r>
       <w:r>
-        <w:t>Sắp đến hạn (Upcoming) -&gt; Đang thực hiện (In Progress) -&gt; Hoàn thành (Completed) / Quá hạn (Overdue). Sau khi hoàn thành, kỹ thuật viên nhập chi phí phụ tùng, hệ thống tự động thiết lập mốc Km và mốc ngày bảo dưỡng tiếp theo.</w:t>
+        <w:rPr>
+          <w:rFonts w:ascii="Segoe UI" w:hAnsi="Segoe UI"/>
+          <w:b w:val="0"/>
+          <w:i w:val="0"/>
+          <w:color w:val="334155"/>
+          <w:sz w:val="21"/>
+        </w:rPr>
+        <w:t>Sơ đồ trạng thái xe trực quan (Visual Fleet Board) với 3 màu nhận diện chuẩn (🟢 Sẵn sàng, 🔵 Đang thuê, 🟠 Đang bảo dưỡng) kèm bộ lọc kiểm tra xe trống theo ngày giờ nhận - trả tức thì.</w:t>
       </w:r>
     </w:p>
     <w:p>
       <w:pPr>
-        <w:spacing w:before="320" w:after="120"/>
+        <w:keepNext/>
+        <w:spacing w:before="200" w:after="80"/>
       </w:pPr>
       <w:r>
         <w:rPr>
-          <w:rFonts w:ascii="Arial" w:hAnsi="Arial"/>
+          <w:rFonts w:ascii="Segoe UI" w:hAnsi="Segoe UI"/>
           <w:b/>
-          <w:color w:val="1E3A8A"/>
-          <w:sz w:val="28"/>
+          <w:i w:val="0"/>
+          <w:color w:val="0D9488"/>
+          <w:sz w:val="23"/>
         </w:rPr>
-        <w:t>4. TÍNH NĂNG MỞ RỘNG: CỔNG ĐẶT XE TRỰC TUYẾN DÀNH CHO DU KHÁCH</w:t>
-      </w:r>
-    </w:p>
-    <w:p>
-      <w:r>
-        <w:t>Bên cạnh hệ thống quản trị nội bộ dành cho nhân viên, dự án được tích hợp sẵn phân hệ dành riêng cho du khách tại src/views/customer/, mang lại trải nghiệm chuyên nghiệp tương tự các nền tảng thuê xe hiện đại:</w:t>
+        <w:t>5.2. Vấn đề 2: Tranh chấp hư hỏng trầy xước &amp; Thất lạc giấy tờ tùy thân</w:t>
       </w:r>
     </w:p>
     <w:p>
       <w:pPr>
         <w:pStyle w:val="ListBullet"/>
-        <w:spacing w:after="60"/>
+        <w:spacing w:before="40" w:after="60" w:line="276" w:lineRule="auto"/>
       </w:pPr>
       <w:r>
         <w:rPr>
+          <w:rFonts w:ascii="Segoe UI" w:hAnsi="Segoe UI"/>
           <w:b/>
+          <w:i w:val="0"/>
+          <w:color w:val="0F172A"/>
+          <w:sz w:val="21"/>
         </w:rPr>
-        <w:t xml:space="preserve">Catalogue phương tiện trực quan: </w:t>
+        <w:t xml:space="preserve">Thực trạng &amp; Hậu quả: </w:t>
       </w:r>
       <w:r>
-        <w:t>Khách hàng dễ dàng tìm kiếm xe theo loại, xem ảnh nội ngoại thất, hộp số, số chỗ ngồi, thông số kỹ thuật và giá thuê công khai.</w:t>
+        <w:rPr>
+          <w:rFonts w:ascii="Segoe UI" w:hAnsi="Segoe UI"/>
+          <w:b w:val="0"/>
+          <w:i w:val="0"/>
+          <w:color w:val="334155"/>
+          <w:sz w:val="21"/>
+        </w:rPr>
+        <w:t>Lúc giao xe không ghi nhận kỹ vết trầy xước cũ; lúc khách trả xe phát sinh va quẹt mới thì hai bên cãi vã vì thiếu bằng chứng đối chiếu. Giữ CCCD/GPLX gốc dễ thất lạc, khi có phạt nguội vi phạm giao thông không tra cứu lại được người lái.</w:t>
       </w:r>
     </w:p>
     <w:p>
       <w:pPr>
         <w:pStyle w:val="ListBullet"/>
-        <w:spacing w:after="60"/>
+        <w:spacing w:before="40" w:after="60" w:line="276" w:lineRule="auto"/>
       </w:pPr>
       <w:r>
         <w:rPr>
+          <w:rFonts w:ascii="Segoe UI" w:hAnsi="Segoe UI"/>
           <w:b/>
+          <w:i w:val="0"/>
+          <w:color w:val="0F172A"/>
+          <w:sz w:val="21"/>
         </w:rPr>
-        <w:t xml:space="preserve">Đặt cọc giữ chỗ 10 phút (10-minute Lock Reservation): </w:t>
+        <w:t xml:space="preserve">Giải pháp DriveRent: </w:t>
       </w:r>
       <w:r>
-        <w:t>Khi khách bấm đặt xe, hệ thống khóa giữ chỗ xe trong 10 phút kèm đồng hồ đếm ngược thời gian thực. Khách quét mã VietQR chuyển khoản 20% tiền giữ chỗ để xác nhận đơn.</w:t>
+        <w:rPr>
+          <w:rFonts w:ascii="Segoe UI" w:hAnsi="Segoe UI"/>
+          <w:b w:val="0"/>
+          <w:i w:val="0"/>
+          <w:color w:val="334155"/>
+          <w:sz w:val="21"/>
+        </w:rPr>
+        <w:t>Biên bản bàn giao &amp; thu hồi xe số hóa với checklist 6 hạng mục kiểm tra, lưu trữ ảnh chụp 4 góc xe, ghi nhận số ODO, vạch xăng (1–8/8) và lưu ảnh chụp CCCD/GPLX gốc gắn liền với từng mã hợp đồng.</w:t>
+      </w:r>
+    </w:p>
+    <w:p>
+      <w:pPr>
+        <w:keepNext/>
+        <w:spacing w:before="200" w:after="80"/>
+      </w:pPr>
+      <w:r>
+        <w:rPr>
+          <w:rFonts w:ascii="Segoe UI" w:hAnsi="Segoe UI"/>
+          <w:b/>
+          <w:i w:val="0"/>
+          <w:color w:val="0D9488"/>
+          <w:sz w:val="23"/>
+        </w:rPr>
+        <w:t>5.3. Vấn đề 3: Tính toán chi phí thủ công &amp; Nhập nhằng tiền cọc</w:t>
       </w:r>
     </w:p>
     <w:p>
       <w:pPr>
         <w:pStyle w:val="ListBullet"/>
-        <w:spacing w:after="60"/>
+        <w:spacing w:before="40" w:after="60" w:line="276" w:lineRule="auto"/>
       </w:pPr>
       <w:r>
         <w:rPr>
+          <w:rFonts w:ascii="Segoe UI" w:hAnsi="Segoe UI"/>
           <w:b/>
+          <w:i w:val="0"/>
+          <w:color w:val="0F172A"/>
+          <w:sz w:val="21"/>
         </w:rPr>
-        <w:t xml:space="preserve">Tra cứu lịch hẹn và mã đơn thuê: </w:t>
+        <w:t xml:space="preserve">Thực trạng &amp; Hậu quả: </w:t>
       </w:r>
       <w:r>
-        <w:t>Du khách có thể tự tra cứu thông tin đặt xe của mình bằng số điện thoại để xem trạng thái đơn, hướng dẫn nhận xe và hotline hỗ trợ cứu hộ 24/7.</w:t>
-      </w:r>
-    </w:p>
-    <w:p>
-      <w:pPr>
-        <w:spacing w:before="320" w:after="120"/>
-      </w:pPr>
-      <w:r>
         <w:rPr>
-          <w:rFonts w:ascii="Arial" w:hAnsi="Arial"/>
-          <w:b/>
-          <w:color w:val="1E3A8A"/>
-          <w:sz w:val="28"/>
+          <w:rFonts w:ascii="Segoe UI" w:hAnsi="Segoe UI"/>
+          <w:b w:val="0"/>
+          <w:i w:val="0"/>
+          <w:color w:val="334155"/>
+          <w:sz w:val="21"/>
         </w:rPr>
-        <w:t>5. MÔ HÌNH DỮ LIỆU VÀ CẤU TRÚC KỸ THUẬT</w:t>
-      </w:r>
-    </w:p>
-    <w:p>
-      <w:r>
-        <w:t>Toàn bộ mô hình thực thể nghiệp vụ được định nghĩa chặt chẽ bằng TypeScript tại src/types/index.ts, đảm bảo tính toàn vẹn dữ liệu và dễ dàng mở rộng sang hệ quản trị CSDL quan hệ (PostgreSQL / Supabase):</w:t>
-      </w:r>
-    </w:p>
-    <w:tbl>
-      <w:tblPr>
-        <w:tblW w:type="auto" w:w="0"/>
-        <w:jc w:val="center"/>
-        <w:tblLayout w:type="fixed"/>
-        <w:tblLook w:firstColumn="1" w:firstRow="1" w:lastColumn="0" w:lastRow="0" w:noHBand="0" w:noVBand="1" w:val="04A0"/>
-      </w:tblPr>
-      <w:tblGrid>
-        <w:gridCol w:w="3120"/>
-        <w:gridCol w:w="3120"/>
-        <w:gridCol w:w="3120"/>
-      </w:tblGrid>
-      <w:tr>
-        <w:tc>
-          <w:tcPr>
-            <w:tcW w:type="dxa" w:w="2592"/>
-            <w:shd w:fill="1E40AF"/>
-            <w:tcMar>
-              <w:top w:w="80" w:type="dxa"/>
-              <w:bottom w:w="80" w:type="dxa"/>
-              <w:left w:w="100" w:type="dxa"/>
-              <w:right w:w="100" w:type="dxa"/>
-            </w:tcMar>
-          </w:tcPr>
-          <w:p>
-            <w:pPr>
-              <w:spacing w:after="0"/>
-            </w:pPr>
-            <w:r>
-              <w:rPr>
-                <w:rFonts w:ascii="Arial" w:hAnsi="Arial"/>
-                <w:b/>
-                <w:color w:val="FFFFFF"/>
-                <w:sz w:val="19"/>
-              </w:rPr>
-              <w:t>Thực thể (Entity)</w:t>
-            </w:r>
-          </w:p>
-        </w:tc>
-        <w:tc>
-          <w:tcPr>
-            <w:tcW w:type="dxa" w:w="3168"/>
-            <w:shd w:fill="1E40AF"/>
-            <w:tcMar>
-              <w:top w:w="80" w:type="dxa"/>
-              <w:bottom w:w="80" w:type="dxa"/>
-              <w:left w:w="100" w:type="dxa"/>
-              <w:right w:w="100" w:type="dxa"/>
-            </w:tcMar>
-          </w:tcPr>
-          <w:p>
-            <w:pPr>
-              <w:spacing w:after="0"/>
-            </w:pPr>
-            <w:r>
-              <w:rPr>
-                <w:rFonts w:ascii="Arial" w:hAnsi="Arial"/>
-                <w:b/>
-                <w:color w:val="FFFFFF"/>
-                <w:sz w:val="19"/>
-              </w:rPr>
-              <w:t>Các trường dữ liệu then chốt</w:t>
-            </w:r>
-          </w:p>
-        </w:tc>
-        <w:tc>
-          <w:tcPr>
-            <w:tcW w:type="dxa" w:w="3600"/>
-            <w:shd w:fill="1E40AF"/>
-            <w:tcMar>
-              <w:top w:w="80" w:type="dxa"/>
-              <w:bottom w:w="80" w:type="dxa"/>
-              <w:left w:w="100" w:type="dxa"/>
-              <w:right w:w="100" w:type="dxa"/>
-            </w:tcMar>
-          </w:tcPr>
-          <w:p>
-            <w:pPr>
-              <w:spacing w:after="0"/>
-            </w:pPr>
-            <w:r>
-              <w:rPr>
-                <w:rFonts w:ascii="Arial" w:hAnsi="Arial"/>
-                <w:b/>
-                <w:color w:val="FFFFFF"/>
-                <w:sz w:val="19"/>
-              </w:rPr>
-              <w:t>Ý nghĩa nghiệp vụ</w:t>
-            </w:r>
-          </w:p>
-        </w:tc>
-      </w:tr>
-      <w:tr>
-        <w:tc>
-          <w:tcPr>
-            <w:tcW w:type="dxa" w:w="2592"/>
-            <w:shd w:fill="F8FAFC"/>
-            <w:tcMar>
-              <w:top w:w="60" w:type="dxa"/>
-              <w:bottom w:w="60" w:type="dxa"/>
-              <w:left w:w="100" w:type="dxa"/>
-              <w:right w:w="100" w:type="dxa"/>
-            </w:tcMar>
-          </w:tcPr>
-          <w:p>
-            <w:pPr>
-              <w:spacing w:after="0"/>
-            </w:pPr>
-            <w:r>
-              <w:rPr>
-                <w:rFonts w:ascii="Arial" w:hAnsi="Arial"/>
-                <w:b/>
-                <w:color w:val="1E3A8A"/>
-                <w:sz w:val="17"/>
-              </w:rPr>
-              <w:t>Vehicle</w:t>
-            </w:r>
-          </w:p>
-        </w:tc>
-        <w:tc>
-          <w:tcPr>
-            <w:tcW w:type="dxa" w:w="3168"/>
-            <w:shd w:fill="F8FAFC"/>
-            <w:tcMar>
-              <w:top w:w="60" w:type="dxa"/>
-              <w:bottom w:w="60" w:type="dxa"/>
-              <w:left w:w="100" w:type="dxa"/>
-              <w:right w:w="100" w:type="dxa"/>
-            </w:tcMar>
-          </w:tcPr>
-          <w:p>
-            <w:pPr>
-              <w:spacing w:after="0"/>
-            </w:pPr>
-            <w:r>
-              <w:rPr>
-                <w:rFonts w:ascii="Arial" w:hAnsi="Arial"/>
-                <w:sz w:val="17"/>
-              </w:rPr>
-              <w:t>id, name, plateNumber, type, status, hourlyPrice, dailyPrice, currentOdometer, fuelLevel, image, lastMaintenanceKm, nextMaintenanceKm</w:t>
-            </w:r>
-          </w:p>
-        </w:tc>
-        <w:tc>
-          <w:tcPr>
-            <w:tcW w:type="dxa" w:w="3600"/>
-            <w:shd w:fill="F8FAFC"/>
-            <w:tcMar>
-              <w:top w:w="60" w:type="dxa"/>
-              <w:bottom w:w="60" w:type="dxa"/>
-              <w:left w:w="100" w:type="dxa"/>
-              <w:right w:w="100" w:type="dxa"/>
-            </w:tcMar>
-          </w:tcPr>
-          <w:p>
-            <w:pPr>
-              <w:spacing w:after="0"/>
-            </w:pPr>
-            <w:r>
-              <w:rPr>
-                <w:rFonts w:ascii="Arial" w:hAnsi="Arial"/>
-                <w:sz w:val="17"/>
-              </w:rPr>
-              <w:t>Lưu trữ thông tin phương tiện, đồng hồ xăng ODO và mốc bảo dưỡng.</w:t>
-            </w:r>
-          </w:p>
-        </w:tc>
-      </w:tr>
-      <w:tr>
-        <w:tc>
-          <w:tcPr>
-            <w:tcW w:type="dxa" w:w="2592"/>
-            <w:shd w:fill="FFFFFF"/>
-            <w:tcMar>
-              <w:top w:w="60" w:type="dxa"/>
-              <w:bottom w:w="60" w:type="dxa"/>
-              <w:left w:w="100" w:type="dxa"/>
-              <w:right w:w="100" w:type="dxa"/>
-            </w:tcMar>
-          </w:tcPr>
-          <w:p>
-            <w:pPr>
-              <w:spacing w:after="0"/>
-            </w:pPr>
-            <w:r>
-              <w:rPr>
-                <w:rFonts w:ascii="Arial" w:hAnsi="Arial"/>
-                <w:b/>
-                <w:color w:val="1E3A8A"/>
-                <w:sz w:val="17"/>
-              </w:rPr>
-              <w:t>Customer</w:t>
-            </w:r>
-          </w:p>
-        </w:tc>
-        <w:tc>
-          <w:tcPr>
-            <w:tcW w:type="dxa" w:w="3168"/>
-            <w:shd w:fill="FFFFFF"/>
-            <w:tcMar>
-              <w:top w:w="60" w:type="dxa"/>
-              <w:bottom w:w="60" w:type="dxa"/>
-              <w:left w:w="100" w:type="dxa"/>
-              <w:right w:w="100" w:type="dxa"/>
-            </w:tcMar>
-          </w:tcPr>
-          <w:p>
-            <w:pPr>
-              <w:spacing w:after="0"/>
-            </w:pPr>
-            <w:r>
-              <w:rPr>
-                <w:rFonts w:ascii="Arial" w:hAnsi="Arial"/>
-                <w:sz w:val="17"/>
-              </w:rPr>
-              <w:t>id, fullName, phone, identityNumber (CCCD), driverLicense (GPLX), rentalCount, rating, idCardFrontImage, driverLicenseImage</w:t>
-            </w:r>
-          </w:p>
-        </w:tc>
-        <w:tc>
-          <w:tcPr>
-            <w:tcW w:type="dxa" w:w="3600"/>
-            <w:shd w:fill="FFFFFF"/>
-            <w:tcMar>
-              <w:top w:w="60" w:type="dxa"/>
-              <w:bottom w:w="60" w:type="dxa"/>
-              <w:left w:w="100" w:type="dxa"/>
-              <w:right w:w="100" w:type="dxa"/>
-            </w:tcMar>
-          </w:tcPr>
-          <w:p>
-            <w:pPr>
-              <w:spacing w:after="0"/>
-            </w:pPr>
-            <w:r>
-              <w:rPr>
-                <w:rFonts w:ascii="Arial" w:hAnsi="Arial"/>
-                <w:sz w:val="17"/>
-              </w:rPr>
-              <w:t>Hồ sơ khách thuê xe kèm liên kết ảnh chụp CCCD &amp; GPLX gốc.</w:t>
-            </w:r>
-          </w:p>
-        </w:tc>
-      </w:tr>
-      <w:tr>
-        <w:tc>
-          <w:tcPr>
-            <w:tcW w:type="dxa" w:w="2592"/>
-            <w:shd w:fill="F8FAFC"/>
-            <w:tcMar>
-              <w:top w:w="60" w:type="dxa"/>
-              <w:bottom w:w="60" w:type="dxa"/>
-              <w:left w:w="100" w:type="dxa"/>
-              <w:right w:w="100" w:type="dxa"/>
-            </w:tcMar>
-          </w:tcPr>
-          <w:p>
-            <w:pPr>
-              <w:spacing w:after="0"/>
-            </w:pPr>
-            <w:r>
-              <w:rPr>
-                <w:rFonts w:ascii="Arial" w:hAnsi="Arial"/>
-                <w:b/>
-                <w:color w:val="1E3A8A"/>
-                <w:sz w:val="17"/>
-              </w:rPr>
-              <w:t>RentalContract</w:t>
-            </w:r>
-          </w:p>
-        </w:tc>
-        <w:tc>
-          <w:tcPr>
-            <w:tcW w:type="dxa" w:w="3168"/>
-            <w:shd w:fill="F8FAFC"/>
-            <w:tcMar>
-              <w:top w:w="60" w:type="dxa"/>
-              <w:bottom w:w="60" w:type="dxa"/>
-              <w:left w:w="100" w:type="dxa"/>
-              <w:right w:w="100" w:type="dxa"/>
-            </w:tcMar>
-          </w:tcPr>
-          <w:p>
-            <w:pPr>
-              <w:spacing w:after="0"/>
-            </w:pPr>
-            <w:r>
-              <w:rPr>
-                <w:rFonts w:ascii="Arial" w:hAnsi="Arial"/>
-                <w:sz w:val="17"/>
-              </w:rPr>
-              <w:t>id, vehicleId, customerId, pricingType, status, startDate, endDate, rate, units, deposit, handoverRecord, returnRecord, finalSettlement</w:t>
-            </w:r>
-          </w:p>
-        </w:tc>
-        <w:tc>
-          <w:tcPr>
-            <w:tcW w:type="dxa" w:w="3600"/>
-            <w:shd w:fill="F8FAFC"/>
-            <w:tcMar>
-              <w:top w:w="60" w:type="dxa"/>
-              <w:bottom w:w="60" w:type="dxa"/>
-              <w:left w:w="100" w:type="dxa"/>
-              <w:right w:w="100" w:type="dxa"/>
-            </w:tcMar>
-          </w:tcPr>
-          <w:p>
-            <w:pPr>
-              <w:spacing w:after="0"/>
-            </w:pPr>
-            <w:r>
-              <w:rPr>
-                <w:rFonts w:ascii="Arial" w:hAnsi="Arial"/>
-                <w:sz w:val="17"/>
-              </w:rPr>
-              <w:t>Hợp đồng trung tâm gắn kết khách hàng, phương tiện, biên bản giao nhận và quyết toán.</w:t>
-            </w:r>
-          </w:p>
-        </w:tc>
-      </w:tr>
-      <w:tr>
-        <w:tc>
-          <w:tcPr>
-            <w:tcW w:type="dxa" w:w="2592"/>
-            <w:shd w:fill="FFFFFF"/>
-            <w:tcMar>
-              <w:top w:w="60" w:type="dxa"/>
-              <w:bottom w:w="60" w:type="dxa"/>
-              <w:left w:w="100" w:type="dxa"/>
-              <w:right w:w="100" w:type="dxa"/>
-            </w:tcMar>
-          </w:tcPr>
-          <w:p>
-            <w:pPr>
-              <w:spacing w:after="0"/>
-            </w:pPr>
-            <w:r>
-              <w:rPr>
-                <w:rFonts w:ascii="Arial" w:hAnsi="Arial"/>
-                <w:b/>
-                <w:color w:val="1E3A8A"/>
-                <w:sz w:val="17"/>
-              </w:rPr>
-              <w:t>MaintenanceTask</w:t>
-            </w:r>
-          </w:p>
-        </w:tc>
-        <w:tc>
-          <w:tcPr>
-            <w:tcW w:type="dxa" w:w="3168"/>
-            <w:shd w:fill="FFFFFF"/>
-            <w:tcMar>
-              <w:top w:w="60" w:type="dxa"/>
-              <w:bottom w:w="60" w:type="dxa"/>
-              <w:left w:w="100" w:type="dxa"/>
-              <w:right w:w="100" w:type="dxa"/>
-            </w:tcMar>
-          </w:tcPr>
-          <w:p>
-            <w:pPr>
-              <w:spacing w:after="0"/>
-            </w:pPr>
-            <w:r>
-              <w:rPr>
-                <w:rFonts w:ascii="Arial" w:hAnsi="Arial"/>
-                <w:sz w:val="17"/>
-              </w:rPr>
-              <w:t>id, vehicleId, title, type, status, dueDate, dueKm, cost, assignedTo, result, nextTargetKm, nextTargetDate</w:t>
-            </w:r>
-          </w:p>
-        </w:tc>
-        <w:tc>
-          <w:tcPr>
-            <w:tcW w:type="dxa" w:w="3600"/>
-            <w:shd w:fill="FFFFFF"/>
-            <w:tcMar>
-              <w:top w:w="60" w:type="dxa"/>
-              <w:bottom w:w="60" w:type="dxa"/>
-              <w:left w:w="100" w:type="dxa"/>
-              <w:right w:w="100" w:type="dxa"/>
-            </w:tcMar>
-          </w:tcPr>
-          <w:p>
-            <w:pPr>
-              <w:spacing w:after="0"/>
-            </w:pPr>
-            <w:r>
-              <w:rPr>
-                <w:rFonts w:ascii="Arial" w:hAnsi="Arial"/>
-                <w:sz w:val="17"/>
-              </w:rPr>
-              <w:t>Nhiệm vụ bảo dưỡng, thay dầu nhớt và chu kỳ km tiếp theo.</w:t>
-            </w:r>
-          </w:p>
-        </w:tc>
-      </w:tr>
-    </w:tbl>
-    <w:p>
-      <w:pPr>
-        <w:spacing w:after="240"/>
-      </w:pPr>
-    </w:p>
-    <w:p>
-      <w:pPr>
-        <w:spacing w:before="320" w:after="120"/>
-      </w:pPr>
-      <w:r>
-        <w:rPr>
-          <w:rFonts w:ascii="Arial" w:hAnsi="Arial"/>
-          <w:b/>
-          <w:color w:val="1E3A8A"/>
-          <w:sz w:val="28"/>
-        </w:rPr>
-        <w:t>6. DANH MỤC PHƯƠNG TIỆN MẪU TRONG DỰ ÁN</w:t>
-      </w:r>
-    </w:p>
-    <w:p>
-      <w:r>
-        <w:t>Trong thư mục src/assets/images/ của repository đã tích hợp sẵn hình ảnh chất lượng cao của các dòng xe cho thuê phổ biến nhất tại các điểm du lịch:</w:t>
-      </w:r>
-    </w:p>
-    <w:tbl>
-      <w:tblPr>
-        <w:tblW w:type="auto" w:w="0"/>
-        <w:jc w:val="center"/>
-        <w:tblLayout w:type="fixed"/>
-        <w:tblLook w:firstColumn="1" w:firstRow="1" w:lastColumn="0" w:lastRow="0" w:noHBand="0" w:noVBand="1" w:val="04A0"/>
-      </w:tblPr>
-      <w:tblGrid>
-        <w:gridCol w:w="2340"/>
-        <w:gridCol w:w="2340"/>
-        <w:gridCol w:w="2340"/>
-        <w:gridCol w:w="2340"/>
-      </w:tblGrid>
-      <w:tr>
-        <w:tc>
-          <w:tcPr>
-            <w:tcW w:type="dxa" w:w="2592"/>
-            <w:shd w:fill="1E40AF"/>
-            <w:tcMar>
-              <w:top w:w="80" w:type="dxa"/>
-              <w:bottom w:w="80" w:type="dxa"/>
-              <w:left w:w="100" w:type="dxa"/>
-              <w:right w:w="100" w:type="dxa"/>
-            </w:tcMar>
-          </w:tcPr>
-          <w:p>
-            <w:pPr>
-              <w:spacing w:after="0"/>
-            </w:pPr>
-            <w:r>
-              <w:rPr>
-                <w:rFonts w:ascii="Arial" w:hAnsi="Arial"/>
-                <w:b/>
-                <w:color w:val="FFFFFF"/>
-                <w:sz w:val="19"/>
-              </w:rPr>
-              <w:t>Tên xe &amp; Phân loại</w:t>
-            </w:r>
-          </w:p>
-        </w:tc>
-        <w:tc>
-          <w:tcPr>
-            <w:tcW w:type="dxa" w:w="1872"/>
-            <w:shd w:fill="1E40AF"/>
-            <w:tcMar>
-              <w:top w:w="80" w:type="dxa"/>
-              <w:bottom w:w="80" w:type="dxa"/>
-              <w:left w:w="100" w:type="dxa"/>
-              <w:right w:w="100" w:type="dxa"/>
-            </w:tcMar>
-          </w:tcPr>
-          <w:p>
-            <w:pPr>
-              <w:spacing w:after="0"/>
-            </w:pPr>
-            <w:r>
-              <w:rPr>
-                <w:rFonts w:ascii="Arial" w:hAnsi="Arial"/>
-                <w:b/>
-                <w:color w:val="FFFFFF"/>
-                <w:sz w:val="19"/>
-              </w:rPr>
-              <w:t>Biển số</w:t>
-            </w:r>
-          </w:p>
-        </w:tc>
-        <w:tc>
-          <w:tcPr>
-            <w:tcW w:type="dxa" w:w="2304"/>
-            <w:shd w:fill="1E40AF"/>
-            <w:tcMar>
-              <w:top w:w="80" w:type="dxa"/>
-              <w:bottom w:w="80" w:type="dxa"/>
-              <w:left w:w="100" w:type="dxa"/>
-              <w:right w:w="100" w:type="dxa"/>
-            </w:tcMar>
-          </w:tcPr>
-          <w:p>
-            <w:pPr>
-              <w:spacing w:after="0"/>
-            </w:pPr>
-            <w:r>
-              <w:rPr>
-                <w:rFonts w:ascii="Arial" w:hAnsi="Arial"/>
-                <w:b/>
-                <w:color w:val="FFFFFF"/>
-                <w:sz w:val="19"/>
-              </w:rPr>
-              <w:t>Giá niêm yết</w:t>
-            </w:r>
-          </w:p>
-        </w:tc>
-        <w:tc>
-          <w:tcPr>
-            <w:tcW w:type="dxa" w:w="2592"/>
-            <w:shd w:fill="1E40AF"/>
-            <w:tcMar>
-              <w:top w:w="80" w:type="dxa"/>
-              <w:bottom w:w="80" w:type="dxa"/>
-              <w:left w:w="100" w:type="dxa"/>
-              <w:right w:w="100" w:type="dxa"/>
-            </w:tcMar>
-          </w:tcPr>
-          <w:p>
-            <w:pPr>
-              <w:spacing w:after="0"/>
-            </w:pPr>
-            <w:r>
-              <w:rPr>
-                <w:rFonts w:ascii="Arial" w:hAnsi="Arial"/>
-                <w:b/>
-                <w:color w:val="FFFFFF"/>
-                <w:sz w:val="19"/>
-              </w:rPr>
-              <w:t>Đặc điểm nổi bật</w:t>
-            </w:r>
-          </w:p>
-        </w:tc>
-      </w:tr>
-      <w:tr>
-        <w:tc>
-          <w:tcPr>
-            <w:tcW w:type="dxa" w:w="2592"/>
-            <w:shd w:fill="F8FAFC"/>
-            <w:tcMar>
-              <w:top w:w="60" w:type="dxa"/>
-              <w:bottom w:w="60" w:type="dxa"/>
-              <w:left w:w="100" w:type="dxa"/>
-              <w:right w:w="100" w:type="dxa"/>
-            </w:tcMar>
-          </w:tcPr>
-          <w:p>
-            <w:pPr>
-              <w:spacing w:after="0"/>
-            </w:pPr>
-            <w:r>
-              <w:rPr>
-                <w:rFonts w:ascii="Arial" w:hAnsi="Arial"/>
-                <w:b/>
-                <w:sz w:val="17"/>
-              </w:rPr>
-              <w:t>Toyota Vios 1.5G (Sedan 5 chỗ)</w:t>
-            </w:r>
-          </w:p>
-        </w:tc>
-        <w:tc>
-          <w:tcPr>
-            <w:tcW w:type="dxa" w:w="1872"/>
-            <w:shd w:fill="F8FAFC"/>
-            <w:tcMar>
-              <w:top w:w="60" w:type="dxa"/>
-              <w:bottom w:w="60" w:type="dxa"/>
-              <w:left w:w="100" w:type="dxa"/>
-              <w:right w:w="100" w:type="dxa"/>
-            </w:tcMar>
-          </w:tcPr>
-          <w:p>
-            <w:pPr>
-              <w:spacing w:after="0"/>
-            </w:pPr>
-            <w:r>
-              <w:rPr>
-                <w:rFonts w:ascii="Arial" w:hAnsi="Arial"/>
-                <w:b/>
-                <w:color w:val="2563EB"/>
-                <w:sz w:val="17"/>
-              </w:rPr>
-              <w:t>43A-582.19</w:t>
-            </w:r>
-          </w:p>
-        </w:tc>
-        <w:tc>
-          <w:tcPr>
-            <w:tcW w:type="dxa" w:w="2304"/>
-            <w:shd w:fill="F8FAFC"/>
-            <w:tcMar>
-              <w:top w:w="60" w:type="dxa"/>
-              <w:bottom w:w="60" w:type="dxa"/>
-              <w:left w:w="100" w:type="dxa"/>
-              <w:right w:w="100" w:type="dxa"/>
-            </w:tcMar>
-          </w:tcPr>
-          <w:p>
-            <w:pPr>
-              <w:spacing w:after="0"/>
-            </w:pPr>
-            <w:r>
-              <w:rPr>
-                <w:rFonts w:ascii="Arial" w:hAnsi="Arial"/>
-                <w:sz w:val="17"/>
-              </w:rPr>
-              <w:t>750k/ngày | 90k/h</w:t>
-            </w:r>
-          </w:p>
-        </w:tc>
-        <w:tc>
-          <w:tcPr>
-            <w:tcW w:type="dxa" w:w="2592"/>
-            <w:shd w:fill="F8FAFC"/>
-            <w:tcMar>
-              <w:top w:w="60" w:type="dxa"/>
-              <w:bottom w:w="60" w:type="dxa"/>
-              <w:left w:w="100" w:type="dxa"/>
-              <w:right w:w="100" w:type="dxa"/>
-            </w:tcMar>
-          </w:tcPr>
-          <w:p>
-            <w:pPr>
-              <w:spacing w:after="0"/>
-            </w:pPr>
-            <w:r>
-              <w:rPr>
-                <w:rFonts w:ascii="Arial" w:hAnsi="Arial"/>
-                <w:sz w:val="17"/>
-              </w:rPr>
-              <w:t>Tiết kiệm nhiên liệu, camera hành trình, bảo dưỡng 35.000km</w:t>
-            </w:r>
-          </w:p>
-        </w:tc>
-      </w:tr>
-      <w:tr>
-        <w:tc>
-          <w:tcPr>
-            <w:tcW w:type="dxa" w:w="2592"/>
-            <w:shd w:fill="FFFFFF"/>
-            <w:tcMar>
-              <w:top w:w="60" w:type="dxa"/>
-              <w:bottom w:w="60" w:type="dxa"/>
-              <w:left w:w="100" w:type="dxa"/>
-              <w:right w:w="100" w:type="dxa"/>
-            </w:tcMar>
-          </w:tcPr>
-          <w:p>
-            <w:pPr>
-              <w:spacing w:after="0"/>
-            </w:pPr>
-            <w:r>
-              <w:rPr>
-                <w:rFonts w:ascii="Arial" w:hAnsi="Arial"/>
-                <w:b/>
-                <w:sz w:val="17"/>
-              </w:rPr>
-              <w:t>Mitsubishi Xpander (MPV 7 chỗ)</w:t>
-            </w:r>
-          </w:p>
-        </w:tc>
-        <w:tc>
-          <w:tcPr>
-            <w:tcW w:type="dxa" w:w="1872"/>
-            <w:shd w:fill="FFFFFF"/>
-            <w:tcMar>
-              <w:top w:w="60" w:type="dxa"/>
-              <w:bottom w:w="60" w:type="dxa"/>
-              <w:left w:w="100" w:type="dxa"/>
-              <w:right w:w="100" w:type="dxa"/>
-            </w:tcMar>
-          </w:tcPr>
-          <w:p>
-            <w:pPr>
-              <w:spacing w:after="0"/>
-            </w:pPr>
-            <w:r>
-              <w:rPr>
-                <w:rFonts w:ascii="Arial" w:hAnsi="Arial"/>
-                <w:b/>
-                <w:color w:val="2563EB"/>
-                <w:sz w:val="17"/>
-              </w:rPr>
-              <w:t>43A-629.41</w:t>
-            </w:r>
-          </w:p>
-        </w:tc>
-        <w:tc>
-          <w:tcPr>
-            <w:tcW w:type="dxa" w:w="2304"/>
-            <w:shd w:fill="FFFFFF"/>
-            <w:tcMar>
-              <w:top w:w="60" w:type="dxa"/>
-              <w:bottom w:w="60" w:type="dxa"/>
-              <w:left w:w="100" w:type="dxa"/>
-              <w:right w:w="100" w:type="dxa"/>
-            </w:tcMar>
-          </w:tcPr>
-          <w:p>
-            <w:pPr>
-              <w:spacing w:after="0"/>
-            </w:pPr>
-            <w:r>
-              <w:rPr>
-                <w:rFonts w:ascii="Arial" w:hAnsi="Arial"/>
-                <w:sz w:val="17"/>
-              </w:rPr>
-              <w:t>950k/ngày | 120k/h</w:t>
-            </w:r>
-          </w:p>
-        </w:tc>
-        <w:tc>
-          <w:tcPr>
-            <w:tcW w:type="dxa" w:w="2592"/>
-            <w:shd w:fill="FFFFFF"/>
-            <w:tcMar>
-              <w:top w:w="60" w:type="dxa"/>
-              <w:bottom w:w="60" w:type="dxa"/>
-              <w:left w:w="100" w:type="dxa"/>
-              <w:right w:w="100" w:type="dxa"/>
-            </w:tcMar>
-          </w:tcPr>
-          <w:p>
-            <w:pPr>
-              <w:spacing w:after="0"/>
-            </w:pPr>
-            <w:r>
-              <w:rPr>
-                <w:rFonts w:ascii="Arial" w:hAnsi="Arial"/>
-                <w:sz w:val="17"/>
-              </w:rPr>
-              <w:t>7 chỗ rộng rãi, cốp hành lý lớn, xe được gia đình chuộng nhất</w:t>
-            </w:r>
-          </w:p>
-        </w:tc>
-      </w:tr>
-      <w:tr>
-        <w:tc>
-          <w:tcPr>
-            <w:tcW w:type="dxa" w:w="2592"/>
-            <w:shd w:fill="F8FAFC"/>
-            <w:tcMar>
-              <w:top w:w="60" w:type="dxa"/>
-              <w:bottom w:w="60" w:type="dxa"/>
-              <w:left w:w="100" w:type="dxa"/>
-              <w:right w:w="100" w:type="dxa"/>
-            </w:tcMar>
-          </w:tcPr>
-          <w:p>
-            <w:pPr>
-              <w:spacing w:after="0"/>
-            </w:pPr>
-            <w:r>
-              <w:rPr>
-                <w:rFonts w:ascii="Arial" w:hAnsi="Arial"/>
-                <w:b/>
-                <w:sz w:val="17"/>
-              </w:rPr>
-              <w:t>Honda Vision Smartkey (Xe tay ga)</w:t>
-            </w:r>
-          </w:p>
-        </w:tc>
-        <w:tc>
-          <w:tcPr>
-            <w:tcW w:type="dxa" w:w="1872"/>
-            <w:shd w:fill="F8FAFC"/>
-            <w:tcMar>
-              <w:top w:w="60" w:type="dxa"/>
-              <w:bottom w:w="60" w:type="dxa"/>
-              <w:left w:w="100" w:type="dxa"/>
-              <w:right w:w="100" w:type="dxa"/>
-            </w:tcMar>
-          </w:tcPr>
-          <w:p>
-            <w:pPr>
-              <w:spacing w:after="0"/>
-            </w:pPr>
-            <w:r>
-              <w:rPr>
-                <w:rFonts w:ascii="Arial" w:hAnsi="Arial"/>
-                <w:b/>
-                <w:color w:val="2563EB"/>
-                <w:sz w:val="17"/>
-              </w:rPr>
-              <w:t>43-D1 882.19</w:t>
-            </w:r>
-          </w:p>
-        </w:tc>
-        <w:tc>
-          <w:tcPr>
-            <w:tcW w:type="dxa" w:w="2304"/>
-            <w:shd w:fill="F8FAFC"/>
-            <w:tcMar>
-              <w:top w:w="60" w:type="dxa"/>
-              <w:bottom w:w="60" w:type="dxa"/>
-              <w:left w:w="100" w:type="dxa"/>
-              <w:right w:w="100" w:type="dxa"/>
-            </w:tcMar>
-          </w:tcPr>
-          <w:p>
-            <w:pPr>
-              <w:spacing w:after="0"/>
-            </w:pPr>
-            <w:r>
-              <w:rPr>
-                <w:rFonts w:ascii="Arial" w:hAnsi="Arial"/>
-                <w:sz w:val="17"/>
-              </w:rPr>
-              <w:t>130k/ngày | 20k/h</w:t>
-            </w:r>
-          </w:p>
-        </w:tc>
-        <w:tc>
-          <w:tcPr>
-            <w:tcW w:type="dxa" w:w="2592"/>
-            <w:shd w:fill="F8FAFC"/>
-            <w:tcMar>
-              <w:top w:w="60" w:type="dxa"/>
-              <w:bottom w:w="60" w:type="dxa"/>
-              <w:left w:w="100" w:type="dxa"/>
-              <w:right w:w="100" w:type="dxa"/>
-            </w:tcMar>
-          </w:tcPr>
-          <w:p>
-            <w:pPr>
-              <w:spacing w:after="0"/>
-            </w:pPr>
-            <w:r>
-              <w:rPr>
-                <w:rFonts w:ascii="Arial" w:hAnsi="Arial"/>
-                <w:sz w:val="17"/>
-              </w:rPr>
-              <w:t>Khóa thông minh, cốp rộng, phụ nữ và du khách trẻ yêu thích</w:t>
-            </w:r>
-          </w:p>
-        </w:tc>
-      </w:tr>
-      <w:tr>
-        <w:tc>
-          <w:tcPr>
-            <w:tcW w:type="dxa" w:w="2592"/>
-            <w:shd w:fill="FFFFFF"/>
-            <w:tcMar>
-              <w:top w:w="60" w:type="dxa"/>
-              <w:bottom w:w="60" w:type="dxa"/>
-              <w:left w:w="100" w:type="dxa"/>
-              <w:right w:w="100" w:type="dxa"/>
-            </w:tcMar>
-          </w:tcPr>
-          <w:p>
-            <w:pPr>
-              <w:spacing w:after="0"/>
-            </w:pPr>
-            <w:r>
-              <w:rPr>
-                <w:rFonts w:ascii="Arial" w:hAnsi="Arial"/>
-                <w:b/>
-                <w:sz w:val="17"/>
-              </w:rPr>
-              <w:t>Honda Air Blade 125 (Xe tay ga)</w:t>
-            </w:r>
-          </w:p>
-        </w:tc>
-        <w:tc>
-          <w:tcPr>
-            <w:tcW w:type="dxa" w:w="1872"/>
-            <w:shd w:fill="FFFFFF"/>
-            <w:tcMar>
-              <w:top w:w="60" w:type="dxa"/>
-              <w:bottom w:w="60" w:type="dxa"/>
-              <w:left w:w="100" w:type="dxa"/>
-              <w:right w:w="100" w:type="dxa"/>
-            </w:tcMar>
-          </w:tcPr>
-          <w:p>
-            <w:pPr>
-              <w:spacing w:after="0"/>
-            </w:pPr>
-            <w:r>
-              <w:rPr>
-                <w:rFonts w:ascii="Arial" w:hAnsi="Arial"/>
-                <w:b/>
-                <w:color w:val="2563EB"/>
-                <w:sz w:val="17"/>
-              </w:rPr>
-              <w:t>43-K2 918.42</w:t>
-            </w:r>
-          </w:p>
-        </w:tc>
-        <w:tc>
-          <w:tcPr>
-            <w:tcW w:type="dxa" w:w="2304"/>
-            <w:shd w:fill="FFFFFF"/>
-            <w:tcMar>
-              <w:top w:w="60" w:type="dxa"/>
-              <w:bottom w:w="60" w:type="dxa"/>
-              <w:left w:w="100" w:type="dxa"/>
-              <w:right w:w="100" w:type="dxa"/>
-            </w:tcMar>
-          </w:tcPr>
-          <w:p>
-            <w:pPr>
-              <w:spacing w:after="0"/>
-            </w:pPr>
-            <w:r>
-              <w:rPr>
-                <w:rFonts w:ascii="Arial" w:hAnsi="Arial"/>
-                <w:sz w:val="17"/>
-              </w:rPr>
-              <w:t>150k/ngày | 25k/h</w:t>
-            </w:r>
-          </w:p>
-        </w:tc>
-        <w:tc>
-          <w:tcPr>
-            <w:tcW w:type="dxa" w:w="2592"/>
-            <w:shd w:fill="FFFFFF"/>
-            <w:tcMar>
-              <w:top w:w="60" w:type="dxa"/>
-              <w:bottom w:w="60" w:type="dxa"/>
-              <w:left w:w="100" w:type="dxa"/>
-              <w:right w:w="100" w:type="dxa"/>
-            </w:tcMar>
-          </w:tcPr>
-          <w:p>
-            <w:pPr>
-              <w:spacing w:after="0"/>
-            </w:pPr>
-            <w:r>
-              <w:rPr>
-                <w:rFonts w:ascii="Arial" w:hAnsi="Arial"/>
-                <w:sz w:val="17"/>
-              </w:rPr>
-              <w:t>Động cơ khỏe leo dốc Bán đảo Sơn Trà, phanh đĩa CBS an toàn</w:t>
-            </w:r>
-          </w:p>
-        </w:tc>
-      </w:tr>
-    </w:tbl>
-    <w:p>
-      <w:pPr>
-        <w:spacing w:after="240"/>
-      </w:pPr>
-    </w:p>
-    <w:p>
-      <w:pPr>
-        <w:spacing w:before="320" w:after="120"/>
-      </w:pPr>
-      <w:r>
-        <w:rPr>
-          <w:rFonts w:ascii="Arial" w:hAnsi="Arial"/>
-          <w:b/>
-          <w:color w:val="1E3A8A"/>
-          <w:sz w:val="28"/>
-        </w:rPr>
-        <w:t>7. HƯỚNG DẪN CÀI ĐẶT &amp; LỘ TRÌNH PHÁT TRIỂN (ROADMAP)</w:t>
-      </w:r>
-    </w:p>
-    <w:p>
-      <w:r>
-        <w:t>Các bước khởi chạy dự án tại máy cục bộ:</w:t>
-      </w:r>
-    </w:p>
-    <w:p>
-      <w:pPr>
-        <w:spacing w:after="40"/>
-        <w:ind w:left="576"/>
-      </w:pPr>
-      <w:r>
-        <w:rPr>
-          <w:rFonts w:ascii="Consolas" w:hAnsi="Consolas"/>
-          <w:color w:val="1E40AF"/>
-          <w:sz w:val="19"/>
-        </w:rPr>
-        <w:t>1. git clone https://github.com/DinhTuanHai-TBD/QuanLyDatXe_DriveRent.git</w:t>
-      </w:r>
-    </w:p>
-    <w:p>
-      <w:pPr>
-        <w:spacing w:after="40"/>
-        <w:ind w:left="576"/>
-      </w:pPr>
-      <w:r>
-        <w:rPr>
-          <w:rFonts w:ascii="Consolas" w:hAnsi="Consolas"/>
-          <w:color w:val="1E40AF"/>
-          <w:sz w:val="19"/>
-        </w:rPr>
-        <w:t>2. cd QuanLyDatXe_DriveRent</w:t>
-      </w:r>
-    </w:p>
-    <w:p>
-      <w:pPr>
-        <w:spacing w:after="40"/>
-        <w:ind w:left="576"/>
-      </w:pPr>
-      <w:r>
-        <w:rPr>
-          <w:rFonts w:ascii="Consolas" w:hAnsi="Consolas"/>
-          <w:color w:val="1E40AF"/>
-          <w:sz w:val="19"/>
-        </w:rPr>
-        <w:t>3. npm install --legacy-peer-deps</w:t>
-      </w:r>
-    </w:p>
-    <w:p>
-      <w:pPr>
-        <w:spacing w:after="40"/>
-        <w:ind w:left="576"/>
-      </w:pPr>
-      <w:r>
-        <w:rPr>
-          <w:rFonts w:ascii="Consolas" w:hAnsi="Consolas"/>
-          <w:color w:val="1E40AF"/>
-          <w:sz w:val="19"/>
-        </w:rPr>
-        <w:t>4. npm run dev   # Mở trình duyệt tại http://localhost:3000</w:t>
-      </w:r>
-    </w:p>
-    <w:p>
-      <w:pPr>
-        <w:spacing w:before="160"/>
-      </w:pPr>
-      <w:r>
-        <w:rPr>
-          <w:b/>
-        </w:rPr>
-        <w:t>Lộ trình nâng cấp công nghệ (Product Roadmap):</w:t>
+        <w:t>Khách thuê linh hoạt (trả trễ giờ, hụt xăng, thuê thêm mũ, phí giao xe tận nơi). Tính nhẩm thủ công dễ sai sót. Kế toán nhầm lẫn tiền cọc vào doanh thu dẫn đến bất đồng gay gắt khi thanh lý hợp đồng.</w:t>
       </w:r>
     </w:p>
     <w:p>
       <w:pPr>
         <w:pStyle w:val="ListBullet"/>
-        <w:spacing w:after="60"/>
+        <w:spacing w:before="40" w:after="60" w:line="276" w:lineRule="auto"/>
       </w:pPr>
       <w:r>
         <w:rPr>
+          <w:rFonts w:ascii="Segoe UI" w:hAnsi="Segoe UI"/>
           <w:b/>
+          <w:i w:val="0"/>
+          <w:color w:val="0F172A"/>
+          <w:sz w:val="21"/>
         </w:rPr>
-        <w:t xml:space="preserve">Giai đoạn 1 (Đã hoàn thiện): </w:t>
+        <w:t xml:space="preserve">Giải pháp DriveRent: </w:t>
       </w:r>
       <w:r>
-        <w:t>Xây dựng trọn vẹn giao diện UI/UX mô phỏng đầy đủ nghiệp vụ quản lý đội xe, wizard tạo hợp đồng, biên bản giao nhận xe và quyết toán tự động.</w:t>
+        <w:rPr>
+          <w:rFonts w:ascii="Segoe UI" w:hAnsi="Segoe UI"/>
+          <w:b w:val="0"/>
+          <w:i w:val="0"/>
+          <w:color w:val="334155"/>
+          <w:sz w:val="21"/>
+        </w:rPr>
+        <w:t>Hệ thống tự động tính tiền và phân định tiền cọc (Auto-Billing &amp; Deposit Isolation). Tiền cọc lưu ở quỹ riêng, hệ thống tự động bù trừ vào tiền thuê thực tế hoặc hoàn cọc 100% qua chuyển khoản VietQR.</w:t>
+      </w:r>
+    </w:p>
+    <w:p>
+      <w:pPr>
+        <w:keepNext/>
+        <w:spacing w:before="200" w:after="80"/>
+      </w:pPr>
+      <w:r>
+        <w:rPr>
+          <w:rFonts w:ascii="Segoe UI" w:hAnsi="Segoe UI"/>
+          <w:b/>
+          <w:i w:val="0"/>
+          <w:color w:val="0D9488"/>
+          <w:sz w:val="23"/>
+        </w:rPr>
+        <w:t>5.4. Vấn đề 4: Bỏ quên lịch thay nhớt và bảo dưỡng định kỳ</w:t>
       </w:r>
     </w:p>
     <w:p>
       <w:pPr>
         <w:pStyle w:val="ListBullet"/>
-        <w:spacing w:after="60"/>
+        <w:spacing w:before="40" w:after="60" w:line="276" w:lineRule="auto"/>
       </w:pPr>
       <w:r>
         <w:rPr>
+          <w:rFonts w:ascii="Segoe UI" w:hAnsi="Segoe UI"/>
           <w:b/>
+          <w:i w:val="0"/>
+          <w:color w:val="0F172A"/>
+          <w:sz w:val="21"/>
         </w:rPr>
-        <w:t xml:space="preserve">Giai đoạn 2 (Backend &amp; Cloud Storage): </w:t>
+        <w:t xml:space="preserve">Thực trạng &amp; Hậu quả: </w:t>
       </w:r>
       <w:r>
-        <w:t>Kết nối CSDL PostgreSQL/Supabase, tích hợp lưu trữ đám mây (AWS S3/Cloudinary) để upload ảnh CCCD và ảnh hiện trạng xe thực tế.</w:t>
+        <w:rPr>
+          <w:rFonts w:ascii="Segoe UI" w:hAnsi="Segoe UI"/>
+          <w:b w:val="0"/>
+          <w:i w:val="0"/>
+          <w:color w:val="334155"/>
+          <w:sz w:val="21"/>
+        </w:rPr>
+        <w:t>Xe cho thuê chạy cường độ cao liên tục, không ai theo dõi số Km kể từ lần thay nhớt trước. Hậu quả là động cơ xuống cấp nhanh, bó máy, mòn phanh gây nguy hiểm cho du khách trên đường đèo dốc và tốn hàng chục triệu đại tu.</w:t>
       </w:r>
     </w:p>
     <w:p>
       <w:pPr>
         <w:pStyle w:val="ListBullet"/>
-        <w:spacing w:after="60"/>
+        <w:spacing w:before="40" w:after="60" w:line="276" w:lineRule="auto"/>
       </w:pPr>
       <w:r>
         <w:rPr>
+          <w:rFonts w:ascii="Segoe UI" w:hAnsi="Segoe UI"/>
           <w:b/>
+          <w:i w:val="0"/>
+          <w:color w:val="0F172A"/>
+          <w:sz w:val="21"/>
         </w:rPr>
-        <w:t xml:space="preserve">Giai đoạn 3 (Smart Hardware &amp; GPS): </w:t>
+        <w:t xml:space="preserve">Giải pháp DriveRent: </w:t>
       </w:r>
       <w:r>
-        <w:t>Tích hợp thiết bị định vị GPS hành trình gắn trên xe để tự động cập nhật số ODO thời gian thực và vị trí bãi đỗ.</w:t>
+        <w:rPr>
+          <w:rFonts w:ascii="Segoe UI" w:hAnsi="Segoe UI"/>
+          <w:b w:val="0"/>
+          <w:i w:val="0"/>
+          <w:color w:val="334155"/>
+          <w:sz w:val="21"/>
+        </w:rPr>
+        <w:t>Cơ chế cảnh báo bảo trì kép (Dual-trigger Alerts) tự động đối chiếu số Km ODO sau mỗi chuyến đi (Xe máy: mỗi 3.000 km; Ô tô: mỗi 5.000 km) và mốc ngày định kỳ để phát cảnh báo đỏ/vàng kịp thời.</w:t>
+      </w:r>
+    </w:p>
+    <w:p>
+      <w:pPr>
+        <w:keepNext/>
+        <w:spacing w:before="320" w:after="120"/>
+        <w:pBdr>
+          <w:bottom w:val="single" w:sz="12" w:space="4" w:color="0D9488"/>
+        </w:pBdr>
+      </w:pPr>
+      <w:r>
+        <w:rPr>
+          <w:rFonts w:ascii="Segoe UI" w:hAnsi="Segoe UI"/>
+          <w:b/>
+          <w:i w:val="0"/>
+          <w:color w:val="0F172A"/>
+          <w:sz w:val="28"/>
+        </w:rPr>
+        <w:t>6. Những yêu cầu chính là gì?</w:t>
+      </w:r>
+    </w:p>
+    <w:p>
+      <w:pPr>
+        <w:keepNext/>
+        <w:spacing w:before="200" w:after="80"/>
+      </w:pPr>
+      <w:r>
+        <w:rPr>
+          <w:rFonts w:ascii="Segoe UI" w:hAnsi="Segoe UI"/>
+          <w:b/>
+          <w:i w:val="0"/>
+          <w:color w:val="0D9488"/>
+          <w:sz w:val="23"/>
+        </w:rPr>
+        <w:t>6.1. Yêu cầu Phân hệ Khách hàng (Customer Portal)</w:t>
       </w:r>
     </w:p>
     <w:p>
       <w:pPr>
         <w:pStyle w:val="ListBullet"/>
-        <w:spacing w:after="60"/>
+        <w:spacing w:before="40" w:after="60" w:line="276" w:lineRule="auto"/>
       </w:pPr>
       <w:r>
         <w:rPr>
+          <w:rFonts w:ascii="Segoe UI" w:hAnsi="Segoe UI"/>
           <w:b/>
+          <w:i w:val="0"/>
+          <w:color w:val="0F172A"/>
+          <w:sz w:val="21"/>
         </w:rPr>
-        <w:t xml:space="preserve">Giai đoạn 4 (eKYC &amp; Payment Webhook): </w:t>
+        <w:t xml:space="preserve">Ngôn ngữ thiết kế Liquid Glass toàn diện: </w:t>
       </w:r>
       <w:r>
-        <w:t>Tích hợp nhận dạng thông minh CCCD/GPLX (OCR) và Webhook xác nhận giao dịch thanh toán ngân hàng tự động (VietQR/SeAPay).</w:t>
+        <w:rPr>
+          <w:rFonts w:ascii="Segoe UI" w:hAnsi="Segoe UI"/>
+          <w:b w:val="0"/>
+          <w:i w:val="0"/>
+          <w:color w:val="334155"/>
+          <w:sz w:val="21"/>
+        </w:rPr>
+        <w:t>Toàn bộ thẻ xe, thanh điều hướng, modal, bảng thông số kỹ thuật đều sử dụng hiệu ứng kính mờ trong suốt (backdrop-blur-2xl), viền phản chiếu ánh sáng và đổ bóng cao cấp.</w:t>
+      </w:r>
+    </w:p>
+    <w:p>
+      <w:pPr>
+        <w:pStyle w:val="ListBullet"/>
+        <w:spacing w:before="40" w:after="60" w:line="276" w:lineRule="auto"/>
+      </w:pPr>
+      <w:r>
+        <w:rPr>
+          <w:rFonts w:ascii="Segoe UI" w:hAnsi="Segoe UI"/>
+          <w:b/>
+          <w:i w:val="0"/>
+          <w:color w:val="0F172A"/>
+          <w:sz w:val="21"/>
+        </w:rPr>
+        <w:t xml:space="preserve">Thanh Taskbar cố định thông minh: </w:t>
+      </w:r>
+      <w:r>
+        <w:rPr>
+          <w:rFonts w:ascii="Segoe UI" w:hAnsi="Segoe UI"/>
+          <w:b w:val="0"/>
+          <w:i w:val="0"/>
+          <w:color w:val="334155"/>
+          <w:sz w:val="21"/>
+        </w:rPr>
+        <w:t>Cố định ở mép trên màn hình khi cuộn trang (fixed top-0). Hiển thị dạng kính trong suốt khi ở đầu trang và tự động chuyển sang màu trắng thanh lịch khi cuộn xuống.</w:t>
+      </w:r>
+    </w:p>
+    <w:p>
+      <w:pPr>
+        <w:pStyle w:val="ListBullet"/>
+        <w:spacing w:before="40" w:after="60" w:line="276" w:lineRule="auto"/>
+      </w:pPr>
+      <w:r>
+        <w:rPr>
+          <w:rFonts w:ascii="Segoe UI" w:hAnsi="Segoe UI"/>
+          <w:b/>
+          <w:i w:val="0"/>
+          <w:color w:val="0F172A"/>
+          <w:sz w:val="21"/>
+        </w:rPr>
+        <w:t xml:space="preserve">Hero Banner Showroom Gara Vòm LED: </w:t>
+      </w:r>
+      <w:r>
+        <w:rPr>
+          <w:rFonts w:ascii="Segoe UI" w:hAnsi="Segoe UI"/>
+          <w:b w:val="0"/>
+          <w:i w:val="0"/>
+          <w:color w:val="334155"/>
+          <w:sz w:val="21"/>
+        </w:rPr>
+        <w:t>Hình nền gara tràn toàn màn hình (100vw). Hiệu ứng xe tự động lăn bánh vào tâm bãi đỗ thay thế xe trước đó, thông tin xe hiển thị 2 bên và bên dưới trên các tấm kính mờ.</w:t>
+      </w:r>
+    </w:p>
+    <w:p>
+      <w:pPr>
+        <w:pStyle w:val="ListBullet"/>
+        <w:spacing w:before="40" w:after="60" w:line="276" w:lineRule="auto"/>
+      </w:pPr>
+      <w:r>
+        <w:rPr>
+          <w:rFonts w:ascii="Segoe UI" w:hAnsi="Segoe UI"/>
+          <w:b/>
+          <w:i w:val="0"/>
+          <w:color w:val="0F172A"/>
+          <w:sz w:val="21"/>
+        </w:rPr>
+        <w:t xml:space="preserve">Tìm kiếm, Lọc xe &amp; Đặt giữ chỗ 10 phút: </w:t>
+      </w:r>
+      <w:r>
+        <w:rPr>
+          <w:rFonts w:ascii="Segoe UI" w:hAnsi="Segoe UI"/>
+          <w:b w:val="0"/>
+          <w:i w:val="0"/>
+          <w:color w:val="334155"/>
+          <w:sz w:val="21"/>
+        </w:rPr>
+        <w:t>Lọc theo loại xe (ô tô, xe máy), hãng, số chỗ, giá thuê; modal thanh toán VietQR giữ xe trong 10 phút với đồng hồ đếm ngược thời gian thực.</w:t>
+      </w:r>
+    </w:p>
+    <w:p>
+      <w:pPr>
+        <w:pStyle w:val="ListBullet"/>
+        <w:spacing w:before="40" w:after="60" w:line="276" w:lineRule="auto"/>
+      </w:pPr>
+      <w:r>
+        <w:rPr>
+          <w:rFonts w:ascii="Segoe UI" w:hAnsi="Segoe UI"/>
+          <w:b/>
+          <w:i w:val="0"/>
+          <w:color w:val="0F172A"/>
+          <w:sz w:val="21"/>
+        </w:rPr>
+        <w:t xml:space="preserve">Tra cứu đơn thuê trực tuyến: </w:t>
+      </w:r>
+      <w:r>
+        <w:rPr>
+          <w:rFonts w:ascii="Segoe UI" w:hAnsi="Segoe UI"/>
+          <w:b w:val="0"/>
+          <w:i w:val="0"/>
+          <w:color w:val="334155"/>
+          <w:sz w:val="21"/>
+        </w:rPr>
+        <w:t>Du khách chỉ cần nhập số điện thoại hoặc mã Booking để kiểm tra trạng thái duyệt xe và lịch nhận xe.</w:t>
+      </w:r>
+    </w:p>
+    <w:p>
+      <w:pPr>
+        <w:keepNext/>
+        <w:spacing w:before="200" w:after="80"/>
+      </w:pPr>
+      <w:r>
+        <w:rPr>
+          <w:rFonts w:ascii="Segoe UI" w:hAnsi="Segoe UI"/>
+          <w:b/>
+          <w:i w:val="0"/>
+          <w:color w:val="0D9488"/>
+          <w:sz w:val="23"/>
+        </w:rPr>
+        <w:t>6.2. Yêu cầu Phân hệ Quản trị Vận hành (Admin Operations)</w:t>
+      </w:r>
+    </w:p>
+    <w:p>
+      <w:pPr>
+        <w:pStyle w:val="ListBullet"/>
+        <w:spacing w:before="40" w:after="60" w:line="276" w:lineRule="auto"/>
+      </w:pPr>
+      <w:r>
+        <w:rPr>
+          <w:rFonts w:ascii="Segoe UI" w:hAnsi="Segoe UI"/>
+          <w:b/>
+          <w:i w:val="0"/>
+          <w:color w:val="0F172A"/>
+          <w:sz w:val="21"/>
+        </w:rPr>
+        <w:t xml:space="preserve">Sơ đồ trạng thái đội xe (Fleet View): </w:t>
+      </w:r>
+      <w:r>
+        <w:rPr>
+          <w:rFonts w:ascii="Segoe UI" w:hAnsi="Segoe UI"/>
+          <w:b w:val="0"/>
+          <w:i w:val="0"/>
+          <w:color w:val="334155"/>
+          <w:sz w:val="21"/>
+        </w:rPr>
+        <w:t>Hỗ trợ 2 chế độ hiển thị Lưới (Grid) và Bảng (Table), 3 màu trạng thái chuẩn, hiển thị mức xăng 1-8/8, số ODO, biển số xe.</w:t>
+      </w:r>
+    </w:p>
+    <w:p>
+      <w:pPr>
+        <w:pStyle w:val="ListBullet"/>
+        <w:spacing w:before="40" w:after="60" w:line="276" w:lineRule="auto"/>
+      </w:pPr>
+      <w:r>
+        <w:rPr>
+          <w:rFonts w:ascii="Segoe UI" w:hAnsi="Segoe UI"/>
+          <w:b/>
+          <w:i w:val="0"/>
+          <w:color w:val="0F172A"/>
+          <w:sz w:val="21"/>
+        </w:rPr>
+        <w:t xml:space="preserve">Quy trình lập Hợp đồng 4 bước (Create Wizard): </w:t>
+      </w:r>
+      <w:r>
+        <w:rPr>
+          <w:rFonts w:ascii="Segoe UI" w:hAnsi="Segoe UI"/>
+          <w:b w:val="0"/>
+          <w:i w:val="0"/>
+          <w:color w:val="334155"/>
+          <w:sz w:val="21"/>
+        </w:rPr>
+        <w:t>Bước 1: Chọn xe &amp; thời gian (tự động kiểm tra trùng lịch) -&gt; Bước 2: Thông tin khách hàng -&gt; Bước 3: Lưu ảnh CCCD/GPLX -&gt; Bước 4: Tiền cọc &amp; Phụ phí.</w:t>
+      </w:r>
+    </w:p>
+    <w:p>
+      <w:pPr>
+        <w:pStyle w:val="ListBullet"/>
+        <w:spacing w:before="40" w:after="60" w:line="276" w:lineRule="auto"/>
+      </w:pPr>
+      <w:r>
+        <w:rPr>
+          <w:rFonts w:ascii="Segoe UI" w:hAnsi="Segoe UI"/>
+          <w:b/>
+          <w:i w:val="0"/>
+          <w:color w:val="0F172A"/>
+          <w:sz w:val="21"/>
+        </w:rPr>
+        <w:t xml:space="preserve">Biên bản bàn giao &amp; Thu hồi xe số hóa (Handover/Return): </w:t>
+      </w:r>
+      <w:r>
+        <w:rPr>
+          <w:rFonts w:ascii="Segoe UI" w:hAnsi="Segoe UI"/>
+          <w:b w:val="0"/>
+          <w:i w:val="0"/>
+          <w:color w:val="334155"/>
+          <w:sz w:val="21"/>
+        </w:rPr>
+        <w:t>Checklist 6 hạng mục (thân vỏ, lốp, đèn còi, gương, xăng, phụ kiện), chụp ảnh hiện trạng 4 góc, nhập phí phạt đền bù hư hại.</w:t>
+      </w:r>
+    </w:p>
+    <w:p>
+      <w:pPr>
+        <w:pStyle w:val="ListBullet"/>
+        <w:spacing w:before="40" w:after="60" w:line="276" w:lineRule="auto"/>
+      </w:pPr>
+      <w:r>
+        <w:rPr>
+          <w:rFonts w:ascii="Segoe UI" w:hAnsi="Segoe UI"/>
+          <w:b/>
+          <w:i w:val="0"/>
+          <w:color w:val="0F172A"/>
+          <w:sz w:val="21"/>
+        </w:rPr>
+        <w:t xml:space="preserve">Quyết toán thanh lý hợp đồng (Settlement Modal): </w:t>
+      </w:r>
+      <w:r>
+        <w:rPr>
+          <w:rFonts w:ascii="Segoe UI" w:hAnsi="Segoe UI"/>
+          <w:b w:val="0"/>
+          <w:i w:val="0"/>
+          <w:color w:val="334155"/>
+          <w:sz w:val="21"/>
+        </w:rPr>
+        <w:t>Tự động tính tiền theo giờ/ngày thực tế, phân tách tiền cọc, tự động tính số tiền hoàn trả hoặc thu thêm.</w:t>
+      </w:r>
+    </w:p>
+    <w:p>
+      <w:pPr>
+        <w:pStyle w:val="ListBullet"/>
+        <w:spacing w:before="40" w:after="60" w:line="276" w:lineRule="auto"/>
+      </w:pPr>
+      <w:r>
+        <w:rPr>
+          <w:rFonts w:ascii="Segoe UI" w:hAnsi="Segoe UI"/>
+          <w:b/>
+          <w:i w:val="0"/>
+          <w:color w:val="0F172A"/>
+          <w:sz w:val="21"/>
+        </w:rPr>
+        <w:t xml:space="preserve">Quản lý bảo dưỡng &amp; Nhắc thay nhớt (Maintenance View): </w:t>
+      </w:r>
+      <w:r>
+        <w:rPr>
+          <w:rFonts w:ascii="Segoe UI" w:hAnsi="Segoe UI"/>
+          <w:b w:val="0"/>
+          <w:i w:val="0"/>
+          <w:color w:val="334155"/>
+          <w:sz w:val="21"/>
+        </w:rPr>
+        <w:t>Theo dõi Km ODO, khóa xe không cho thuê khi đang bảo dưỡng, tự động sinh mốc Km bảo dưỡng tiếp theo.</w:t>
+      </w:r>
+    </w:p>
+    <w:p>
+      <w:pPr>
+        <w:pStyle w:val="ListBullet"/>
+        <w:spacing w:before="40" w:after="60" w:line="276" w:lineRule="auto"/>
+      </w:pPr>
+      <w:r>
+        <w:rPr>
+          <w:rFonts w:ascii="Segoe UI" w:hAnsi="Segoe UI"/>
+          <w:b/>
+          <w:i w:val="0"/>
+          <w:color w:val="0F172A"/>
+          <w:sz w:val="21"/>
+        </w:rPr>
+        <w:t xml:space="preserve">Mẫu in hợp đồng khổ A4 (Print Contract Modal): </w:t>
+      </w:r>
+      <w:r>
+        <w:rPr>
+          <w:rFonts w:ascii="Segoe UI" w:hAnsi="Segoe UI"/>
+          <w:b w:val="0"/>
+          <w:i w:val="0"/>
+          <w:color w:val="334155"/>
+          <w:sz w:val="21"/>
+        </w:rPr>
+        <w:t>Mẫu in pháp lý chuẩn gồm quốc hiệu, trách nhiệm bên thuê &amp; cho thuê, chữ ký xác nhận 2 bên.</w:t>
+      </w:r>
+    </w:p>
+    <w:p>
+      <w:pPr>
+        <w:keepNext/>
+        <w:spacing w:before="320" w:after="120"/>
+        <w:pBdr>
+          <w:bottom w:val="single" w:sz="12" w:space="4" w:color="0D9488"/>
+        </w:pBdr>
+      </w:pPr>
+      <w:r>
+        <w:rPr>
+          <w:rFonts w:ascii="Segoe UI" w:hAnsi="Segoe UI"/>
+          <w:b/>
+          <w:i w:val="0"/>
+          <w:color w:val="0F172A"/>
+          <w:sz w:val="28"/>
+        </w:rPr>
+        <w:t>7. Phạm vi công việc đến đâu?</w:t>
+      </w:r>
+    </w:p>
+    <w:p>
+      <w:pPr>
+        <w:keepNext/>
+        <w:spacing w:before="200" w:after="80"/>
+      </w:pPr>
+      <w:r>
+        <w:rPr>
+          <w:rFonts w:ascii="Segoe UI" w:hAnsi="Segoe UI"/>
+          <w:b/>
+          <w:i w:val="0"/>
+          <w:color w:val="0D9488"/>
+          <w:sz w:val="23"/>
+        </w:rPr>
+        <w:t>7.1. Trong phạm vi thực hiện (In-Scope - Đã hoàn thành 100%)</w:t>
+      </w:r>
+    </w:p>
+    <w:p>
+      <w:pPr>
+        <w:pStyle w:val="ListBullet"/>
+        <w:spacing w:before="40" w:after="60" w:line="276" w:lineRule="auto"/>
+      </w:pPr>
+      <w:r>
+        <w:rPr>
+          <w:rFonts w:ascii="Segoe UI" w:hAnsi="Segoe UI"/>
+          <w:b/>
+          <w:i w:val="0"/>
+          <w:color w:val="0F172A"/>
+          <w:sz w:val="21"/>
+        </w:rPr>
+        <w:t xml:space="preserve">Frontend Web Application: </w:t>
+      </w:r>
+      <w:r>
+        <w:rPr>
+          <w:rFonts w:ascii="Segoe UI" w:hAnsi="Segoe UI"/>
+          <w:b w:val="0"/>
+          <w:i w:val="0"/>
+          <w:color w:val="334155"/>
+          <w:sz w:val="21"/>
+        </w:rPr>
+        <w:t>Xây dựng toàn bộ giao diện responsive tương thích hoàn hảo từ Mobile (375px), Tablet (768px) đến Desktop/Màn hình lớn (1920px).</w:t>
+      </w:r>
+    </w:p>
+    <w:p>
+      <w:pPr>
+        <w:pStyle w:val="ListBullet"/>
+        <w:spacing w:before="40" w:after="60" w:line="276" w:lineRule="auto"/>
+      </w:pPr>
+      <w:r>
+        <w:rPr>
+          <w:rFonts w:ascii="Segoe UI" w:hAnsi="Segoe UI"/>
+          <w:b/>
+          <w:i w:val="0"/>
+          <w:color w:val="0F172A"/>
+          <w:sz w:val="21"/>
+        </w:rPr>
+        <w:t xml:space="preserve">Hệ thống UI/UX Liquid Glass: </w:t>
+      </w:r>
+      <w:r>
+        <w:rPr>
+          <w:rFonts w:ascii="Segoe UI" w:hAnsi="Segoe UI"/>
+          <w:b w:val="0"/>
+          <w:i w:val="0"/>
+          <w:color w:val="334155"/>
+          <w:sz w:val="21"/>
+        </w:rPr>
+        <w:t>Áp dụng ngôn ngữ Liquid Glass đồng bộ cho 7 trang khách hàng và 10 màn hình quản trị nội bộ; chuẩn hóa hình ảnh xe cắt nền trong suốt và hình nền studio Gara LED.</w:t>
+      </w:r>
+    </w:p>
+    <w:p>
+      <w:pPr>
+        <w:pStyle w:val="ListBullet"/>
+        <w:spacing w:before="40" w:after="60" w:line="276" w:lineRule="auto"/>
+      </w:pPr>
+      <w:r>
+        <w:rPr>
+          <w:rFonts w:ascii="Segoe UI" w:hAnsi="Segoe UI"/>
+          <w:b/>
+          <w:i w:val="0"/>
+          <w:color w:val="0F172A"/>
+          <w:sz w:val="21"/>
+        </w:rPr>
+        <w:t xml:space="preserve">Business Logic &amp; State Management: </w:t>
+      </w:r>
+      <w:r>
+        <w:rPr>
+          <w:rFonts w:ascii="Segoe UI" w:hAnsi="Segoe UI"/>
+          <w:b w:val="0"/>
+          <w:i w:val="0"/>
+          <w:color w:val="334155"/>
+          <w:sz w:val="21"/>
+        </w:rPr>
+        <w:t>Lập trình đầy đủ luồng dữ liệu thời gian thực trên React Context API: Đặt xe online -&gt; Duyệt đơn -&gt; Lập hợp đồng -&gt; Giao xe -&gt; Nhận xe trả -&gt; Quyết toán cọc -&gt; Bảo dưỡng định kỳ.</w:t>
+      </w:r>
+    </w:p>
+    <w:p>
+      <w:pPr>
+        <w:pStyle w:val="ListBullet"/>
+        <w:spacing w:before="40" w:after="60" w:line="276" w:lineRule="auto"/>
+      </w:pPr>
+      <w:r>
+        <w:rPr>
+          <w:rFonts w:ascii="Segoe UI" w:hAnsi="Segoe UI"/>
+          <w:b/>
+          <w:i w:val="0"/>
+          <w:color w:val="0F172A"/>
+          <w:sz w:val="21"/>
+        </w:rPr>
+        <w:t xml:space="preserve">Dữ liệu mẫu (Seed Data) &amp; Mẫu in A4: </w:t>
+      </w:r>
+      <w:r>
+        <w:rPr>
+          <w:rFonts w:ascii="Segoe UI" w:hAnsi="Segoe UI"/>
+          <w:b w:val="0"/>
+          <w:i w:val="0"/>
+          <w:color w:val="334155"/>
+          <w:sz w:val="21"/>
+        </w:rPr>
+        <w:t>Cung cấp sẵn dữ liệu thực tế gồm 12 đầu xe ô tô/xe máy, khách hàng, hợp đồng, lịch bảo trì và mẫu in hợp đồng pháp lý A4.</w:t>
+      </w:r>
+    </w:p>
+    <w:p>
+      <w:pPr>
+        <w:pStyle w:val="ListBullet"/>
+        <w:spacing w:before="40" w:after="60" w:line="276" w:lineRule="auto"/>
+      </w:pPr>
+      <w:r>
+        <w:rPr>
+          <w:rFonts w:ascii="Segoe UI" w:hAnsi="Segoe UI"/>
+          <w:b/>
+          <w:i w:val="0"/>
+          <w:color w:val="0F172A"/>
+          <w:sz w:val="21"/>
+        </w:rPr>
+        <w:t xml:space="preserve">Đóng gói &amp; Kiểm thử Production: </w:t>
+      </w:r>
+      <w:r>
+        <w:rPr>
+          <w:rFonts w:ascii="Segoe UI" w:hAnsi="Segoe UI"/>
+          <w:b w:val="0"/>
+          <w:i w:val="0"/>
+          <w:color w:val="334155"/>
+          <w:sz w:val="21"/>
+        </w:rPr>
+        <w:t>Kiểm thử lệnh build không lỗi (npm run build) và đẩy toàn bộ mã nguồn lên GitHub.</w:t>
+      </w:r>
+    </w:p>
+    <w:p>
+      <w:pPr>
+        <w:keepNext/>
+        <w:spacing w:before="200" w:after="80"/>
+      </w:pPr>
+      <w:r>
+        <w:rPr>
+          <w:rFonts w:ascii="Segoe UI" w:hAnsi="Segoe UI"/>
+          <w:b/>
+          <w:i w:val="0"/>
+          <w:color w:val="0D9488"/>
+          <w:sz w:val="23"/>
+        </w:rPr>
+        <w:t>7.2. Ngoài phạm vi hiện tại (Out-of-Scope - Giai đoạn phát triển tiếp theo)</w:t>
+      </w:r>
+    </w:p>
+    <w:p>
+      <w:pPr>
+        <w:pStyle w:val="ListBullet"/>
+        <w:spacing w:before="40" w:after="60" w:line="276" w:lineRule="auto"/>
+      </w:pPr>
+      <w:r>
+        <w:rPr>
+          <w:rFonts w:ascii="Segoe UI" w:hAnsi="Segoe UI"/>
+          <w:b/>
+          <w:i w:val="0"/>
+          <w:color w:val="0F172A"/>
+          <w:sz w:val="21"/>
+        </w:rPr>
+        <w:t xml:space="preserve">Backend Server &amp; Cơ sở dữ liệu đám mây: </w:t>
+      </w:r>
+      <w:r>
+        <w:rPr>
+          <w:rFonts w:ascii="Segoe UI" w:hAnsi="Segoe UI"/>
+          <w:b w:val="0"/>
+          <w:i w:val="0"/>
+          <w:color w:val="334155"/>
+          <w:sz w:val="21"/>
+        </w:rPr>
+        <w:t>Kết nối hệ CSDL phân tán PostgreSQL / Supabase thay cho bộ nhớ State cục bộ.</w:t>
+      </w:r>
+    </w:p>
+    <w:p>
+      <w:pPr>
+        <w:pStyle w:val="ListBullet"/>
+        <w:spacing w:before="40" w:after="60" w:line="276" w:lineRule="auto"/>
+      </w:pPr>
+      <w:r>
+        <w:rPr>
+          <w:rFonts w:ascii="Segoe UI" w:hAnsi="Segoe UI"/>
+          <w:b/>
+          <w:i w:val="0"/>
+          <w:color w:val="0F172A"/>
+          <w:sz w:val="21"/>
+        </w:rPr>
+        <w:t xml:space="preserve">Cổng thanh toán tự động (Payment Webhook): </w:t>
+      </w:r>
+      <w:r>
+        <w:rPr>
+          <w:rFonts w:ascii="Segoe UI" w:hAnsi="Segoe UI"/>
+          <w:b w:val="0"/>
+          <w:i w:val="0"/>
+          <w:color w:val="334155"/>
+          <w:sz w:val="21"/>
+        </w:rPr>
+        <w:t>Tích hợp Webhook tài khoản ngân hàng để tự động xác nhận tiền cọc mà không cần nhân viên kiểm tra thủ công.</w:t>
+      </w:r>
+    </w:p>
+    <w:p>
+      <w:pPr>
+        <w:pStyle w:val="ListBullet"/>
+        <w:spacing w:before="40" w:after="60" w:line="276" w:lineRule="auto"/>
+      </w:pPr>
+      <w:r>
+        <w:rPr>
+          <w:rFonts w:ascii="Segoe UI" w:hAnsi="Segoe UI"/>
+          <w:b/>
+          <w:i w:val="0"/>
+          <w:color w:val="0F172A"/>
+          <w:sz w:val="21"/>
+        </w:rPr>
+        <w:t xml:space="preserve">Định vị phần cứng GPS hành trình: </w:t>
+      </w:r>
+      <w:r>
+        <w:rPr>
+          <w:rFonts w:ascii="Segoe UI" w:hAnsi="Segoe UI"/>
+          <w:b w:val="0"/>
+          <w:i w:val="0"/>
+          <w:color w:val="334155"/>
+          <w:sz w:val="21"/>
+        </w:rPr>
+        <w:t>Lắp đặt thiết bị GPS trên xe để tự động đọc số Km ODO và vị trí xe theo thời gian thực.</w:t>
+      </w:r>
+    </w:p>
+    <w:p>
+      <w:pPr>
+        <w:pStyle w:val="ListBullet"/>
+        <w:spacing w:before="40" w:after="60" w:line="276" w:lineRule="auto"/>
+      </w:pPr>
+      <w:r>
+        <w:rPr>
+          <w:rFonts w:ascii="Segoe UI" w:hAnsi="Segoe UI"/>
+          <w:b/>
+          <w:i w:val="0"/>
+          <w:color w:val="0F172A"/>
+          <w:sz w:val="21"/>
+        </w:rPr>
+        <w:t xml:space="preserve">AI OCR nhận diện giấy tờ tùy thân: </w:t>
+      </w:r>
+      <w:r>
+        <w:rPr>
+          <w:rFonts w:ascii="Segoe UI" w:hAnsi="Segoe UI"/>
+          <w:b w:val="0"/>
+          <w:i w:val="0"/>
+          <w:color w:val="334155"/>
+          <w:sz w:val="21"/>
+        </w:rPr>
+        <w:t>Tự động đọc và trích xuất thông tin họ tên, số căn cước từ ảnh chụp CCCD/GPLX.</w:t>
+      </w:r>
+    </w:p>
+    <w:p>
+      <w:pPr>
+        <w:keepNext/>
+        <w:spacing w:before="320" w:after="120"/>
+        <w:pBdr>
+          <w:bottom w:val="single" w:sz="12" w:space="4" w:color="0D9488"/>
+        </w:pBdr>
+      </w:pPr>
+      <w:r>
+        <w:rPr>
+          <w:rFonts w:ascii="Segoe UI" w:hAnsi="Segoe UI"/>
+          <w:b/>
+          <w:i w:val="0"/>
+          <w:color w:val="0F172A"/>
+          <w:sz w:val="28"/>
+        </w:rPr>
+        <w:t>8. Kết quả cần đạt được là gì?</w:t>
+      </w:r>
+    </w:p>
+    <w:p>
+      <w:pPr>
+        <w:keepNext/>
+        <w:spacing w:before="200" w:after="80"/>
+      </w:pPr>
+      <w:r>
+        <w:rPr>
+          <w:rFonts w:ascii="Segoe UI" w:hAnsi="Segoe UI"/>
+          <w:b/>
+          <w:i w:val="0"/>
+          <w:color w:val="0D9488"/>
+          <w:sz w:val="23"/>
+        </w:rPr>
+        <w:t>8.1. Sản phẩm bàn giao cụ thể (Deliverables)</w:t>
+      </w:r>
+    </w:p>
+    <w:p>
+      <w:pPr>
+        <w:pStyle w:val="ListBullet"/>
+        <w:spacing w:before="40" w:after="60" w:line="276" w:lineRule="auto"/>
+      </w:pPr>
+      <w:r>
+        <w:rPr>
+          <w:rFonts w:ascii="Segoe UI" w:hAnsi="Segoe UI"/>
+          <w:b/>
+          <w:i w:val="0"/>
+          <w:color w:val="0F172A"/>
+          <w:sz w:val="21"/>
+        </w:rPr>
+        <w:t xml:space="preserve">1. Kho mã nguồn hoàn chỉnh trên GitHub: </w:t>
+      </w:r>
+      <w:r>
+        <w:rPr>
+          <w:rFonts w:ascii="Segoe UI" w:hAnsi="Segoe UI"/>
+          <w:b w:val="0"/>
+          <w:i w:val="0"/>
+          <w:color w:val="334155"/>
+          <w:sz w:val="21"/>
+        </w:rPr>
+        <w:t>Repository https://github.com/DinhTuanHai-TBD/QuanLyDatXe_DriveRent.git được tổ chức sạch sẽ, chuẩn TypeScript, build 0 lỗi.</w:t>
+      </w:r>
+    </w:p>
+    <w:p>
+      <w:pPr>
+        <w:pStyle w:val="ListBullet"/>
+        <w:spacing w:before="40" w:after="60" w:line="276" w:lineRule="auto"/>
+      </w:pPr>
+      <w:r>
+        <w:rPr>
+          <w:rFonts w:ascii="Segoe UI" w:hAnsi="Segoe UI"/>
+          <w:b/>
+          <w:i w:val="0"/>
+          <w:color w:val="0F172A"/>
+          <w:sz w:val="21"/>
+        </w:rPr>
+        <w:t xml:space="preserve">2. Ứng dụng Web hoàn chỉnh (Production Prototype): </w:t>
+      </w:r>
+      <w:r>
+        <w:rPr>
+          <w:rFonts w:ascii="Segoe UI" w:hAnsi="Segoe UI"/>
+          <w:b w:val="0"/>
+          <w:i w:val="0"/>
+          <w:color w:val="334155"/>
+          <w:sz w:val="21"/>
+        </w:rPr>
+        <w:t>Chạy mượt mà cả 2 cổng Khách hàng (Customer Portal) và Quản trị (Admin Portal) với thời gian phản hồi dưới 100ms.</w:t>
+      </w:r>
+    </w:p>
+    <w:p>
+      <w:pPr>
+        <w:pStyle w:val="ListBullet"/>
+        <w:spacing w:before="40" w:after="60" w:line="276" w:lineRule="auto"/>
+      </w:pPr>
+      <w:r>
+        <w:rPr>
+          <w:rFonts w:ascii="Segoe UI" w:hAnsi="Segoe UI"/>
+          <w:b/>
+          <w:i w:val="0"/>
+          <w:color w:val="0F172A"/>
+          <w:sz w:val="21"/>
+        </w:rPr>
+        <w:t xml:space="preserve">3. Bộ tài liệu đặc tả chuẩn mực: </w:t>
+      </w:r>
+      <w:r>
+        <w:rPr>
+          <w:rFonts w:ascii="Segoe UI" w:hAnsi="Segoe UI"/>
+          <w:b w:val="0"/>
+          <w:i w:val="0"/>
+          <w:color w:val="334155"/>
+          <w:sz w:val="21"/>
+        </w:rPr>
+        <w:t>Tệp PROJECT_BRIEF.md và PROJECT_BRIEF.docx định dạng chuyên nghiệp theo chuẩn 8 câu hỏi cốt lõi.</w:t>
+      </w:r>
+    </w:p>
+    <w:p>
+      <w:pPr>
+        <w:keepNext/>
+        <w:spacing w:before="200" w:after="80"/>
+      </w:pPr>
+      <w:r>
+        <w:rPr>
+          <w:rFonts w:ascii="Segoe UI" w:hAnsi="Segoe UI"/>
+          <w:b/>
+          <w:i w:val="0"/>
+          <w:color w:val="0D9488"/>
+          <w:sz w:val="23"/>
+        </w:rPr>
+        <w:t>8.2. Chỉ số hiệu quả kỳ vọng (Expected KPIs)</w:t>
+      </w:r>
+    </w:p>
+    <w:p>
+      <w:pPr>
+        <w:pStyle w:val="ListBullet"/>
+        <w:spacing w:before="40" w:after="60" w:line="276" w:lineRule="auto"/>
+      </w:pPr>
+      <w:r>
+        <w:rPr>
+          <w:rFonts w:ascii="Segoe UI" w:hAnsi="Segoe UI"/>
+          <w:b/>
+          <w:i w:val="0"/>
+          <w:color w:val="0F172A"/>
+          <w:sz w:val="21"/>
+        </w:rPr>
+        <w:t xml:space="preserve">Hiệu suất vận hành: </w:t>
+      </w:r>
+      <w:r>
+        <w:rPr>
+          <w:rFonts w:ascii="Segoe UI" w:hAnsi="Segoe UI"/>
+          <w:b w:val="0"/>
+          <w:i w:val="0"/>
+          <w:color w:val="334155"/>
+          <w:sz w:val="21"/>
+        </w:rPr>
+        <w:t>Giảm 85% thời gian làm thủ tục lập hợp đồng và bàn giao nhận xe tại quầy (từ 15–20 phút xuống dưới 2–3 phút).</w:t>
+      </w:r>
+    </w:p>
+    <w:p>
+      <w:pPr>
+        <w:pStyle w:val="ListBullet"/>
+        <w:spacing w:before="40" w:after="60" w:line="276" w:lineRule="auto"/>
+      </w:pPr>
+      <w:r>
+        <w:rPr>
+          <w:rFonts w:ascii="Segoe UI" w:hAnsi="Segoe UI"/>
+          <w:b/>
+          <w:i w:val="0"/>
+          <w:color w:val="0F172A"/>
+          <w:sz w:val="21"/>
+        </w:rPr>
+        <w:t xml:space="preserve">Chính xác tài chính: </w:t>
+      </w:r>
+      <w:r>
+        <w:rPr>
+          <w:rFonts w:ascii="Segoe UI" w:hAnsi="Segoe UI"/>
+          <w:b w:val="0"/>
+          <w:i w:val="0"/>
+          <w:color w:val="334155"/>
+          <w:sz w:val="21"/>
+        </w:rPr>
+        <w:t>Đạt 100% độ chính xác trong việc tính cước thuê và quyết toán hoàn cọc; loại trừ hoàn toàn tình trạng nhầm lẫn tiền cọc vào doanh thu.</w:t>
+      </w:r>
+    </w:p>
+    <w:p>
+      <w:pPr>
+        <w:pStyle w:val="ListBullet"/>
+        <w:spacing w:before="40" w:after="60" w:line="276" w:lineRule="auto"/>
+      </w:pPr>
+      <w:r>
+        <w:rPr>
+          <w:rFonts w:ascii="Segoe UI" w:hAnsi="Segoe UI"/>
+          <w:b/>
+          <w:i w:val="0"/>
+          <w:color w:val="0F172A"/>
+          <w:sz w:val="21"/>
+        </w:rPr>
+        <w:t xml:space="preserve">Bảo vệ tài sản phương tiện: </w:t>
+      </w:r>
+      <w:r>
+        <w:rPr>
+          <w:rFonts w:ascii="Segoe UI" w:hAnsi="Segoe UI"/>
+          <w:b w:val="0"/>
+          <w:i w:val="0"/>
+          <w:color w:val="334155"/>
+          <w:sz w:val="21"/>
+        </w:rPr>
+        <w:t>100% hợp đồng có lưu ảnh đối chiếu 4 góc xe và ảnh CCCD/GPLX; 100% đầu xe được nhắc thay nhớt đúng hạn.</w:t>
+      </w:r>
+    </w:p>
+    <w:p>
+      <w:pPr>
+        <w:pStyle w:val="ListBullet"/>
+        <w:spacing w:before="40" w:after="60" w:line="276" w:lineRule="auto"/>
+      </w:pPr>
+      <w:r>
+        <w:rPr>
+          <w:rFonts w:ascii="Segoe UI" w:hAnsi="Segoe UI"/>
+          <w:b/>
+          <w:i w:val="0"/>
+          <w:color w:val="0F172A"/>
+          <w:sz w:val="21"/>
+        </w:rPr>
+        <w:t xml:space="preserve">Trải nghiệm &amp; Chuyển đổi: </w:t>
+      </w:r>
+      <w:r>
+        <w:rPr>
+          <w:rFonts w:ascii="Segoe UI" w:hAnsi="Segoe UI"/>
+          <w:b w:val="0"/>
+          <w:i w:val="0"/>
+          <w:color w:val="334155"/>
+          <w:sz w:val="21"/>
+        </w:rPr>
+        <w:t>Giao diện Liquid Glass chuẩn showroom quốc tế giúp tăng mạnh độ uy tín và tỷ lệ đặt xe giữ chỗ online của du khách.</w:t>
       </w:r>
     </w:p>
     <w:sectPr>
       <w:headerReference w:type="default" r:id="rId9"/>
       <w:footerReference w:type="default" r:id="rId10"/>
       <w:pgSz w:w="12240" w:h="15840"/>
-      <w:pgMar w:top="1440" w:right="1440" w:bottom="1440" w:left="1440" w:header="720" w:footer="720" w:gutter="0"/>
+      <w:pgMar w:top="1152" w:right="1296" w:bottom="1152" w:left="1296" w:header="720" w:footer="720" w:gutter="0"/>
       <w:cols w:space="720"/>
       <w:docGrid w:linePitch="360"/>
     </w:sectPr>
@@ -2408,11 +2068,13 @@
     </w:pPr>
     <w:r>
       <w:rPr>
-        <w:rFonts w:ascii="Arial" w:hAnsi="Arial"/>
+        <w:rFonts w:ascii="Segoe UI" w:hAnsi="Segoe UI"/>
+        <w:b w:val="0"/>
+        <w:i w:val="0"/>
         <w:color w:val="94A3B8"/>
         <w:sz w:val="17"/>
       </w:rPr>
-      <w:t>Tài liệu kỹ thuật nội bộ — DriveRent © 2026. Mã nguồn: github.com/DinhTuanHai-TBD/QuanLyDatXe_DriveRent</w:t>
+      <w:t>DriveRent System · 8 Câu Hỏi Định Vị Bài Toán Trước Khi Làm</w:t>
     </w:r>
   </w:p>
 </w:ftr>
@@ -2427,11 +2089,13 @@
     </w:pPr>
     <w:r>
       <w:rPr>
-        <w:rFonts w:ascii="Arial" w:hAnsi="Arial"/>
+        <w:rFonts w:ascii="Segoe UI" w:hAnsi="Segoe UI"/>
+        <w:b w:val="0"/>
+        <w:i w:val="0"/>
         <w:color w:val="94A3B8"/>
         <w:sz w:val="17"/>
       </w:rPr>
-      <w:t>DriveRent System — Project Brief Specification | v1.0</w:t>
+      <w:t>TÀI LIỆU BRIEF DỰ ÁN | DRIVERENT</w:t>
     </w:r>
   </w:p>
 </w:hdr>
@@ -2800,14 +2464,6 @@
     <w:name w:val="Normal"/>
     <w:qFormat/>
     <w:rsid w:val="00FC693F"/>
-    <w:pPr>
-      <w:spacing w:line="288" w:lineRule="auto" w:after="120"/>
-    </w:pPr>
-    <w:rPr>
-      <w:rFonts w:ascii="Arial" w:hAnsi="Arial"/>
-      <w:color w:val="1E293B"/>
-      <w:sz w:val="21"/>
-    </w:rPr>
   </w:style>
   <w:style w:type="paragraph" w:styleId="Header">
     <w:name w:val="header"/>

</xml_diff>

<commit_message>
docs: remove English terms in parentheses from brief and Word docx
</commit_message>
<xml_diff>
--- a/PROJECT_BRIEF.docx
+++ b/PROJECT_BRIEF.docx
@@ -14,7 +14,7 @@
           <w:color w:val="0F172A"/>
           <w:sz w:val="40"/>
         </w:rPr>
-        <w:t>TÀI LIỆU BRIEF DỰ ÁN (PROJECT BRIEF)</w:t>
+        <w:t>TÀI LIỆU TÓM TẮT DỰ ÁN</w:t>
       </w:r>
     </w:p>
     <w:p>
@@ -29,7 +29,7 @@
           <w:color w:val="0D9488"/>
           <w:sz w:val="22"/>
         </w:rPr>
-        <w:t>HỆ THỐNG QUẢN LÝ DỊCH VỤ CHO THUÊ XE MÁY &amp; Ô TÔ TỰ LÁI (DRIVERENT)</w:t>
+        <w:t>HỆ THỐNG QUẢN LÝ DỊCH VỤ CHO THUÊ XE MÁY &amp; Ô TÔ TỰ LÁI DRIVERENT</w:t>
         <w:br/>
         <w:t>Chuẩn phương pháp: Hiểu đúng bài toán trước khi làm (8 câu hỏi cốt lõi)</w:t>
       </w:r>
@@ -96,7 +96,7 @@
                 <w:color w:val="0F172A"/>
                 <w:sz w:val="19"/>
               </w:rPr>
-              <w:t>DriveRent - Smart Car &amp; Motorbike Rental Management System</w:t>
+              <w:t>DriveRent - Hệ thống Quản lý Cho thuê Xe máy &amp; Ô tô Tự lái Thông minh</w:t>
             </w:r>
           </w:p>
         </w:tc>
@@ -152,7 +152,7 @@
                 <w:color w:val="0F172A"/>
                 <w:sz w:val="19"/>
               </w:rPr>
-              <w:t>DRV-RENT-2026 | v1.0.0 (Production Ready Prototype)</w:t>
+              <w:t>DRV-RENT-2026 | Phiên bản 1.0.0</w:t>
             </w:r>
           </w:p>
         </w:tc>
@@ -237,7 +237,7 @@
                 <w:color w:val="475569"/>
                 <w:sz w:val="19"/>
               </w:rPr>
-              <w:t>Ngày lập &amp; Cập nhật:</w:t>
+              <w:t>Ngày cập nhật:</w:t>
             </w:r>
           </w:p>
         </w:tc>
@@ -314,7 +314,7 @@
                 <w:color w:val="0F766E"/>
                 <w:sz w:val="21"/>
               </w:rPr>
-              <w:t>ĐỊNH NGHĨA &amp; NGUYÊN TẮC THIẾT KẾ BRIEF</w:t>
+              <w:t>ĐỊNH NGHĨA &amp; NGUYÊN TẮC THIẾT KẾ BẢN TÓM TẮT DỰ ÁN</w:t>
               <w:br/>
             </w:r>
             <w:r>
@@ -323,7 +323,7 @@
                 <w:color w:val="334155"/>
                 <w:sz w:val="20"/>
               </w:rPr>
-              <w:t>Brief là bảng mô tả tóm tắt thông tin của một dự án công nghệ, đồng thời là căn cứ cốt lõi để tư vấn, định vị bài toán và trao đổi với khách hàng. Một brief chuẩn trả lời trọn vẹn tám câu hỏi phân bổ thành 2 nhóm: Nhóm định vị khách hàng &amp; mục tiêu (Câu 1-4) và Nhóm giải pháp kỹ thuật, phạm vi &amp; kết quả (Câu 5-8).</w:t>
+              <w:t>Brief là bảng mô tả tóm tắt thông tin của một dự án công nghệ, đồng thời là căn cứ cốt lõi để tư vấn, định vị bài toán và trao đổi với khách hàng. Một bản brief chuẩn trả lời trọn vẹn tám câu hỏi phân bổ thành 2 nhóm: Nhóm định vị khách hàng và mục tiêu (Câu 1 đến Câu 4) và Nhóm giải pháp kỹ thuật, phạm vi và kết quả (Câu 5 đến Câu 8).</w:t>
             </w:r>
           </w:p>
         </w:tc>
@@ -365,7 +365,7 @@
           <w:color w:val="334155"/>
           <w:sz w:val="21"/>
         </w:rPr>
-        <w:t>DriveRent là Website &amp; Hệ thống phần mềm quản lý dịch vụ cho thuê xe máy và ô tô tự lái toàn diện (All-in-one Rental Platform). Dự án tích hợp đồng bộ hai phân hệ chuyên biệt trên cùng một nền tảng:</w:t>
+        <w:t>DriveRent là Website và Hệ thống phần mềm quản lý dịch vụ cho thuê xe máy và ô tô tự lái toàn diện. Dự án tích hợp đồng bộ hai phân hệ chuyên biệt trên cùng một nền tảng:</w:t>
       </w:r>
     </w:p>
     <w:p>
@@ -381,7 +381,7 @@
           <w:color w:val="0F172A"/>
           <w:sz w:val="21"/>
         </w:rPr>
-        <w:t xml:space="preserve">Phân hệ Khách hàng (Customer Booking Portal): </w:t>
+        <w:t xml:space="preserve">Cổng Khách hàng: </w:t>
       </w:r>
       <w:r>
         <w:rPr>
@@ -391,7 +391,7 @@
           <w:color w:val="334155"/>
           <w:sz w:val="21"/>
         </w:rPr>
-        <w:t>Website trực tuyến hiện đại dành cho du khách tìm kiếm, tham khảo thông số, kiểm tra giá thuê theo giờ/ngày và đặt cọc giữ chỗ trực tuyến. Ứng dụng ngôn ngữ thiết kế Liquid Glass (kính mờ trong suốt cao cấp), hiệu ứng xe tự động chạy vào bãi gara LED 3D sống động, thanh điều hướng taskbar chuyển đổi trạng thái mượt mà theo vị trí cuộn trang.</w:t>
+        <w:t>Website trực tuyến hiện đại dành cho du khách tìm kiếm, tham khảo thông số, kiểm tra giá thuê theo giờ hoặc theo ngày và đặt cọc giữ chỗ trực tuyến. Ứng dụng ngôn ngữ thiết kế kính mờ trong suốt cao cấp, hiệu ứng xe tự động chạy vào bãi gara đèn LED sống động, thanh điều hướng chuyển đổi trạng thái mượt mà theo vị trí cuộn trang.</w:t>
       </w:r>
     </w:p>
     <w:p>
@@ -407,7 +407,7 @@
           <w:color w:val="0F172A"/>
           <w:sz w:val="21"/>
         </w:rPr>
-        <w:t xml:space="preserve">Phân hệ Quản trị &amp; Điều hành Nội bộ (Admin Operations System): </w:t>
+        <w:t xml:space="preserve">Hệ thống Quản trị và Điều hành Nội bộ: </w:t>
       </w:r>
       <w:r>
         <w:rPr>
@@ -417,7 +417,7 @@
           <w:color w:val="334155"/>
           <w:sz w:val="21"/>
         </w:rPr>
-        <w:t>Bảng điều khiển dành riêng cho chủ nhà xe, nhân viên lễ tân và thợ kỹ thuật. Giám sát đội xe trực quan theo thời gian thực (Sẵn sàng / Đang thuê / Bảo dưỡng), số hóa quy trình lập hợp đồng trong 2 phút, quản lý biên bản bàn giao - thu hồi xe kèm ảnh chụp hiện trạng, tự động quyết toán phân định tiền cọc và quản lý lịch bảo trì, nhắc thay nhớt định kỳ.</w:t>
+        <w:t>Bảng điều khiển dành riêng cho chủ nhà xe, nhân viên lễ tân và thợ kỹ thuật. Giám sát đội xe trực quan theo thời gian thực gồm Sẵn sàng, Đang thuê, Bảo dưỡng; số hóa quy trình lập hợp đồng trong 2 phút; quản lý biên bản bàn giao và thu hồi xe kèm ảnh chụp hiện trạng; tự động quyết toán phân định tiền cọc và quản lý lịch bảo trì, nhắc thay nhớt định kỳ.</w:t>
       </w:r>
     </w:p>
     <w:p>
@@ -451,7 +451,7 @@
           <w:color w:val="334155"/>
           <w:sz w:val="21"/>
         </w:rPr>
-        <w:t>Khách hàng trực tiếp của dự án (Chủ sở hữu hệ thống / Bên đặt hàng dịch vụ) bao gồm:</w:t>
+        <w:t>Khách hàng trực tiếp của dự án là:</w:t>
       </w:r>
     </w:p>
     <w:p>
@@ -467,7 +467,7 @@
           <w:color w:val="0F172A"/>
           <w:sz w:val="21"/>
         </w:rPr>
-        <w:t xml:space="preserve">Cơ sở &amp; Chuỗi cửa hàng kinh doanh cho thuê phương tiện tự lái: </w:t>
+        <w:t xml:space="preserve">Cơ sở và Chuỗi cửa hàng kinh doanh cho thuê phương tiện tự lái: </w:t>
       </w:r>
       <w:r>
         <w:rPr>
@@ -477,7 +477,7 @@
           <w:color w:val="334155"/>
           <w:sz w:val="21"/>
         </w:rPr>
-        <w:t>Các nhà xe có quy mô vừa và nhỏ (sở hữu từ 15 đến 80+ đầu xe hỗn hợp cả xe máy tay ga, xe số và ô tô 4–7 chỗ), tập trung tại các thành phố du lịch trọng điểm của Việt Nam (Đà Nẵng, Nha Trang, Phú Quốc, Đà Lạt, Quy Nhơn, Vũng Tàu, Hà Nội, TP.HCM,...).</w:t>
+        <w:t>Các nhà xe có quy mô vừa và nhỏ, sở hữu từ 15 đến hơn 80 đầu xe hỗn hợp cả xe máy tay ga, xe số và ô tô 4 đến 7 chỗ, tập trung tại các thành phố du lịch trọng điểm của Việt Nam như Đà Nẵng, Nha Trang, Phú Quốc, Đà Lạt, Quy Nhơn, Vũng Tàu, Hà Nội, TP.HCM,...</w:t>
       </w:r>
     </w:p>
     <w:p>
@@ -503,7 +503,7 @@
           <w:color w:val="334155"/>
           <w:sz w:val="21"/>
         </w:rPr>
-        <w:t>Các phòng ban phối hợp nhịp nhàng trong quy trình:</w:t>
+        <w:t>Các bộ phận phối hợp nhịp nhàng trong quy trình:</w:t>
       </w:r>
     </w:p>
     <w:p>
@@ -519,7 +519,7 @@
           <w:color w:val="1E293B"/>
           <w:sz w:val="20"/>
         </w:rPr>
-        <w:t xml:space="preserve">Chủ cửa hàng / Quản lý: </w:t>
+        <w:t xml:space="preserve">Chủ cửa hàng, Quản lý: </w:t>
       </w:r>
       <w:r>
         <w:rPr>
@@ -545,7 +545,7 @@
           <w:color w:val="1E293B"/>
           <w:sz w:val="20"/>
         </w:rPr>
-        <w:t xml:space="preserve">Nhân viên Lễ tân / Tiếp đón (Front Desk / Sales): </w:t>
+        <w:t xml:space="preserve">Nhân viên Lễ tân, Tiếp đón khách: </w:t>
       </w:r>
       <w:r>
         <w:rPr>
@@ -571,7 +571,7 @@
           <w:color w:val="1E293B"/>
           <w:sz w:val="20"/>
         </w:rPr>
-        <w:t xml:space="preserve">Kỹ thuật viên / Thợ bảo dưỡng (Technician): </w:t>
+        <w:t xml:space="preserve">Kỹ thuật viên, Thợ bảo dưỡng: </w:t>
       </w:r>
       <w:r>
         <w:rPr>
@@ -581,7 +581,7 @@
           <w:color w:val="475569"/>
           <w:sz w:val="20"/>
         </w:rPr>
-        <w:t>Cần theo dõi số Km lăn bánh (ODO) của từng xe để thay nhớt, kiểm tra má phanh, lốp xe đúng định kỳ.</w:t>
+        <w:t>Cần theo dõi số km lăn bánh của từng xe để thay nhớt, kiểm tra má phanh, lốp xe đúng định kỳ.</w:t>
       </w:r>
     </w:p>
     <w:p>
@@ -615,7 +615,7 @@
           <w:color w:val="334155"/>
           <w:sz w:val="21"/>
         </w:rPr>
-        <w:t>Đối tượng khách hàng mục tiêu của nhà xe (Người dùng cuối / End-users truy cập website để tìm và thuê xe) bao gồm 4 nhóm chính:</w:t>
+        <w:t>Đối tượng khách hàng mục tiêu của nhà xe gồm 4 nhóm chính:</w:t>
       </w:r>
     </w:p>
     <w:p>
@@ -631,7 +631,7 @@
           <w:color w:val="0F172A"/>
           <w:sz w:val="21"/>
         </w:rPr>
-        <w:t xml:space="preserve">Khách du lịch tự túc (Cá nhân, cặp đôi, nhóm bạn trẻ): </w:t>
+        <w:t xml:space="preserve">Khách du lịch tự túc: </w:t>
       </w:r>
       <w:r>
         <w:rPr>
@@ -641,7 +641,7 @@
           <w:color w:val="334155"/>
           <w:sz w:val="21"/>
         </w:rPr>
-        <w:t>Đến các điểm du lịch nghỉ dưỡng từ 2–5 ngày, muốn thuê xe máy (Vision, AirBlade) hoặc ô tô 4 chỗ (Vios) để chủ động lịch trình khám phá. Ưa chuộng hình ảnh thật, bảng giá minh bạch và đặt cọc giữ xe nhanh qua mã QR.</w:t>
+        <w:t>Cá nhân, cặp đôi hoặc nhóm bạn trẻ đến các điểm du lịch nghỉ dưỡng từ 2 đến 5 ngày, muốn thuê xe máy như Vision, AirBlade hoặc ô tô 4 chỗ như Vios để chủ động lịch trình khám phá. Ưa chuộng hình ảnh thật, bảng giá minh bạch và đặt cọc giữ xe nhanh qua mã QR chuyển khoản.</w:t>
       </w:r>
     </w:p>
     <w:p>
@@ -667,7 +667,7 @@
           <w:color w:val="334155"/>
           <w:sz w:val="21"/>
         </w:rPr>
-        <w:t>Đoàn từ 4–7 người, ưu tiên thuê ô tô 7 chỗ (Mitsubishi Xpander, Toyota Veloz) đời mới, sạch sẽ, khoang hành lý rộng, điều hòa mát và độ an toàn kỹ thuật cao.</w:t>
+        <w:t>Đoàn từ 4 đến 7 người, ưu tiên thuê ô tô 7 chỗ như Mitsubishi Xpander, Toyota Veloz đời mới, sạch sẽ, khoang hành lý rộng, điều hòa mát và độ an toàn kỹ thuật cao.</w:t>
       </w:r>
     </w:p>
     <w:p>
@@ -683,7 +683,7 @@
           <w:color w:val="0F172A"/>
           <w:sz w:val="21"/>
         </w:rPr>
-        <w:t xml:space="preserve">Chuyên gia &amp; Khách công tác ngắn ngày: </w:t>
+        <w:t xml:space="preserve">Chuyên gia và Khách công tác ngắn ngày: </w:t>
       </w:r>
       <w:r>
         <w:rPr>
@@ -779,7 +779,7 @@
           <w:color w:val="334155"/>
           <w:sz w:val="21"/>
         </w:rPr>
-        <w:t>Thay thế hoàn toàn sổ ghi tay, file Excel rời rạc hoặc tin nhắn Zalo dễ trôi bằng hệ thống dữ liệu số tập trung.</w:t>
+        <w:t>Thay thế hoàn toàn sổ ghi tay, file Excel rời rạc hoặc tin nhắn dễ trôi bằng hệ thống dữ liệu số tập trung.</w:t>
       </w:r>
     </w:p>
     <w:p>
@@ -805,7 +805,7 @@
           <w:color w:val="334155"/>
           <w:sz w:val="21"/>
         </w:rPr>
-        <w:t>Giảm thời gian làm hợp đồng và bàn giao xe từ 15–20 phút xuống còn dưới 2–3 phút/khách nhờ Wizard 4 bước và biên bản kiểm tra số hóa.</w:t>
+        <w:t>Giảm thời gian làm hợp đồng và bàn giao xe từ 15–20 phút xuống còn dưới 2–3 phút mỗi khách nhờ quy trình 4 bước và biên bản kiểm tra số hóa.</w:t>
       </w:r>
     </w:p>
     <w:p>
@@ -821,7 +821,7 @@
           <w:color w:val="0F172A"/>
           <w:sz w:val="21"/>
         </w:rPr>
-        <w:t xml:space="preserve">3. Minh bạch tài chính &amp; Phân định tiền cọc: </w:t>
+        <w:t xml:space="preserve">3. Minh bạch tài chính và Phân định tiền cọc: </w:t>
       </w:r>
       <w:r>
         <w:rPr>
@@ -831,7 +831,7 @@
           <w:color w:val="334155"/>
           <w:sz w:val="21"/>
         </w:rPr>
-        <w:t>Cách ly hoàn toàn tiền đặt cọc (Security Deposit) khỏi doanh thu dịch vụ, tự động tính cước thuê thực tế và khấu trừ cọc minh bạch, chấm dứt tranh cãi lúc hoàn cọc.</w:t>
+        <w:t>Cách ly hoàn toàn tiền đặt cọc khỏi doanh thu dịch vụ, tự động tính cước thuê thực tế và khấu trừ cọc minh bạch, chấm dứt tranh cãi lúc hoàn cọc.</w:t>
       </w:r>
     </w:p>
     <w:p>
@@ -847,7 +847,7 @@
           <w:color w:val="0F172A"/>
           <w:sz w:val="21"/>
         </w:rPr>
-        <w:t xml:space="preserve">4. Bảo vệ tài sản &amp; Kéo dài tuổi thọ phương tiện: </w:t>
+        <w:t xml:space="preserve">4. Bảo vệ tài sản và Kéo dài tuổi thọ phương tiện: </w:t>
       </w:r>
       <w:r>
         <w:rPr>
@@ -857,7 +857,7 @@
           <w:color w:val="334155"/>
           <w:sz w:val="21"/>
         </w:rPr>
-        <w:t>Số hóa lưu trữ ảnh CCCD/GPLX và ảnh hiện trạng xe lúc giao/nhận; tự động nhắc thay nhớt theo số Km ODO thực tế giúp kéo dài tuổi thọ động cơ và đảm bảo an toàn cho khách.</w:t>
+        <w:t>Số hóa lưu trữ ảnh căn cước công dân, bằng lái xe và ảnh hiện trạng xe lúc giao và nhận; tự động nhắc thay nhớt theo số km thực tế giúp kéo dài tuổi thọ động cơ và đảm bảo an toàn cho khách.</w:t>
       </w:r>
     </w:p>
     <w:p>
@@ -873,7 +873,7 @@
           <w:color w:val="0F172A"/>
           <w:sz w:val="21"/>
         </w:rPr>
-        <w:t xml:space="preserve">5. Đột phá trải nghiệm &amp; Định vị thương hiệu: </w:t>
+        <w:t xml:space="preserve">5. Đột phá trải nghiệm và Định vị thương hiệu: </w:t>
       </w:r>
       <w:r>
         <w:rPr>
@@ -883,7 +883,7 @@
           <w:color w:val="334155"/>
           <w:sz w:val="21"/>
         </w:rPr>
-        <w:t>Cung cấp giao diện đặt xe phong cách Liquid Glass sang trọng, hiệu ứng 3D sống động, nâng cao tỷ lệ chuyển đổi khách đặt xe online.</w:t>
+        <w:t>Cung cấp giao diện đặt xe phong cách kính mờ trong suốt sang trọng, hiệu ứng sinh động, nâng cao tỷ lệ chuyển đổi khách đặt xe trực tuyến.</w:t>
       </w:r>
     </w:p>
     <w:p>
@@ -917,7 +917,7 @@
           <w:color w:val="334155"/>
           <w:sz w:val="21"/>
         </w:rPr>
-        <w:t>Website DriveRent được thiết kế để giải quyết triệt để 4 bài toán ("nỗi đau" thực tế lớn nhất) của các chủ nhà xe:</w:t>
+        <w:t>Website DriveRent được thiết kế để giải quyết triệt để 4 khó khăn và bất cập lớn nhất của các chủ nhà xe:</w:t>
       </w:r>
     </w:p>
     <w:p>
@@ -949,7 +949,7 @@
           <w:color w:val="0F172A"/>
           <w:sz w:val="21"/>
         </w:rPr>
-        <w:t xml:space="preserve">Thực trạng &amp; Hậu quả: </w:t>
+        <w:t xml:space="preserve">Thực trạng và Hậu quả: </w:t>
       </w:r>
       <w:r>
         <w:rPr>
@@ -959,7 +959,7 @@
           <w:color w:val="334155"/>
           <w:sz w:val="21"/>
         </w:rPr>
-        <w:t>Quản lý bằng sổ hoặc trí nhớ khiến nhân viên không biết chính xác xe nào đang rảnh tại bãi, xe nào đang cho thuê, xe nào sắp trả hoặc đang bảo dưỡng. Dẫn đến trùng lịch cho thuê (Overbooking) hoặc từ chối khách dù bãi vẫn còn xe trống.</w:t>
+        <w:t>Quản lý bằng sổ hoặc trí nhớ khiến nhân viên không biết chính xác xe nào đang rảnh tại bãi, xe nào đang cho thuê, xe nào sắp trả hoặc đang bảo dưỡng. Dẫn đến trùng lịch cho thuê hoặc từ chối khách dù bãi vẫn còn xe trống.</w:t>
       </w:r>
     </w:p>
     <w:p>
@@ -985,7 +985,7 @@
           <w:color w:val="334155"/>
           <w:sz w:val="21"/>
         </w:rPr>
-        <w:t>Sơ đồ trạng thái xe trực quan (Visual Fleet Board) với 3 màu nhận diện chuẩn (🟢 Sẵn sàng, 🔵 Đang thuê, 🟠 Đang bảo dưỡng) kèm bộ lọc kiểm tra xe trống theo ngày giờ nhận - trả tức thì.</w:t>
+        <w:t>Sơ đồ trạng thái xe trực quan với 3 màu nhận diện chuẩn gồm Sẵn sàng (xanh lá), Đang thuê (xanh dương), Đang bảo dưỡng (cam) kèm bộ lọc kiểm tra xe trống theo ngày giờ nhận và trả tức thì.</w:t>
       </w:r>
     </w:p>
     <w:p>
@@ -1001,7 +1001,7 @@
           <w:color w:val="0D9488"/>
           <w:sz w:val="23"/>
         </w:rPr>
-        <w:t>5.2. Vấn đề 2: Tranh chấp hư hỏng trầy xước &amp; Thất lạc giấy tờ tùy thân</w:t>
+        <w:t>5.2. Vấn đề 2: Tranh chấp hư hỏng trầy xước và Thất lạc giấy tờ tùy thân</w:t>
       </w:r>
     </w:p>
     <w:p>
@@ -1017,7 +1017,7 @@
           <w:color w:val="0F172A"/>
           <w:sz w:val="21"/>
         </w:rPr>
-        <w:t xml:space="preserve">Thực trạng &amp; Hậu quả: </w:t>
+        <w:t xml:space="preserve">Thực trạng và Hậu quả: </w:t>
       </w:r>
       <w:r>
         <w:rPr>
@@ -1027,7 +1027,7 @@
           <w:color w:val="334155"/>
           <w:sz w:val="21"/>
         </w:rPr>
-        <w:t>Lúc giao xe không ghi nhận kỹ vết trầy xước cũ; lúc khách trả xe phát sinh va quẹt mới thì hai bên cãi vã vì thiếu bằng chứng đối chiếu. Giữ CCCD/GPLX gốc dễ thất lạc, khi có phạt nguội vi phạm giao thông không tra cứu lại được người lái.</w:t>
+        <w:t>Lúc giao xe không ghi nhận kỹ vết trầy xước cũ; lúc khách trả xe phát sinh va quẹt mới thì hai bên cãi vã vì thiếu bằng chứng đối chiếu. Giữ giấy tờ gốc dễ thất lạc, khi có phạt nguội vi phạm giao thông không tra cứu lại được người lái.</w:t>
       </w:r>
     </w:p>
     <w:p>
@@ -1053,7 +1053,7 @@
           <w:color w:val="334155"/>
           <w:sz w:val="21"/>
         </w:rPr>
-        <w:t>Biên bản bàn giao &amp; thu hồi xe số hóa với checklist 6 hạng mục kiểm tra, lưu trữ ảnh chụp 4 góc xe, ghi nhận số ODO, vạch xăng (1–8/8) và lưu ảnh chụp CCCD/GPLX gốc gắn liền với từng mã hợp đồng.</w:t>
+        <w:t>Biên bản bàn giao và thu hồi xe số hóa với danh mục kiểm tra 6 hạng mục, lưu trữ ảnh chụp 4 góc xe, ghi nhận số km đồng hồ, vạch xăng từ 1 đến 8 vạch và lưu ảnh chụp căn cước công dân, bằng lái xe gốc gắn liền với từng mã hợp đồng.</w:t>
       </w:r>
     </w:p>
     <w:p>
@@ -1069,7 +1069,7 @@
           <w:color w:val="0D9488"/>
           <w:sz w:val="23"/>
         </w:rPr>
-        <w:t>5.3. Vấn đề 3: Tính toán chi phí thủ công &amp; Nhập nhằng tiền cọc</w:t>
+        <w:t>5.3. Vấn đề 3: Tính toán chi phí thủ công và Nhập nhằng tiền cọc</w:t>
       </w:r>
     </w:p>
     <w:p>
@@ -1085,7 +1085,7 @@
           <w:color w:val="0F172A"/>
           <w:sz w:val="21"/>
         </w:rPr>
-        <w:t xml:space="preserve">Thực trạng &amp; Hậu quả: </w:t>
+        <w:t xml:space="preserve">Thực trạng và Hậu quả: </w:t>
       </w:r>
       <w:r>
         <w:rPr>
@@ -1095,7 +1095,7 @@
           <w:color w:val="334155"/>
           <w:sz w:val="21"/>
         </w:rPr>
-        <w:t>Khách thuê linh hoạt (trả trễ giờ, hụt xăng, thuê thêm mũ, phí giao xe tận nơi). Tính nhẩm thủ công dễ sai sót. Kế toán nhầm lẫn tiền cọc vào doanh thu dẫn đến bất đồng gay gắt khi thanh lý hợp đồng.</w:t>
+        <w:t>Khách thuê linh hoạt như trả trễ giờ, hụt xăng, thuê thêm mũ, phí giao xe tận nơi. Tính nhẩm thủ công dễ sai sót. Kế toán nhầm lẫn tiền cọc vào doanh thu dẫn đến bất đồng gay gắt khi thanh lý hợp đồng.</w:t>
       </w:r>
     </w:p>
     <w:p>
@@ -1121,7 +1121,7 @@
           <w:color w:val="334155"/>
           <w:sz w:val="21"/>
         </w:rPr>
-        <w:t>Hệ thống tự động tính tiền và phân định tiền cọc (Auto-Billing &amp; Deposit Isolation). Tiền cọc lưu ở quỹ riêng, hệ thống tự động bù trừ vào tiền thuê thực tế hoặc hoàn cọc 100% qua chuyển khoản VietQR.</w:t>
+        <w:t>Hệ thống tự động tính tiền và phân định tiền cọc. Tiền cọc lưu ở quỹ riêng, hệ thống tự động bù trừ vào tiền thuê thực tế hoặc hoàn cọc toàn bộ qua chuyển khoản nhanh.</w:t>
       </w:r>
     </w:p>
     <w:p>
@@ -1153,7 +1153,7 @@
           <w:color w:val="0F172A"/>
           <w:sz w:val="21"/>
         </w:rPr>
-        <w:t xml:space="preserve">Thực trạng &amp; Hậu quả: </w:t>
+        <w:t xml:space="preserve">Thực trạng và Hậu quả: </w:t>
       </w:r>
       <w:r>
         <w:rPr>
@@ -1163,7 +1163,7 @@
           <w:color w:val="334155"/>
           <w:sz w:val="21"/>
         </w:rPr>
-        <w:t>Xe cho thuê chạy cường độ cao liên tục, không ai theo dõi số Km kể từ lần thay nhớt trước. Hậu quả là động cơ xuống cấp nhanh, bó máy, mòn phanh gây nguy hiểm cho du khách trên đường đèo dốc và tốn hàng chục triệu đại tu.</w:t>
+        <w:t>Xe cho thuê chạy cường độ cao liên tục, không ai theo dõi số km kể từ lần thay nhớt trước. Hậu quả là động cơ xuống cấp nhanh, bó máy, mòn phanh gây nguy hiểm cho du khách trên đường đèo dốc và tốn hàng chục triệu đại tu.</w:t>
       </w:r>
     </w:p>
     <w:p>
@@ -1189,7 +1189,7 @@
           <w:color w:val="334155"/>
           <w:sz w:val="21"/>
         </w:rPr>
-        <w:t>Cơ chế cảnh báo bảo trì kép (Dual-trigger Alerts) tự động đối chiếu số Km ODO sau mỗi chuyến đi (Xe máy: mỗi 3.000 km; Ô tô: mỗi 5.000 km) và mốc ngày định kỳ để phát cảnh báo đỏ/vàng kịp thời.</w:t>
+        <w:t>Cơ chế cảnh báo bảo trì kép tự động đối chiếu số km sau mỗi chuyến đi (xe máy mỗi 3.000 km, ô tô mỗi 5.000 km) và mốc ngày định kỳ để phát cảnh báo kịp thời.</w:t>
       </w:r>
     </w:p>
     <w:p>
@@ -1224,7 +1224,7 @@
           <w:color w:val="0D9488"/>
           <w:sz w:val="23"/>
         </w:rPr>
-        <w:t>6.1. Yêu cầu Phân hệ Khách hàng (Customer Portal)</w:t>
+        <w:t>6.1. Yêu cầu Phân hệ Khách hàng</w:t>
       </w:r>
     </w:p>
     <w:p>
@@ -1240,7 +1240,7 @@
           <w:color w:val="0F172A"/>
           <w:sz w:val="21"/>
         </w:rPr>
-        <w:t xml:space="preserve">Ngôn ngữ thiết kế Liquid Glass toàn diện: </w:t>
+        <w:t xml:space="preserve">Ngôn ngữ thiết kế kính mờ trong suốt toàn diện: </w:t>
       </w:r>
       <w:r>
         <w:rPr>
@@ -1250,7 +1250,7 @@
           <w:color w:val="334155"/>
           <w:sz w:val="21"/>
         </w:rPr>
-        <w:t>Toàn bộ thẻ xe, thanh điều hướng, modal, bảng thông số kỹ thuật đều sử dụng hiệu ứng kính mờ trong suốt (backdrop-blur-2xl), viền phản chiếu ánh sáng và đổ bóng cao cấp.</w:t>
+        <w:t>Toàn bộ thẻ xe, thanh điều hướng, cửa sổ thông báo, bảng thông số kỹ thuật đều sử dụng hiệu ứng kính mờ trong suốt, viền phản chiếu ánh sáng và đổ bóng cao cấp.</w:t>
       </w:r>
     </w:p>
     <w:p>
@@ -1266,7 +1266,7 @@
           <w:color w:val="0F172A"/>
           <w:sz w:val="21"/>
         </w:rPr>
-        <w:t xml:space="preserve">Thanh Taskbar cố định thông minh: </w:t>
+        <w:t xml:space="preserve">Thanh điều hướng cố định thông minh: </w:t>
       </w:r>
       <w:r>
         <w:rPr>
@@ -1276,7 +1276,7 @@
           <w:color w:val="334155"/>
           <w:sz w:val="21"/>
         </w:rPr>
-        <w:t>Cố định ở mép trên màn hình khi cuộn trang (fixed top-0). Hiển thị dạng kính trong suốt khi ở đầu trang và tự động chuyển sang màu trắng thanh lịch khi cuộn xuống.</w:t>
+        <w:t>Cố định ở mép trên màn hình khi cuộn trang. Hiển thị dạng kính trong suốt khi ở đầu trang và tự động chuyển sang màu trắng thanh lịch khi cuộn xuống.</w:t>
       </w:r>
     </w:p>
     <w:p>
@@ -1292,7 +1292,7 @@
           <w:color w:val="0F172A"/>
           <w:sz w:val="21"/>
         </w:rPr>
-        <w:t xml:space="preserve">Hero Banner Showroom Gara Vòm LED: </w:t>
+        <w:t xml:space="preserve">Phông nền phòng trưng bày gara vòm đèn LED: </w:t>
       </w:r>
       <w:r>
         <w:rPr>
@@ -1302,7 +1302,7 @@
           <w:color w:val="334155"/>
           <w:sz w:val="21"/>
         </w:rPr>
-        <w:t>Hình nền gara tràn toàn màn hình (100vw). Hiệu ứng xe tự động lăn bánh vào tâm bãi đỗ thay thế xe trước đó, thông tin xe hiển thị 2 bên và bên dưới trên các tấm kính mờ.</w:t>
+        <w:t>Hình nền gara tràn toàn màn hình. Hiệu ứng xe tự động lăn bánh vào tâm bãi đỗ thay thế xe trước đó, thông tin xe hiển thị 2 bên và bên dưới trên các tấm kính mờ.</w:t>
       </w:r>
     </w:p>
     <w:p>
@@ -1318,7 +1318,7 @@
           <w:color w:val="0F172A"/>
           <w:sz w:val="21"/>
         </w:rPr>
-        <w:t xml:space="preserve">Tìm kiếm, Lọc xe &amp; Đặt giữ chỗ 10 phút: </w:t>
+        <w:t xml:space="preserve">Tìm kiếm, Lọc xe và Đặt giữ chỗ 10 phút: </w:t>
       </w:r>
       <w:r>
         <w:rPr>
@@ -1328,7 +1328,7 @@
           <w:color w:val="334155"/>
           <w:sz w:val="21"/>
         </w:rPr>
-        <w:t>Lọc theo loại xe (ô tô, xe máy), hãng, số chỗ, giá thuê; modal thanh toán VietQR giữ xe trong 10 phút với đồng hồ đếm ngược thời gian thực.</w:t>
+        <w:t>Lọc theo loại xe ô tô hoặc xe máy, hãng, số chỗ, giá thuê; cửa sổ thanh toán quét mã QR giữ xe trong 10 phút với đồng hồ đếm ngược thời gian thực.</w:t>
       </w:r>
     </w:p>
     <w:p>
@@ -1354,7 +1354,7 @@
           <w:color w:val="334155"/>
           <w:sz w:val="21"/>
         </w:rPr>
-        <w:t>Du khách chỉ cần nhập số điện thoại hoặc mã Booking để kiểm tra trạng thái duyệt xe và lịch nhận xe.</w:t>
+        <w:t>Du khách chỉ cần nhập số điện thoại hoặc mã đặt chỗ để kiểm tra trạng thái duyệt xe và lịch nhận xe.</w:t>
       </w:r>
     </w:p>
     <w:p>
@@ -1370,7 +1370,7 @@
           <w:color w:val="0D9488"/>
           <w:sz w:val="23"/>
         </w:rPr>
-        <w:t>6.2. Yêu cầu Phân hệ Quản trị Vận hành (Admin Operations)</w:t>
+        <w:t>6.2. Yêu cầu Phân hệ Quản trị Vận hành</w:t>
       </w:r>
     </w:p>
     <w:p>
@@ -1386,7 +1386,7 @@
           <w:color w:val="0F172A"/>
           <w:sz w:val="21"/>
         </w:rPr>
-        <w:t xml:space="preserve">Sơ đồ trạng thái đội xe (Fleet View): </w:t>
+        <w:t xml:space="preserve">Sơ đồ trạng thái đội xe: </w:t>
       </w:r>
       <w:r>
         <w:rPr>
@@ -1396,7 +1396,7 @@
           <w:color w:val="334155"/>
           <w:sz w:val="21"/>
         </w:rPr>
-        <w:t>Hỗ trợ 2 chế độ hiển thị Lưới (Grid) và Bảng (Table), 3 màu trạng thái chuẩn, hiển thị mức xăng 1-8/8, số ODO, biển số xe.</w:t>
+        <w:t>Hỗ trợ 2 chế độ hiển thị thẻ lưới và bảng tổng hợp, 3 màu trạng thái chuẩn, hiển thị mức xăng từ 1 đến 8 vạch, số km đồng hồ, biển số xe.</w:t>
       </w:r>
     </w:p>
     <w:p>
@@ -1412,7 +1412,7 @@
           <w:color w:val="0F172A"/>
           <w:sz w:val="21"/>
         </w:rPr>
-        <w:t xml:space="preserve">Quy trình lập Hợp đồng 4 bước (Create Wizard): </w:t>
+        <w:t xml:space="preserve">Quy trình lập Hợp đồng 4 bước: </w:t>
       </w:r>
       <w:r>
         <w:rPr>
@@ -1422,7 +1422,7 @@
           <w:color w:val="334155"/>
           <w:sz w:val="21"/>
         </w:rPr>
-        <w:t>Bước 1: Chọn xe &amp; thời gian (tự động kiểm tra trùng lịch) -&gt; Bước 2: Thông tin khách hàng -&gt; Bước 3: Lưu ảnh CCCD/GPLX -&gt; Bước 4: Tiền cọc &amp; Phụ phí.</w:t>
+        <w:t>Bước 1: Chọn xe và thời gian, tự động kiểm tra trùng lịch -&gt; Bước 2: Thông tin khách hàng -&gt; Bước 3: Lưu ảnh căn cước công dân và bằng lái xe -&gt; Bước 4: Tiền cọc và Phụ phí.</w:t>
       </w:r>
     </w:p>
     <w:p>
@@ -1438,7 +1438,7 @@
           <w:color w:val="0F172A"/>
           <w:sz w:val="21"/>
         </w:rPr>
-        <w:t xml:space="preserve">Biên bản bàn giao &amp; Thu hồi xe số hóa (Handover/Return): </w:t>
+        <w:t xml:space="preserve">Biên bản bàn giao và Thu hồi xe số hóa: </w:t>
       </w:r>
       <w:r>
         <w:rPr>
@@ -1448,7 +1448,7 @@
           <w:color w:val="334155"/>
           <w:sz w:val="21"/>
         </w:rPr>
-        <w:t>Checklist 6 hạng mục (thân vỏ, lốp, đèn còi, gương, xăng, phụ kiện), chụp ảnh hiện trạng 4 góc, nhập phí phạt đền bù hư hại.</w:t>
+        <w:t>Danh mục kiểm tra 6 hạng mục gồm thân vỏ, lốp, đèn còi, gương, xăng, phụ kiện; chụp ảnh hiện trạng 4 góc; nhập phí phạt đền bù hư hại.</w:t>
       </w:r>
     </w:p>
     <w:p>
@@ -1464,7 +1464,7 @@
           <w:color w:val="0F172A"/>
           <w:sz w:val="21"/>
         </w:rPr>
-        <w:t xml:space="preserve">Quyết toán thanh lý hợp đồng (Settlement Modal): </w:t>
+        <w:t xml:space="preserve">Quyết toán thanh lý hợp đồng: </w:t>
       </w:r>
       <w:r>
         <w:rPr>
@@ -1474,7 +1474,7 @@
           <w:color w:val="334155"/>
           <w:sz w:val="21"/>
         </w:rPr>
-        <w:t>Tự động tính tiền theo giờ/ngày thực tế, phân tách tiền cọc, tự động tính số tiền hoàn trả hoặc thu thêm.</w:t>
+        <w:t>Tự động tính tiền theo giờ hoặc ngày thực tế, phân tách tiền cọc, tự động tính số tiền hoàn trả hoặc thu thêm.</w:t>
       </w:r>
     </w:p>
     <w:p>
@@ -1490,7 +1490,7 @@
           <w:color w:val="0F172A"/>
           <w:sz w:val="21"/>
         </w:rPr>
-        <w:t xml:space="preserve">Quản lý bảo dưỡng &amp; Nhắc thay nhớt (Maintenance View): </w:t>
+        <w:t xml:space="preserve">Quản lý bảo dưỡng và Nhắc thay nhớt: </w:t>
       </w:r>
       <w:r>
         <w:rPr>
@@ -1500,7 +1500,7 @@
           <w:color w:val="334155"/>
           <w:sz w:val="21"/>
         </w:rPr>
-        <w:t>Theo dõi Km ODO, khóa xe không cho thuê khi đang bảo dưỡng, tự động sinh mốc Km bảo dưỡng tiếp theo.</w:t>
+        <w:t>Theo dõi số km lăn bánh, khóa xe không cho thuê khi đang bảo dưỡng, tự động sinh mốc km bảo dưỡng tiếp theo.</w:t>
       </w:r>
     </w:p>
     <w:p>
@@ -1516,7 +1516,7 @@
           <w:color w:val="0F172A"/>
           <w:sz w:val="21"/>
         </w:rPr>
-        <w:t xml:space="preserve">Mẫu in hợp đồng khổ A4 (Print Contract Modal): </w:t>
+        <w:t xml:space="preserve">Mẫu in hợp đồng khổ A4: </w:t>
       </w:r>
       <w:r>
         <w:rPr>
@@ -1526,7 +1526,7 @@
           <w:color w:val="334155"/>
           <w:sz w:val="21"/>
         </w:rPr>
-        <w:t>Mẫu in pháp lý chuẩn gồm quốc hiệu, trách nhiệm bên thuê &amp; cho thuê, chữ ký xác nhận 2 bên.</w:t>
+        <w:t>Mẫu in pháp lý chuẩn gồm quốc hiệu, trách nhiệm bên thuê và cho thuê, chữ ký xác nhận 2 bên.</w:t>
       </w:r>
     </w:p>
     <w:p>
@@ -1561,7 +1561,7 @@
           <w:color w:val="0D9488"/>
           <w:sz w:val="23"/>
         </w:rPr>
-        <w:t>7.1. Trong phạm vi thực hiện (In-Scope - Đã hoàn thành 100%)</w:t>
+        <w:t>7.1. Trong phạm vi thực hiện</w:t>
       </w:r>
     </w:p>
     <w:p>
@@ -1577,7 +1577,7 @@
           <w:color w:val="0F172A"/>
           <w:sz w:val="21"/>
         </w:rPr>
-        <w:t xml:space="preserve">Frontend Web Application: </w:t>
+        <w:t xml:space="preserve">Ứng dụng giao diện web: </w:t>
       </w:r>
       <w:r>
         <w:rPr>
@@ -1587,7 +1587,7 @@
           <w:color w:val="334155"/>
           <w:sz w:val="21"/>
         </w:rPr>
-        <w:t>Xây dựng toàn bộ giao diện responsive tương thích hoàn hảo từ Mobile (375px), Tablet (768px) đến Desktop/Màn hình lớn (1920px).</w:t>
+        <w:t>Xây dựng toàn bộ giao diện tương thích hoàn hảo từ điện thoại, máy tính bảng đến máy tính để bàn và màn hình lớn.</w:t>
       </w:r>
     </w:p>
     <w:p>
@@ -1603,7 +1603,7 @@
           <w:color w:val="0F172A"/>
           <w:sz w:val="21"/>
         </w:rPr>
-        <w:t xml:space="preserve">Hệ thống UI/UX Liquid Glass: </w:t>
+        <w:t xml:space="preserve">Hệ thống thiết kế kính mờ trong suốt: </w:t>
       </w:r>
       <w:r>
         <w:rPr>
@@ -1613,7 +1613,7 @@
           <w:color w:val="334155"/>
           <w:sz w:val="21"/>
         </w:rPr>
-        <w:t>Áp dụng ngôn ngữ Liquid Glass đồng bộ cho 7 trang khách hàng và 10 màn hình quản trị nội bộ; chuẩn hóa hình ảnh xe cắt nền trong suốt và hình nền studio Gara LED.</w:t>
+        <w:t>Áp dụng phong cách kính mờ đồng bộ cho 7 trang khách hàng và 10 màn hình quản trị nội bộ; chuẩn hóa hình ảnh xe cắt nền trong suốt và hình nền gara đèn LED.</w:t>
       </w:r>
     </w:p>
     <w:p>
@@ -1629,7 +1629,7 @@
           <w:color w:val="0F172A"/>
           <w:sz w:val="21"/>
         </w:rPr>
-        <w:t xml:space="preserve">Business Logic &amp; State Management: </w:t>
+        <w:t xml:space="preserve">Nghiệp vụ cốt lõi và Quản lý trạng thái: </w:t>
       </w:r>
       <w:r>
         <w:rPr>
@@ -1639,7 +1639,7 @@
           <w:color w:val="334155"/>
           <w:sz w:val="21"/>
         </w:rPr>
-        <w:t>Lập trình đầy đủ luồng dữ liệu thời gian thực trên React Context API: Đặt xe online -&gt; Duyệt đơn -&gt; Lập hợp đồng -&gt; Giao xe -&gt; Nhận xe trả -&gt; Quyết toán cọc -&gt; Bảo dưỡng định kỳ.</w:t>
+        <w:t>Lập trình đầy đủ luồng dữ liệu thời gian thực: Đặt xe trực tuyến -&gt; Duyệt đơn -&gt; Lập hợp đồng -&gt; Giao xe -&gt; Nhận xe trả -&gt; Quyết toán cọc -&gt; Bảo dưỡng định kỳ.</w:t>
       </w:r>
     </w:p>
     <w:p>
@@ -1655,7 +1655,7 @@
           <w:color w:val="0F172A"/>
           <w:sz w:val="21"/>
         </w:rPr>
-        <w:t xml:space="preserve">Dữ liệu mẫu (Seed Data) &amp; Mẫu in A4: </w:t>
+        <w:t xml:space="preserve">Dữ liệu mẫu và Mẫu in hợp đồng A4: </w:t>
       </w:r>
       <w:r>
         <w:rPr>
@@ -1665,7 +1665,7 @@
           <w:color w:val="334155"/>
           <w:sz w:val="21"/>
         </w:rPr>
-        <w:t>Cung cấp sẵn dữ liệu thực tế gồm 12 đầu xe ô tô/xe máy, khách hàng, hợp đồng, lịch bảo trì và mẫu in hợp đồng pháp lý A4.</w:t>
+        <w:t>Cung cấp sẵn dữ liệu thực tế gồm 12 đầu xe ô tô và xe máy, khách hàng, hợp đồng, lịch bảo trì và mẫu in hợp đồng pháp lý A4.</w:t>
       </w:r>
     </w:p>
     <w:p>
@@ -1681,7 +1681,7 @@
           <w:color w:val="0F172A"/>
           <w:sz w:val="21"/>
         </w:rPr>
-        <w:t xml:space="preserve">Đóng gói &amp; Kiểm thử Production: </w:t>
+        <w:t xml:space="preserve">Đóng gói và Kiểm thử: </w:t>
       </w:r>
       <w:r>
         <w:rPr>
@@ -1691,7 +1691,7 @@
           <w:color w:val="334155"/>
           <w:sz w:val="21"/>
         </w:rPr>
-        <w:t>Kiểm thử lệnh build không lỗi (npm run build) và đẩy toàn bộ mã nguồn lên GitHub.</w:t>
+        <w:t>Kiểm thử lệnh đóng gói không lỗi và đẩy toàn bộ mã nguồn lên GitHub.</w:t>
       </w:r>
     </w:p>
     <w:p>
@@ -1707,7 +1707,7 @@
           <w:color w:val="0D9488"/>
           <w:sz w:val="23"/>
         </w:rPr>
-        <w:t>7.2. Ngoài phạm vi hiện tại (Out-of-Scope - Giai đoạn phát triển tiếp theo)</w:t>
+        <w:t>7.2. Ngoài phạm vi hiện tại</w:t>
       </w:r>
     </w:p>
     <w:p>
@@ -1723,7 +1723,7 @@
           <w:color w:val="0F172A"/>
           <w:sz w:val="21"/>
         </w:rPr>
-        <w:t xml:space="preserve">Backend Server &amp; Cơ sở dữ liệu đám mây: </w:t>
+        <w:t xml:space="preserve">Máy chủ và Cơ sở dữ liệu đám mây: </w:t>
       </w:r>
       <w:r>
         <w:rPr>
@@ -1733,7 +1733,7 @@
           <w:color w:val="334155"/>
           <w:sz w:val="21"/>
         </w:rPr>
-        <w:t>Kết nối hệ CSDL phân tán PostgreSQL / Supabase thay cho bộ nhớ State cục bộ.</w:t>
+        <w:t>Kết nối hệ thống cơ sở dữ liệu phân tán lưu trữ lâu dài trên đám mây.</w:t>
       </w:r>
     </w:p>
     <w:p>
@@ -1749,7 +1749,7 @@
           <w:color w:val="0F172A"/>
           <w:sz w:val="21"/>
         </w:rPr>
-        <w:t xml:space="preserve">Cổng thanh toán tự động (Payment Webhook): </w:t>
+        <w:t xml:space="preserve">Cổng thanh toán tự động: </w:t>
       </w:r>
       <w:r>
         <w:rPr>
@@ -1759,7 +1759,7 @@
           <w:color w:val="334155"/>
           <w:sz w:val="21"/>
         </w:rPr>
-        <w:t>Tích hợp Webhook tài khoản ngân hàng để tự động xác nhận tiền cọc mà không cần nhân viên kiểm tra thủ công.</w:t>
+        <w:t>Tích hợp kết nối ngân hàng để tự động xác nhận tiền cọc mà không cần nhân viên kiểm tra thủ công.</w:t>
       </w:r>
     </w:p>
     <w:p>
@@ -1775,7 +1775,7 @@
           <w:color w:val="0F172A"/>
           <w:sz w:val="21"/>
         </w:rPr>
-        <w:t xml:space="preserve">Định vị phần cứng GPS hành trình: </w:t>
+        <w:t xml:space="preserve">Định vị phần cứng hành trình: </w:t>
       </w:r>
       <w:r>
         <w:rPr>
@@ -1785,7 +1785,7 @@
           <w:color w:val="334155"/>
           <w:sz w:val="21"/>
         </w:rPr>
-        <w:t>Lắp đặt thiết bị GPS trên xe để tự động đọc số Km ODO và vị trí xe theo thời gian thực.</w:t>
+        <w:t>Lắp đặt thiết bị định vị trên xe để tự động đọc số km đồng hồ và vị trí xe theo thời gian thực.</w:t>
       </w:r>
     </w:p>
     <w:p>
@@ -1801,7 +1801,7 @@
           <w:color w:val="0F172A"/>
           <w:sz w:val="21"/>
         </w:rPr>
-        <w:t xml:space="preserve">AI OCR nhận diện giấy tờ tùy thân: </w:t>
+        <w:t xml:space="preserve">Nhận dạng tự động giấy tờ tùy thân: </w:t>
       </w:r>
       <w:r>
         <w:rPr>
@@ -1811,7 +1811,7 @@
           <w:color w:val="334155"/>
           <w:sz w:val="21"/>
         </w:rPr>
-        <w:t>Tự động đọc và trích xuất thông tin họ tên, số căn cước từ ảnh chụp CCCD/GPLX.</w:t>
+        <w:t>Tự động đọc và trích xuất thông tin họ tên, số căn cước từ ảnh chụp giấy tờ.</w:t>
       </w:r>
     </w:p>
     <w:p>
@@ -1846,7 +1846,7 @@
           <w:color w:val="0D9488"/>
           <w:sz w:val="23"/>
         </w:rPr>
-        <w:t>8.1. Sản phẩm bàn giao cụ thể (Deliverables)</w:t>
+        <w:t>8.1. Sản phẩm bàn giao cụ thể</w:t>
       </w:r>
     </w:p>
     <w:p>
@@ -1872,7 +1872,7 @@
           <w:color w:val="334155"/>
           <w:sz w:val="21"/>
         </w:rPr>
-        <w:t>Repository https://github.com/DinhTuanHai-TBD/QuanLyDatXe_DriveRent.git được tổ chức sạch sẽ, chuẩn TypeScript, build 0 lỗi.</w:t>
+        <w:t>Được tổ chức sạch sẽ, cấu trúc rõ ràng, đóng gói không có lỗi.</w:t>
       </w:r>
     </w:p>
     <w:p>
@@ -1888,7 +1888,7 @@
           <w:color w:val="0F172A"/>
           <w:sz w:val="21"/>
         </w:rPr>
-        <w:t xml:space="preserve">2. Ứng dụng Web hoàn chỉnh (Production Prototype): </w:t>
+        <w:t xml:space="preserve">2. Ứng dụng web hoàn chỉnh: </w:t>
       </w:r>
       <w:r>
         <w:rPr>
@@ -1898,7 +1898,7 @@
           <w:color w:val="334155"/>
           <w:sz w:val="21"/>
         </w:rPr>
-        <w:t>Chạy mượt mà cả 2 cổng Khách hàng (Customer Portal) và Quản trị (Admin Portal) với thời gian phản hồi dưới 100ms.</w:t>
+        <w:t>Chạy mượt mà cả Cổng Khách hàng và Cổng Quản trị với thời gian phản hồi tức thì dưới 100 phần nghìn giây.</w:t>
       </w:r>
     </w:p>
     <w:p>
@@ -1924,7 +1924,7 @@
           <w:color w:val="334155"/>
           <w:sz w:val="21"/>
         </w:rPr>
-        <w:t>Tệp PROJECT_BRIEF.md và PROJECT_BRIEF.docx định dạng chuyên nghiệp theo chuẩn 8 câu hỏi cốt lõi.</w:t>
+        <w:t>Tệp văn bản tóm tắt dự án định dạng chuyên nghiệp theo chuẩn 8 câu hỏi cốt lõi.</w:t>
       </w:r>
     </w:p>
     <w:p>
@@ -1940,7 +1940,7 @@
           <w:color w:val="0D9488"/>
           <w:sz w:val="23"/>
         </w:rPr>
-        <w:t>8.2. Chỉ số hiệu quả kỳ vọng (Expected KPIs)</w:t>
+        <w:t>8.2. Chỉ số hiệu quả kỳ vọng</w:t>
       </w:r>
     </w:p>
     <w:p>
@@ -1966,7 +1966,7 @@
           <w:color w:val="334155"/>
           <w:sz w:val="21"/>
         </w:rPr>
-        <w:t>Giảm 85% thời gian làm thủ tục lập hợp đồng và bàn giao nhận xe tại quầy (từ 15–20 phút xuống dưới 2–3 phút).</w:t>
+        <w:t>Giảm 85% thời gian làm thủ tục lập hợp đồng và bàn giao nhận xe tại quầy, từ 15–20 phút xuống dưới 2–3 phút.</w:t>
       </w:r>
     </w:p>
     <w:p>
@@ -2018,7 +2018,7 @@
           <w:color w:val="334155"/>
           <w:sz w:val="21"/>
         </w:rPr>
-        <w:t>100% hợp đồng có lưu ảnh đối chiếu 4 góc xe và ảnh CCCD/GPLX; 100% đầu xe được nhắc thay nhớt đúng hạn.</w:t>
+        <w:t>100% hợp đồng có lưu ảnh đối chiếu 4 góc xe và ảnh giấy tờ tùy thân; 100% đầu xe được nhắc thay nhớt đúng hạn.</w:t>
       </w:r>
     </w:p>
     <w:p>
@@ -2034,7 +2034,7 @@
           <w:color w:val="0F172A"/>
           <w:sz w:val="21"/>
         </w:rPr>
-        <w:t xml:space="preserve">Trải nghiệm &amp; Chuyển đổi: </w:t>
+        <w:t xml:space="preserve">Trải nghiệm và Chuyển đổi: </w:t>
       </w:r>
       <w:r>
         <w:rPr>
@@ -2044,7 +2044,7 @@
           <w:color w:val="334155"/>
           <w:sz w:val="21"/>
         </w:rPr>
-        <w:t>Giao diện Liquid Glass chuẩn showroom quốc tế giúp tăng mạnh độ uy tín và tỷ lệ đặt xe giữ chỗ online của du khách.</w:t>
+        <w:t>Giao diện kính mờ trong suốt chuẩn showroom tạo ấn tượng chuyên nghiệp vượt trội, nâng cao tỷ lệ đặt giữ xe của khách du lịch.</w:t>
       </w:r>
     </w:p>
     <w:sectPr>
@@ -2074,7 +2074,7 @@
         <w:color w:val="94A3B8"/>
         <w:sz w:val="17"/>
       </w:rPr>
-      <w:t>DriveRent System · 8 Câu Hỏi Định Vị Bài Toán Trước Khi Làm</w:t>
+      <w:t>Hệ thống DriveRent · 8 Câu Hỏi Định Vị Bài Toán Trước Khi Làm</w:t>
     </w:r>
   </w:p>
 </w:ftr>
@@ -2095,7 +2095,7 @@
         <w:color w:val="94A3B8"/>
         <w:sz w:val="17"/>
       </w:rPr>
-      <w:t>TÀI LIỆU BRIEF DỰ ÁN | DRIVERENT</w:t>
+      <w:t>TÀI LIỆU TÓM TẮT DỰ ÁN | DRIVERENT</w:t>
     </w:r>
   </w:p>
 </w:hdr>

</xml_diff>